<commit_message>
se cambia el word
</commit_message>
<xml_diff>
--- a/Proyecto Semestre Patrones de Software A-194(1).docx
+++ b/Proyecto Semestre Patrones de Software A-194(1).docx
@@ -778,7 +778,11 @@
             <w:tabs>
               <w:tab w:val="right" w:leader="dot" w:pos="9015"/>
             </w:tabs>
+            <w:ind w:left="0"/>
           </w:pPr>
+          <w:r>
+            <w:t xml:space="preserve">      </w:t>
+          </w:r>
           <w:hyperlink w:anchor="_Toc1829509179">
             <w:r>
               <w:rPr>
@@ -832,6 +836,9 @@
             <w:tabs>
               <w:tab w:val="right" w:leader="dot" w:pos="9015"/>
             </w:tabs>
+            <w:rPr>
+              <w:rStyle w:val="Enlacedelndice"/>
+            </w:rPr>
           </w:pPr>
           <w:hyperlink w:anchor="_Toc305068199">
             <w:r>
@@ -886,6 +893,26 @@
             <w:fldChar w:fldCharType="end"/>
           </w:r>
         </w:p>
+        <w:p>
+          <w:r>
+            <w:t xml:space="preserve">   </w:t>
+          </w:r>
+          <w:r>
+            <w:t xml:space="preserve">  </w:t>
+          </w:r>
+          <w:r>
+            <w:t xml:space="preserve"> Semana 4……………………………………………………………</w:t>
+          </w:r>
+          <w:r>
+            <w:t>…………</w:t>
+          </w:r>
+          <w:r>
+            <w:t>………</w:t>
+          </w:r>
+          <w:r>
+            <w:t>11</w:t>
+          </w:r>
+        </w:p>
       </w:sdtContent>
     </w:sdt>
     <w:p/>
@@ -1135,9 +1162,22 @@
         <w:rPr>
           <w:rFonts w:eastAsiaTheme="minorEastAsia"/>
         </w:rPr>
-        <w:lastRenderedPageBreak/>
         <w:t>Patrones de Software entregable Semana 3</w:t>
       </w:r>
+    </w:p>
+    <w:p>
+      <w:pPr>
+        <w:pStyle w:val="ndice"/>
+        <w:jc w:val="center"/>
+        <w:rPr>
+          <w:rFonts w:eastAsiaTheme="minorEastAsia" w:cstheme="minorBidi"/>
+        </w:rPr>
+      </w:pPr>
+      <w:bookmarkStart w:id="0" w:name="_Toc1274616787"/>
+      <w:r>
+        <w:t>Semana 1</w:t>
+      </w:r>
+      <w:bookmarkEnd w:id="0"/>
     </w:p>
     <w:p>
       <w:pPr>
@@ -1148,29 +1188,11 @@
           <w:color w:val="000000" w:themeColor="text1"/>
         </w:rPr>
       </w:pPr>
-      <w:bookmarkStart w:id="0" w:name="_Toc1274616787"/>
+      <w:bookmarkStart w:id="1" w:name="_Toc1968679706"/>
       <w:r>
         <w:rPr>
           <w:color w:val="000000" w:themeColor="text1"/>
         </w:rPr>
-        <w:t>Semana 1</w:t>
-      </w:r>
-      <w:bookmarkEnd w:id="0"/>
-    </w:p>
-    <w:p>
-      <w:pPr>
-        <w:pStyle w:val="Heading3"/>
-        <w:jc w:val="center"/>
-        <w:rPr>
-          <w:rFonts w:eastAsiaTheme="minorEastAsia" w:cstheme="minorBidi"/>
-          <w:color w:val="000000" w:themeColor="text1"/>
-        </w:rPr>
-      </w:pPr>
-      <w:bookmarkStart w:id="1" w:name="_Toc1968679706"/>
-      <w:r>
-        <w:rPr>
-          <w:color w:val="000000" w:themeColor="text1"/>
-        </w:rPr>
         <w:t>Plataforma de Telemedicina</w:t>
       </w:r>
       <w:bookmarkEnd w:id="1"/>
@@ -1179,13 +1201,13 @@
       <w:pPr>
         <w:spacing w:line="360" w:lineRule="auto"/>
       </w:pPr>
+      <w:proofErr w:type="gramStart"/>
       <w:r>
         <w:t>Que es una plataforma de telemedicina?</w:t>
       </w:r>
+      <w:proofErr w:type="gramEnd"/>
       <w:r>
         <w:br/>
-      </w:r>
-      <w:r>
         <w:t>Es un ecosistema digital que permite conectar a pacientes con profesionales e instituciones de la salud de forma remota, facilitando el diagnóstico, tratamiento, seguimiento y gestión médica. Es una forma de prestar servicios de salud a distancia utilizando la TIC permitiendo interactuar en tiempo real mediante distintos medios de la comunicación.</w:t>
       </w:r>
     </w:p>
@@ -1243,7 +1265,15 @@
         <w:spacing w:line="360" w:lineRule="auto"/>
       </w:pPr>
       <w:r>
-        <w:t>1.2. Videollamadas y chat interactivo: El paciente podrá hacer una teleconsulta mediante una videoconferencia o chat para realizar diagnósticos y seguimiento,</w:t>
+        <w:t xml:space="preserve">1.2. Videollamadas y chat interactivo: El paciente podrá hacer una </w:t>
+      </w:r>
+      <w:proofErr w:type="spellStart"/>
+      <w:r>
+        <w:t>teleconsulta</w:t>
+      </w:r>
+      <w:proofErr w:type="spellEnd"/>
+      <w:r>
+        <w:t xml:space="preserve"> mediante una videoconferencia o chat para realizar diagnósticos y seguimiento,</w:t>
       </w:r>
     </w:p>
     <w:p>
@@ -1328,6 +1358,7 @@
         </w:rPr>
       </w:pPr>
       <w:r>
+        <w:lastRenderedPageBreak/>
         <w:t>Módulo de conexión con entidades externas para cerrar el ciclo de atención.</w:t>
       </w:r>
     </w:p>
@@ -1339,7 +1370,6 @@
         </w:rPr>
       </w:pPr>
       <w:r>
-        <w:lastRenderedPageBreak/>
         <w:t>3.1.  Envío de recetas a la farmacia elegida: P</w:t>
       </w:r>
       <w:r>
@@ -1395,7 +1425,15 @@
         <w:spacing w:line="360" w:lineRule="auto"/>
       </w:pPr>
       <w:r>
-        <w:t>4.2. Triaje (clasificación de gravedad):</w:t>
+        <w:t xml:space="preserve">4.2. </w:t>
+      </w:r>
+      <w:proofErr w:type="spellStart"/>
+      <w:r>
+        <w:t>Triaje</w:t>
+      </w:r>
+      <w:proofErr w:type="spellEnd"/>
+      <w:r>
+        <w:t xml:space="preserve"> (clasificación de gravedad):</w:t>
       </w:r>
       <w:r>
         <w:rPr>
@@ -1435,20 +1473,11 @@
     <w:p/>
     <w:p>
       <w:pPr>
-        <w:pStyle w:val="Heading3"/>
+        <w:pStyle w:val="ndice"/>
         <w:jc w:val="center"/>
-        <w:rPr>
-          <w:rFonts w:eastAsiaTheme="minorEastAsia" w:cstheme="minorBidi"/>
-          <w:color w:val="000000" w:themeColor="text1"/>
-          <w:sz w:val="24"/>
-          <w:szCs w:val="24"/>
-        </w:rPr>
       </w:pPr>
       <w:bookmarkStart w:id="3" w:name="_Toc474931327"/>
       <w:r>
-        <w:rPr>
-          <w:color w:val="000000" w:themeColor="text1"/>
-        </w:rPr>
         <w:lastRenderedPageBreak/>
         <w:t>Semana 2</w:t>
       </w:r>
@@ -1522,19 +1551,7 @@
         <w:rPr>
           <w:rFonts w:eastAsia="Arial" w:cs="Arial"/>
         </w:rPr>
-        <w:t>Facilitar</w:t>
-      </w:r>
-      <w:r>
-        <w:rPr>
-          <w:rFonts w:eastAsia="Arial" w:cs="Arial"/>
-        </w:rPr>
-        <w:t xml:space="preserve"> a los pacientes el acceso para </w:t>
-      </w:r>
-      <w:r>
-        <w:rPr>
-          <w:rFonts w:eastAsia="Arial" w:cs="Arial"/>
-        </w:rPr>
-        <w:t>agendar citas y comunicarse de manera remota con profesionales de la salud mediante videollamadas y chat.</w:t>
+        <w:t>Facilitar a los pacientes el acceso para agendar citas y comunicarse de manera remota con profesionales de la salud mediante videollamadas y chat.</w:t>
       </w:r>
     </w:p>
     <w:p>
@@ -1553,13 +1570,7 @@
         <w:rPr>
           <w:rFonts w:eastAsia="Arial" w:cs="Arial"/>
         </w:rPr>
-        <w:t>Mejorar la gestión de la información médica para facilitar</w:t>
-      </w:r>
-      <w:r>
-        <w:rPr>
-          <w:rFonts w:eastAsia="Arial" w:cs="Arial"/>
-        </w:rPr>
-        <w:t xml:space="preserve"> la generación, consulta y seguimiento de recetas, prescripciones y resultados de exámenes de cada paciente.</w:t>
+        <w:t>Mejorar la gestión de la información médica para facilitar la generación, consulta y seguimiento de recetas, prescripciones y resultados de exámenes de cada paciente.</w:t>
       </w:r>
     </w:p>
     <w:p>
@@ -1578,13 +1589,7 @@
         <w:rPr>
           <w:rFonts w:eastAsia="Arial" w:cs="Arial"/>
         </w:rPr>
-        <w:t xml:space="preserve">Garantizar una atención oportuna y eficiente mediante </w:t>
-      </w:r>
-      <w:r>
-        <w:rPr>
-          <w:rFonts w:eastAsia="Arial" w:cs="Arial"/>
-        </w:rPr>
-        <w:t>la clasificación de pacientes según su nivel de gravedad y priorizar la atención y los recursos médicos disponibles.</w:t>
+        <w:t>Garantizar una atención oportuna y eficiente mediante la clasificación de pacientes según su nivel de gravedad y priorizar la atención y los recursos médicos disponibles.</w:t>
       </w:r>
     </w:p>
     <w:p/>
@@ -1600,21 +1605,17 @@
     <w:p/>
     <w:p/>
     <w:p/>
-    <w:p>
-      <w:pPr>
-        <w:pStyle w:val="Heading5"/>
-        <w:spacing w:line="360" w:lineRule="auto"/>
+    <w:p/>
+    <w:p>
+      <w:pPr>
+        <w:pStyle w:val="ndice"/>
         <w:jc w:val="center"/>
         <w:rPr>
           <w:rFonts w:eastAsiaTheme="minorEastAsia" w:cstheme="minorBidi"/>
-          <w:color w:val="000000" w:themeColor="text1"/>
         </w:rPr>
       </w:pPr>
       <w:bookmarkStart w:id="6" w:name="_Toc1829509179"/>
       <w:r>
-        <w:rPr>
-          <w:color w:val="000000" w:themeColor="text1"/>
-        </w:rPr>
         <w:lastRenderedPageBreak/>
         <w:t>Semana 3</w:t>
       </w:r>
@@ -1627,8 +1628,21 @@
           <w:rFonts w:eastAsiaTheme="minorEastAsia"/>
         </w:rPr>
       </w:pPr>
-      <w:r>
-        <w:t>Codigo python Django</w:t>
+      <w:proofErr w:type="spellStart"/>
+      <w:r>
+        <w:t>Codigo</w:t>
+      </w:r>
+      <w:proofErr w:type="spellEnd"/>
+      <w:r>
+        <w:t xml:space="preserve"> </w:t>
+      </w:r>
+      <w:proofErr w:type="spellStart"/>
+      <w:r>
+        <w:t>python</w:t>
+      </w:r>
+      <w:proofErr w:type="spellEnd"/>
+      <w:r>
+        <w:t xml:space="preserve"> Django</w:t>
       </w:r>
     </w:p>
     <w:p>
@@ -1657,7 +1671,21 @@
         <w:rPr>
           <w:lang w:val="en-US"/>
         </w:rPr>
-        <w:t>class GestorMedicinas:</w:t>
+        <w:t xml:space="preserve">class </w:t>
+      </w:r>
+      <w:proofErr w:type="spellStart"/>
+      <w:r>
+        <w:rPr>
+          <w:lang w:val="en-US"/>
+        </w:rPr>
+        <w:t>GestorMedicinas</w:t>
+      </w:r>
+      <w:proofErr w:type="spellEnd"/>
+      <w:r>
+        <w:rPr>
+          <w:lang w:val="en-US"/>
+        </w:rPr>
+        <w:t>:</w:t>
       </w:r>
     </w:p>
     <w:p>
@@ -1675,7 +1703,21 @@
         <w:rPr>
           <w:lang w:val="en-US"/>
         </w:rPr>
-        <w:t xml:space="preserve">    _instancia = None</w:t>
+        <w:t xml:space="preserve">    _</w:t>
+      </w:r>
+      <w:proofErr w:type="spellStart"/>
+      <w:r>
+        <w:rPr>
+          <w:lang w:val="en-US"/>
+        </w:rPr>
+        <w:t>instancia</w:t>
+      </w:r>
+      <w:proofErr w:type="spellEnd"/>
+      <w:r>
+        <w:rPr>
+          <w:lang w:val="en-US"/>
+        </w:rPr>
+        <w:t xml:space="preserve"> = None</w:t>
       </w:r>
     </w:p>
     <w:p>
@@ -1701,7 +1743,21 @@
         <w:rPr>
           <w:lang w:val="en-US"/>
         </w:rPr>
-        <w:t xml:space="preserve">    def __new__(cls):</w:t>
+        <w:t xml:space="preserve">    def __new__(</w:t>
+      </w:r>
+      <w:proofErr w:type="spellStart"/>
+      <w:r>
+        <w:rPr>
+          <w:lang w:val="en-US"/>
+        </w:rPr>
+        <w:t>cls</w:t>
+      </w:r>
+      <w:proofErr w:type="spellEnd"/>
+      <w:r>
+        <w:rPr>
+          <w:lang w:val="en-US"/>
+        </w:rPr>
+        <w:t>):</w:t>
       </w:r>
     </w:p>
     <w:p>
@@ -1719,7 +1775,37 @@
         <w:rPr>
           <w:lang w:val="en-US"/>
         </w:rPr>
-        <w:t xml:space="preserve">        if cls._instancia is None:</w:t>
+        <w:t xml:space="preserve">        if </w:t>
+      </w:r>
+      <w:proofErr w:type="spellStart"/>
+      <w:proofErr w:type="gramStart"/>
+      <w:r>
+        <w:rPr>
+          <w:lang w:val="en-US"/>
+        </w:rPr>
+        <w:t>cls</w:t>
+      </w:r>
+      <w:proofErr w:type="spellEnd"/>
+      <w:r>
+        <w:rPr>
+          <w:lang w:val="en-US"/>
+        </w:rPr>
+        <w:t>._</w:t>
+      </w:r>
+      <w:proofErr w:type="spellStart"/>
+      <w:proofErr w:type="gramEnd"/>
+      <w:r>
+        <w:rPr>
+          <w:lang w:val="en-US"/>
+        </w:rPr>
+        <w:t>instancia</w:t>
+      </w:r>
+      <w:proofErr w:type="spellEnd"/>
+      <w:r>
+        <w:rPr>
+          <w:lang w:val="en-US"/>
+        </w:rPr>
+        <w:t xml:space="preserve"> is None:</w:t>
       </w:r>
     </w:p>
     <w:p>
@@ -1737,7 +1823,65 @@
         <w:rPr>
           <w:lang w:val="en-US"/>
         </w:rPr>
-        <w:t xml:space="preserve">            cls._instancia = super().__new__(cls)</w:t>
+        <w:t xml:space="preserve">            </w:t>
+      </w:r>
+      <w:proofErr w:type="spellStart"/>
+      <w:proofErr w:type="gramStart"/>
+      <w:r>
+        <w:rPr>
+          <w:lang w:val="en-US"/>
+        </w:rPr>
+        <w:t>cls</w:t>
+      </w:r>
+      <w:proofErr w:type="spellEnd"/>
+      <w:r>
+        <w:rPr>
+          <w:lang w:val="en-US"/>
+        </w:rPr>
+        <w:t>._</w:t>
+      </w:r>
+      <w:proofErr w:type="spellStart"/>
+      <w:proofErr w:type="gramEnd"/>
+      <w:r>
+        <w:rPr>
+          <w:lang w:val="en-US"/>
+        </w:rPr>
+        <w:t>instancia</w:t>
+      </w:r>
+      <w:proofErr w:type="spellEnd"/>
+      <w:r>
+        <w:rPr>
+          <w:lang w:val="en-US"/>
+        </w:rPr>
+        <w:t xml:space="preserve"> = super(</w:t>
+      </w:r>
+      <w:proofErr w:type="gramStart"/>
+      <w:r>
+        <w:rPr>
+          <w:lang w:val="en-US"/>
+        </w:rPr>
+        <w:t>)._</w:t>
+      </w:r>
+      <w:proofErr w:type="gramEnd"/>
+      <w:r>
+        <w:rPr>
+          <w:lang w:val="en-US"/>
+        </w:rPr>
+        <w:t>_new__(</w:t>
+      </w:r>
+      <w:proofErr w:type="spellStart"/>
+      <w:r>
+        <w:rPr>
+          <w:lang w:val="en-US"/>
+        </w:rPr>
+        <w:t>cls</w:t>
+      </w:r>
+      <w:proofErr w:type="spellEnd"/>
+      <w:r>
+        <w:rPr>
+          <w:lang w:val="en-US"/>
+        </w:rPr>
+        <w:t>)</w:t>
       </w:r>
     </w:p>
     <w:p>
@@ -1755,7 +1899,37 @@
         <w:rPr>
           <w:lang w:val="en-US"/>
         </w:rPr>
-        <w:t xml:space="preserve">            cls._instancia.medicinas = []</w:t>
+        <w:t xml:space="preserve">            </w:t>
+      </w:r>
+      <w:proofErr w:type="spellStart"/>
+      <w:proofErr w:type="gramStart"/>
+      <w:r>
+        <w:rPr>
+          <w:lang w:val="en-US"/>
+        </w:rPr>
+        <w:t>cls</w:t>
+      </w:r>
+      <w:proofErr w:type="spellEnd"/>
+      <w:r>
+        <w:rPr>
+          <w:lang w:val="en-US"/>
+        </w:rPr>
+        <w:t>._</w:t>
+      </w:r>
+      <w:proofErr w:type="spellStart"/>
+      <w:r>
+        <w:rPr>
+          <w:lang w:val="en-US"/>
+        </w:rPr>
+        <w:t>instancia.medicinas</w:t>
+      </w:r>
+      <w:proofErr w:type="spellEnd"/>
+      <w:proofErr w:type="gramEnd"/>
+      <w:r>
+        <w:rPr>
+          <w:lang w:val="en-US"/>
+        </w:rPr>
+        <w:t xml:space="preserve"> = []</w:t>
       </w:r>
     </w:p>
     <w:p>
@@ -1781,8 +1955,32 @@
         <w:rPr>
           <w:lang w:val="en-US"/>
         </w:rPr>
-        <w:t xml:space="preserve">        return cls._instancia</w:t>
-      </w:r>
+        <w:t xml:space="preserve">        return </w:t>
+      </w:r>
+      <w:proofErr w:type="spellStart"/>
+      <w:proofErr w:type="gramStart"/>
+      <w:r>
+        <w:rPr>
+          <w:lang w:val="en-US"/>
+        </w:rPr>
+        <w:t>cls</w:t>
+      </w:r>
+      <w:proofErr w:type="spellEnd"/>
+      <w:r>
+        <w:rPr>
+          <w:lang w:val="en-US"/>
+        </w:rPr>
+        <w:t>._</w:t>
+      </w:r>
+      <w:proofErr w:type="spellStart"/>
+      <w:proofErr w:type="gramEnd"/>
+      <w:r>
+        <w:rPr>
+          <w:lang w:val="en-US"/>
+        </w:rPr>
+        <w:t>instancia</w:t>
+      </w:r>
+      <w:proofErr w:type="spellEnd"/>
     </w:p>
     <w:p>
       <w:pPr>
@@ -1807,7 +2005,49 @@
         <w:rPr>
           <w:lang w:val="en-US"/>
         </w:rPr>
-        <w:t xml:space="preserve">    def agregar_medicina(self, medicina):</w:t>
+        <w:t xml:space="preserve">    def </w:t>
+      </w:r>
+      <w:proofErr w:type="spellStart"/>
+      <w:r>
+        <w:rPr>
+          <w:lang w:val="en-US"/>
+        </w:rPr>
+        <w:t>agregar_</w:t>
+      </w:r>
+      <w:proofErr w:type="gramStart"/>
+      <w:r>
+        <w:rPr>
+          <w:lang w:val="en-US"/>
+        </w:rPr>
+        <w:t>medicina</w:t>
+      </w:r>
+      <w:proofErr w:type="spellEnd"/>
+      <w:r>
+        <w:rPr>
+          <w:lang w:val="en-US"/>
+        </w:rPr>
+        <w:t>(</w:t>
+      </w:r>
+      <w:proofErr w:type="gramEnd"/>
+      <w:r>
+        <w:rPr>
+          <w:lang w:val="en-US"/>
+        </w:rPr>
+        <w:t xml:space="preserve">self, </w:t>
+      </w:r>
+      <w:proofErr w:type="spellStart"/>
+      <w:r>
+        <w:rPr>
+          <w:lang w:val="en-US"/>
+        </w:rPr>
+        <w:t>medicina</w:t>
+      </w:r>
+      <w:proofErr w:type="spellEnd"/>
+      <w:r>
+        <w:rPr>
+          <w:lang w:val="en-US"/>
+        </w:rPr>
+        <w:t>):</w:t>
       </w:r>
     </w:p>
     <w:p>
@@ -1825,7 +2065,43 @@
         <w:rPr>
           <w:lang w:val="en-US"/>
         </w:rPr>
-        <w:t xml:space="preserve">        self.medicinas.append(medicina)</w:t>
+        <w:t xml:space="preserve">        </w:t>
+      </w:r>
+      <w:proofErr w:type="spellStart"/>
+      <w:proofErr w:type="gramStart"/>
+      <w:r>
+        <w:rPr>
+          <w:lang w:val="en-US"/>
+        </w:rPr>
+        <w:t>self.medicinas</w:t>
+      </w:r>
+      <w:proofErr w:type="gramEnd"/>
+      <w:r>
+        <w:rPr>
+          <w:lang w:val="en-US"/>
+        </w:rPr>
+        <w:t>.append</w:t>
+      </w:r>
+      <w:proofErr w:type="spellEnd"/>
+      <w:r>
+        <w:rPr>
+          <w:lang w:val="en-US"/>
+        </w:rPr>
+        <w:t>(</w:t>
+      </w:r>
+      <w:proofErr w:type="spellStart"/>
+      <w:r>
+        <w:rPr>
+          <w:lang w:val="en-US"/>
+        </w:rPr>
+        <w:t>medicina</w:t>
+      </w:r>
+      <w:proofErr w:type="spellEnd"/>
+      <w:r>
+        <w:rPr>
+          <w:lang w:val="en-US"/>
+        </w:rPr>
+        <w:t>)</w:t>
       </w:r>
     </w:p>
     <w:p>
@@ -1851,7 +2127,21 @@
         <w:rPr>
           <w:lang w:val="en-US"/>
         </w:rPr>
-        <w:t xml:space="preserve">    def obtener_medicinas(self):</w:t>
+        <w:t xml:space="preserve">    def </w:t>
+      </w:r>
+      <w:proofErr w:type="spellStart"/>
+      <w:r>
+        <w:rPr>
+          <w:lang w:val="en-US"/>
+        </w:rPr>
+        <w:t>obtener_medicinas</w:t>
+      </w:r>
+      <w:proofErr w:type="spellEnd"/>
+      <w:r>
+        <w:rPr>
+          <w:lang w:val="en-US"/>
+        </w:rPr>
+        <w:t>(self):</w:t>
       </w:r>
     </w:p>
     <w:p>
@@ -1869,8 +2159,18 @@
         <w:rPr>
           <w:lang w:val="en-US"/>
         </w:rPr>
-        <w:t xml:space="preserve">        return self.medicinas</w:t>
-      </w:r>
+        <w:t xml:space="preserve">        return </w:t>
+      </w:r>
+      <w:proofErr w:type="spellStart"/>
+      <w:proofErr w:type="gramStart"/>
+      <w:r>
+        <w:rPr>
+          <w:lang w:val="en-US"/>
+        </w:rPr>
+        <w:t>self.medicinas</w:t>
+      </w:r>
+      <w:proofErr w:type="spellEnd"/>
+      <w:proofErr w:type="gramEnd"/>
     </w:p>
     <w:p>
       <w:pPr>
@@ -1910,7 +2210,23 @@
         <w:rPr>
           <w:lang w:val="en-US"/>
         </w:rPr>
-        <w:t>from django.shortcuts import render, redirect</w:t>
+        <w:t xml:space="preserve">from </w:t>
+      </w:r>
+      <w:proofErr w:type="spellStart"/>
+      <w:proofErr w:type="gramStart"/>
+      <w:r>
+        <w:rPr>
+          <w:lang w:val="en-US"/>
+        </w:rPr>
+        <w:t>django.shortcuts</w:t>
+      </w:r>
+      <w:proofErr w:type="spellEnd"/>
+      <w:proofErr w:type="gramEnd"/>
+      <w:r>
+        <w:rPr>
+          <w:lang w:val="en-US"/>
+        </w:rPr>
+        <w:t xml:space="preserve"> import render, redirect</w:t>
       </w:r>
     </w:p>
     <w:p>
@@ -1924,12 +2240,42 @@
           <w:lang w:val="en-US"/>
         </w:rPr>
       </w:pPr>
-      <w:r>
-        <w:rPr>
-          <w:lang w:val="en-US"/>
-        </w:rPr>
-        <w:t>from .singleton import GestorMedicinas</w:t>
-      </w:r>
+      <w:proofErr w:type="gramStart"/>
+      <w:r>
+        <w:rPr>
+          <w:lang w:val="en-US"/>
+        </w:rPr>
+        <w:t>from .singleton</w:t>
+      </w:r>
+      <w:proofErr w:type="gramEnd"/>
+      <w:r>
+        <w:rPr>
+          <w:lang w:val="en-US"/>
+        </w:rPr>
+        <w:t xml:space="preserve"> </w:t>
+      </w:r>
+      <w:proofErr w:type="gramStart"/>
+      <w:r>
+        <w:rPr>
+          <w:lang w:val="en-US"/>
+        </w:rPr>
+        <w:t>import</w:t>
+      </w:r>
+      <w:proofErr w:type="gramEnd"/>
+      <w:r>
+        <w:rPr>
+          <w:lang w:val="en-US"/>
+        </w:rPr>
+        <w:t xml:space="preserve"> </w:t>
+      </w:r>
+      <w:proofErr w:type="spellStart"/>
+      <w:r>
+        <w:rPr>
+          <w:lang w:val="en-US"/>
+        </w:rPr>
+        <w:t>GestorMedicinas</w:t>
+      </w:r>
+      <w:proofErr w:type="spellEnd"/>
     </w:p>
     <w:p>
       <w:pPr>
@@ -1954,7 +2300,21 @@
         <w:rPr>
           <w:lang w:val="en-US"/>
         </w:rPr>
-        <w:t>def medicinas(request):</w:t>
+        <w:t xml:space="preserve">def </w:t>
+      </w:r>
+      <w:proofErr w:type="spellStart"/>
+      <w:r>
+        <w:rPr>
+          <w:lang w:val="en-US"/>
+        </w:rPr>
+        <w:t>medicinas</w:t>
+      </w:r>
+      <w:proofErr w:type="spellEnd"/>
+      <w:r>
+        <w:rPr>
+          <w:lang w:val="en-US"/>
+        </w:rPr>
+        <w:t>(request):</w:t>
       </w:r>
     </w:p>
     <w:p>
@@ -1972,13 +2332,29 @@
         <w:rPr>
           <w:lang w:val="en-US"/>
         </w:rPr>
-        <w:t xml:space="preserve">    </w:t>
-      </w:r>
-      <w:r>
-        <w:rPr>
-          <w:lang w:val="en-US"/>
-        </w:rPr>
-        <w:t>gestor = GestorMedicinas()</w:t>
+        <w:t xml:space="preserve">    gestor = </w:t>
+      </w:r>
+      <w:proofErr w:type="spellStart"/>
+      <w:proofErr w:type="gramStart"/>
+      <w:r>
+        <w:rPr>
+          <w:lang w:val="en-US"/>
+        </w:rPr>
+        <w:t>GestorMedicinas</w:t>
+      </w:r>
+      <w:proofErr w:type="spellEnd"/>
+      <w:r>
+        <w:rPr>
+          <w:lang w:val="en-US"/>
+        </w:rPr>
+        <w:t>(</w:t>
+      </w:r>
+      <w:proofErr w:type="gramEnd"/>
+      <w:r>
+        <w:rPr>
+          <w:lang w:val="en-US"/>
+        </w:rPr>
+        <w:t>)</w:t>
       </w:r>
     </w:p>
     <w:p>
@@ -2004,7 +2380,23 @@
         <w:rPr>
           <w:lang w:val="en-US"/>
         </w:rPr>
-        <w:t xml:space="preserve">    if request.method == "POST":</w:t>
+        <w:t xml:space="preserve">    if </w:t>
+      </w:r>
+      <w:proofErr w:type="spellStart"/>
+      <w:proofErr w:type="gramStart"/>
+      <w:r>
+        <w:rPr>
+          <w:lang w:val="en-US"/>
+        </w:rPr>
+        <w:t>request.method</w:t>
+      </w:r>
+      <w:proofErr w:type="spellEnd"/>
+      <w:proofErr w:type="gramEnd"/>
+      <w:r>
+        <w:rPr>
+          <w:lang w:val="en-US"/>
+        </w:rPr>
+        <w:t xml:space="preserve"> == "POST":</w:t>
       </w:r>
     </w:p>
     <w:p>
@@ -2024,7 +2416,15 @@
         <w:t xml:space="preserve">        </w:t>
       </w:r>
       <w:r>
-        <w:t>nombre = request.POST.get("nombre")</w:t>
+        <w:t xml:space="preserve">nombre = </w:t>
+      </w:r>
+      <w:proofErr w:type="spellStart"/>
+      <w:r>
+        <w:t>request.POST.get</w:t>
+      </w:r>
+      <w:proofErr w:type="spellEnd"/>
+      <w:r>
+        <w:t>("nombre")</w:t>
       </w:r>
     </w:p>
     <w:p>
@@ -2038,7 +2438,31 @@
         </w:rPr>
       </w:pPr>
       <w:r>
-        <w:t xml:space="preserve">        principio_activo = request.POST.get("principio_activo")</w:t>
+        <w:t xml:space="preserve">        </w:t>
+      </w:r>
+      <w:proofErr w:type="spellStart"/>
+      <w:r>
+        <w:t>principio_activo</w:t>
+      </w:r>
+      <w:proofErr w:type="spellEnd"/>
+      <w:r>
+        <w:t xml:space="preserve"> = </w:t>
+      </w:r>
+      <w:proofErr w:type="spellStart"/>
+      <w:r>
+        <w:t>request.POST.get</w:t>
+      </w:r>
+      <w:proofErr w:type="spellEnd"/>
+      <w:r>
+        <w:t>("</w:t>
+      </w:r>
+      <w:proofErr w:type="spellStart"/>
+      <w:r>
+        <w:t>principio_activo</w:t>
+      </w:r>
+      <w:proofErr w:type="spellEnd"/>
+      <w:r>
+        <w:t>")</w:t>
       </w:r>
     </w:p>
     <w:p>
@@ -2052,7 +2476,31 @@
         </w:rPr>
       </w:pPr>
       <w:r>
-        <w:t xml:space="preserve">        concentracion = request.POST.get("concentracion")</w:t>
+        <w:t xml:space="preserve">        </w:t>
+      </w:r>
+      <w:proofErr w:type="spellStart"/>
+      <w:r>
+        <w:t>concentracion</w:t>
+      </w:r>
+      <w:proofErr w:type="spellEnd"/>
+      <w:r>
+        <w:t xml:space="preserve"> = </w:t>
+      </w:r>
+      <w:proofErr w:type="spellStart"/>
+      <w:r>
+        <w:t>request.POST.get</w:t>
+      </w:r>
+      <w:proofErr w:type="spellEnd"/>
+      <w:r>
+        <w:t>("</w:t>
+      </w:r>
+      <w:proofErr w:type="spellStart"/>
+      <w:r>
+        <w:t>concentracion</w:t>
+      </w:r>
+      <w:proofErr w:type="spellEnd"/>
+      <w:r>
+        <w:t>")</w:t>
       </w:r>
     </w:p>
     <w:p>
@@ -2071,7 +2519,15 @@
         </w:rPr>
       </w:pPr>
       <w:r>
-        <w:t xml:space="preserve">        nueva_medicina = {</w:t>
+        <w:t xml:space="preserve">        </w:t>
+      </w:r>
+      <w:proofErr w:type="spellStart"/>
+      <w:r>
+        <w:t>nueva_medicina</w:t>
+      </w:r>
+      <w:proofErr w:type="spellEnd"/>
+      <w:r>
+        <w:t xml:space="preserve"> = {</w:t>
       </w:r>
     </w:p>
     <w:p>
@@ -2099,7 +2555,23 @@
         </w:rPr>
       </w:pPr>
       <w:r>
-        <w:t xml:space="preserve">            "principio_activo": principio_activo,</w:t>
+        <w:t xml:space="preserve">            "</w:t>
+      </w:r>
+      <w:proofErr w:type="spellStart"/>
+      <w:r>
+        <w:t>principio_activo</w:t>
+      </w:r>
+      <w:proofErr w:type="spellEnd"/>
+      <w:r>
+        <w:t xml:space="preserve">": </w:t>
+      </w:r>
+      <w:proofErr w:type="spellStart"/>
+      <w:r>
+        <w:t>principio_activo</w:t>
+      </w:r>
+      <w:proofErr w:type="spellEnd"/>
+      <w:r>
+        <w:t>,</w:t>
       </w:r>
     </w:p>
     <w:p>
@@ -2113,7 +2585,23 @@
         </w:rPr>
       </w:pPr>
       <w:r>
-        <w:t xml:space="preserve">            "concentracion": concentracion,</w:t>
+        <w:t xml:space="preserve">            "</w:t>
+      </w:r>
+      <w:proofErr w:type="spellStart"/>
+      <w:r>
+        <w:t>concentracion</w:t>
+      </w:r>
+      <w:proofErr w:type="spellEnd"/>
+      <w:r>
+        <w:t xml:space="preserve">": </w:t>
+      </w:r>
+      <w:proofErr w:type="spellStart"/>
+      <w:r>
+        <w:t>concentracion</w:t>
+      </w:r>
+      <w:proofErr w:type="spellEnd"/>
+      <w:r>
+        <w:t>,</w:t>
       </w:r>
     </w:p>
     <w:p>
@@ -2146,7 +2634,28 @@
         </w:rPr>
       </w:pPr>
       <w:r>
-        <w:t xml:space="preserve">        gestor.agregar_medicina(nueva_medicina)</w:t>
+        <w:t xml:space="preserve">        </w:t>
+      </w:r>
+      <w:proofErr w:type="spellStart"/>
+      <w:proofErr w:type="gramStart"/>
+      <w:r>
+        <w:t>gestor.agregar</w:t>
+      </w:r>
+      <w:proofErr w:type="gramEnd"/>
+      <w:r>
+        <w:t>_medicina</w:t>
+      </w:r>
+      <w:proofErr w:type="spellEnd"/>
+      <w:r>
+        <w:t>(</w:t>
+      </w:r>
+      <w:proofErr w:type="spellStart"/>
+      <w:r>
+        <w:t>nueva_medicina</w:t>
+      </w:r>
+      <w:proofErr w:type="spellEnd"/>
+      <w:r>
+        <w:t>)</w:t>
       </w:r>
     </w:p>
     <w:p>
@@ -2160,7 +2669,23 @@
         </w:rPr>
       </w:pPr>
       <w:r>
-        <w:t xml:space="preserve">        return redirect("medicinas") </w:t>
+        <w:t xml:space="preserve">        </w:t>
+      </w:r>
+      <w:proofErr w:type="spellStart"/>
+      <w:r>
+        <w:t>return</w:t>
+      </w:r>
+      <w:proofErr w:type="spellEnd"/>
+      <w:r>
+        <w:t xml:space="preserve"> </w:t>
+      </w:r>
+      <w:proofErr w:type="spellStart"/>
+      <w:r>
+        <w:t>redirect</w:t>
+      </w:r>
+      <w:proofErr w:type="spellEnd"/>
+      <w:r>
+        <w:t xml:space="preserve">("medicinas") </w:t>
       </w:r>
     </w:p>
     <w:p>
@@ -2181,8 +2706,34 @@
       <w:r>
         <w:t xml:space="preserve">    </w:t>
       </w:r>
-      <w:r>
-        <w:t>lista_medicinas = gestor.obtener_medicinas()</w:t>
+      <w:proofErr w:type="spellStart"/>
+      <w:r>
+        <w:t>lista_medicinas</w:t>
+      </w:r>
+      <w:proofErr w:type="spellEnd"/>
+      <w:r>
+        <w:t xml:space="preserve"> = </w:t>
+      </w:r>
+      <w:proofErr w:type="spellStart"/>
+      <w:proofErr w:type="gramStart"/>
+      <w:r>
+        <w:t>gestor.obtener</w:t>
+      </w:r>
+      <w:proofErr w:type="gramEnd"/>
+      <w:r>
+        <w:t>_</w:t>
+      </w:r>
+      <w:proofErr w:type="gramStart"/>
+      <w:r>
+        <w:t>medicinas</w:t>
+      </w:r>
+      <w:proofErr w:type="spellEnd"/>
+      <w:r>
+        <w:t>(</w:t>
+      </w:r>
+      <w:proofErr w:type="gramEnd"/>
+      <w:r>
+        <w:t>)</w:t>
       </w:r>
     </w:p>
     <w:p>
@@ -2196,7 +2747,36 @@
         </w:rPr>
       </w:pPr>
       <w:r>
-        <w:t xml:space="preserve">    return render(request, "medicinas.html", {"medicinas": lista_medicinas})</w:t>
+        <w:t xml:space="preserve">    </w:t>
+      </w:r>
+      <w:proofErr w:type="spellStart"/>
+      <w:r>
+        <w:t>return</w:t>
+      </w:r>
+      <w:proofErr w:type="spellEnd"/>
+      <w:r>
+        <w:t xml:space="preserve"> </w:t>
+      </w:r>
+      <w:proofErr w:type="gramStart"/>
+      <w:r>
+        <w:t>render(</w:t>
+      </w:r>
+      <w:proofErr w:type="spellStart"/>
+      <w:proofErr w:type="gramEnd"/>
+      <w:r>
+        <w:t>request</w:t>
+      </w:r>
+      <w:proofErr w:type="spellEnd"/>
+      <w:r>
+        <w:t xml:space="preserve">, "medicinas.html", {"medicinas": </w:t>
+      </w:r>
+      <w:proofErr w:type="spellStart"/>
+      <w:r>
+        <w:t>lista_medicinas</w:t>
+      </w:r>
+      <w:proofErr w:type="spellEnd"/>
+      <w:r>
+        <w:t>})</w:t>
       </w:r>
     </w:p>
     <w:p>
@@ -2313,13 +2893,29 @@
           <w:color w:val="000000" w:themeColor="text1"/>
           <w:lang w:val="es-CO"/>
         </w:rPr>
-        <w:t>Video del funcionamiento con singleton:</w:t>
+        <w:t xml:space="preserve">Video del funcionamiento con </w:t>
+      </w:r>
+      <w:proofErr w:type="spellStart"/>
+      <w:r>
+        <w:rPr>
+          <w:color w:val="000000" w:themeColor="text1"/>
+          <w:lang w:val="es-CO"/>
+        </w:rPr>
+        <w:t>singleton</w:t>
+      </w:r>
+      <w:proofErr w:type="spellEnd"/>
+      <w:r>
+        <w:rPr>
+          <w:color w:val="000000" w:themeColor="text1"/>
+          <w:lang w:val="es-CO"/>
+        </w:rPr>
+        <w:t>:</w:t>
       </w:r>
       <w:bookmarkEnd w:id="7"/>
       <w:r>
         <w:br/>
       </w:r>
-      <w:hyperlink r:id="rId5">
+      <w:hyperlink r:id="rId6">
         <w:r>
           <w:rPr>
             <w:rStyle w:val="Hyperlink"/>
@@ -2332,6 +2928,12 @@
     <w:p>
       <w:pPr>
         <w:spacing w:after="0" w:line="240" w:lineRule="auto"/>
+        <w:rPr>
+          <w:rFonts w:eastAsiaTheme="majorEastAsia" w:cstheme="majorBidi"/>
+          <w:color w:val="0F4761" w:themeColor="accent1" w:themeShade="BF"/>
+          <w:sz w:val="28"/>
+          <w:szCs w:val="28"/>
+        </w:rPr>
       </w:pPr>
       <w:r>
         <w:br w:type="page"/>
@@ -2339,16 +2941,19 @@
     </w:p>
     <w:p>
       <w:pPr>
+        <w:pStyle w:val="Heading3"/>
         <w:jc w:val="center"/>
         <w:rPr>
           <w:b/>
           <w:bCs/>
+          <w:color w:val="auto"/>
         </w:rPr>
       </w:pPr>
       <w:r>
         <w:rPr>
           <w:b/>
           <w:bCs/>
+          <w:color w:val="auto"/>
         </w:rPr>
         <w:lastRenderedPageBreak/>
         <w:t>Semana 4</w:t>
@@ -2356,6 +2961,414 @@
     </w:p>
     <w:p>
       <w:pPr>
+        <w:pStyle w:val="Heading3"/>
+        <w:rPr>
+          <w:color w:val="auto"/>
+          <w:lang w:val="es-CO"/>
+        </w:rPr>
+      </w:pPr>
+      <w:r>
+        <w:rPr>
+          <w:color w:val="auto"/>
+          <w:lang w:val="es-CO"/>
+        </w:rPr>
+        <w:t>En la plataforma de telemedicina no todos los pacientes son iguales. Hay dos tipos:</w:t>
+      </w:r>
+    </w:p>
+    <w:p>
+      <w:pPr>
+        <w:pStyle w:val="Heading3"/>
+        <w:numPr>
+          <w:ilvl w:val="0"/>
+          <w:numId w:val="6"/>
+        </w:numPr>
+        <w:rPr>
+          <w:color w:val="auto"/>
+          <w:lang w:val="es-CO"/>
+        </w:rPr>
+      </w:pPr>
+      <w:r>
+        <w:rPr>
+          <w:b/>
+          <w:bCs/>
+          <w:color w:val="auto"/>
+          <w:lang w:val="es-CO"/>
+        </w:rPr>
+        <w:t>Pacientes presenciales</w:t>
+      </w:r>
+      <w:r>
+        <w:rPr>
+          <w:color w:val="auto"/>
+          <w:lang w:val="es-CO"/>
+        </w:rPr>
+        <w:t>: van físicamente a la clínica.</w:t>
+      </w:r>
+    </w:p>
+    <w:p>
+      <w:pPr>
+        <w:pStyle w:val="Heading3"/>
+        <w:numPr>
+          <w:ilvl w:val="0"/>
+          <w:numId w:val="6"/>
+        </w:numPr>
+        <w:rPr>
+          <w:color w:val="auto"/>
+          <w:lang w:val="es-CO"/>
+        </w:rPr>
+      </w:pPr>
+      <w:r>
+        <w:rPr>
+          <w:b/>
+          <w:bCs/>
+          <w:color w:val="auto"/>
+          <w:lang w:val="es-CO"/>
+        </w:rPr>
+        <w:t>Pacientes virtuales</w:t>
+      </w:r>
+      <w:r>
+        <w:rPr>
+          <w:color w:val="auto"/>
+          <w:lang w:val="es-CO"/>
+        </w:rPr>
+        <w:t>: se atienden por videollamada.</w:t>
+      </w:r>
+    </w:p>
+    <w:p>
+      <w:pPr>
+        <w:pStyle w:val="Heading3"/>
+        <w:rPr>
+          <w:color w:val="auto"/>
+          <w:lang w:val="es-CO"/>
+        </w:rPr>
+      </w:pPr>
+      <w:r>
+        <w:rPr>
+          <w:color w:val="auto"/>
+          <w:lang w:val="es-CO"/>
+        </w:rPr>
+        <w:t xml:space="preserve">Cada uno necesita datos distintos. Por ejemplo, un paciente virtual </w:t>
+      </w:r>
+      <w:r>
+        <w:rPr>
+          <w:b/>
+          <w:bCs/>
+          <w:color w:val="auto"/>
+          <w:lang w:val="es-CO"/>
+        </w:rPr>
+        <w:t>obligatoriamente</w:t>
+      </w:r>
+      <w:r>
+        <w:rPr>
+          <w:color w:val="auto"/>
+          <w:lang w:val="es-CO"/>
+        </w:rPr>
+        <w:t xml:space="preserve"> necesita un correo electrónico (porque ahí le llega el enlace de la videollamada), mientras que uno presencial no lo necesita.</w:t>
+      </w:r>
+    </w:p>
+    <w:p>
+      <w:pPr>
+        <w:pStyle w:val="Heading3"/>
+        <w:rPr>
+          <w:color w:val="auto"/>
+          <w:lang w:val="es-CO"/>
+        </w:rPr>
+      </w:pPr>
+      <w:r>
+        <w:rPr>
+          <w:b/>
+          <w:bCs/>
+          <w:color w:val="auto"/>
+          <w:lang w:val="es-CO"/>
+        </w:rPr>
+        <w:t>El problema sin este patrón:</w:t>
+      </w:r>
+      <w:r>
+        <w:rPr>
+          <w:color w:val="auto"/>
+          <w:lang w:val="es-CO"/>
+        </w:rPr>
+        <w:br/>
+        <w:t xml:space="preserve">Si todo el proceso de "crear un paciente" estuviera mezclado en un solo lugar, el código tendría que preguntar constantemente: </w:t>
+      </w:r>
+      <w:r>
+        <w:rPr>
+          <w:i/>
+          <w:iCs/>
+          <w:color w:val="auto"/>
+          <w:lang w:val="es-CO"/>
+        </w:rPr>
+        <w:t xml:space="preserve">"¿este paciente es presencial o virtual? Si es virtual, hacer esto... </w:t>
+      </w:r>
+      <w:proofErr w:type="spellStart"/>
+      <w:r>
+        <w:rPr>
+          <w:i/>
+          <w:iCs/>
+          <w:color w:val="auto"/>
+          <w:lang w:val="es-CO"/>
+        </w:rPr>
+        <w:t>si</w:t>
+      </w:r>
+      <w:proofErr w:type="spellEnd"/>
+      <w:r>
+        <w:rPr>
+          <w:i/>
+          <w:iCs/>
+          <w:color w:val="auto"/>
+          <w:lang w:val="es-CO"/>
+        </w:rPr>
+        <w:t xml:space="preserve"> es presencial, hacer esto otro..."</w:t>
+      </w:r>
+      <w:r>
+        <w:rPr>
+          <w:color w:val="auto"/>
+          <w:lang w:val="es-CO"/>
+        </w:rPr>
+        <w:t xml:space="preserve"> Esto se vuelve complicado y difícil de mantener a medida que el sistema crece (por ejemplo, si el día de mañana agregamos un tercer tipo de paciente, como "paciente de urgencias").</w:t>
+      </w:r>
+    </w:p>
+    <w:p>
+      <w:pPr>
+        <w:pStyle w:val="Heading3"/>
+        <w:rPr>
+          <w:color w:val="auto"/>
+          <w:lang w:val="es-CO"/>
+        </w:rPr>
+      </w:pPr>
+      <w:r>
+        <w:rPr>
+          <w:b/>
+          <w:bCs/>
+          <w:color w:val="auto"/>
+          <w:lang w:val="es-CO"/>
+        </w:rPr>
+        <w:t>La solución con Factory Method:</w:t>
+      </w:r>
+      <w:r>
+        <w:rPr>
+          <w:color w:val="auto"/>
+          <w:lang w:val="es-CO"/>
+        </w:rPr>
+        <w:br/>
+        <w:t xml:space="preserve">En lugar de mezclar todo, creamos "fábricas" separadas: una fábrica sabe cómo crear pacientes presenciales, y otra sabe cómo crear pacientes virtuales. Cuando el sistema necesita registrar un paciente, simplemente le dice a la fábrica correcta: </w:t>
+      </w:r>
+      <w:r>
+        <w:rPr>
+          <w:i/>
+          <w:iCs/>
+          <w:color w:val="auto"/>
+          <w:lang w:val="es-CO"/>
+        </w:rPr>
+        <w:t>"crea uno de este tipo"</w:t>
+      </w:r>
+      <w:r>
+        <w:rPr>
+          <w:color w:val="auto"/>
+          <w:lang w:val="es-CO"/>
+        </w:rPr>
+        <w:t>, y ella se encarga de aplicar las reglas necesarias (como exigir el correo si es virtual).</w:t>
+      </w:r>
+    </w:p>
+    <w:p>
+      <w:pPr>
+        <w:pStyle w:val="Heading3"/>
+        <w:rPr>
+          <w:color w:val="auto"/>
+          <w:lang w:val="en-US"/>
+        </w:rPr>
+      </w:pPr>
+      <w:proofErr w:type="spellStart"/>
+      <w:r>
+        <w:rPr>
+          <w:b/>
+          <w:bCs/>
+          <w:color w:val="auto"/>
+          <w:lang w:val="en-US"/>
+        </w:rPr>
+        <w:t>Beneficios</w:t>
+      </w:r>
+      <w:proofErr w:type="spellEnd"/>
+      <w:r>
+        <w:rPr>
+          <w:b/>
+          <w:bCs/>
+          <w:color w:val="auto"/>
+          <w:lang w:val="en-US"/>
+        </w:rPr>
+        <w:t xml:space="preserve"> de </w:t>
+      </w:r>
+      <w:proofErr w:type="spellStart"/>
+      <w:r>
+        <w:rPr>
+          <w:b/>
+          <w:bCs/>
+          <w:color w:val="auto"/>
+          <w:lang w:val="en-US"/>
+        </w:rPr>
+        <w:t>usarlo</w:t>
+      </w:r>
+      <w:proofErr w:type="spellEnd"/>
+      <w:r>
+        <w:rPr>
+          <w:b/>
+          <w:bCs/>
+          <w:color w:val="auto"/>
+          <w:lang w:val="en-US"/>
+        </w:rPr>
+        <w:t>:</w:t>
+      </w:r>
+    </w:p>
+    <w:p>
+      <w:pPr>
+        <w:pStyle w:val="Heading3"/>
+        <w:numPr>
+          <w:ilvl w:val="0"/>
+          <w:numId w:val="7"/>
+        </w:numPr>
+        <w:rPr>
+          <w:color w:val="auto"/>
+          <w:lang w:val="es-CO"/>
+        </w:rPr>
+      </w:pPr>
+      <w:r>
+        <w:rPr>
+          <w:color w:val="auto"/>
+          <w:lang w:val="es-CO"/>
+        </w:rPr>
+        <w:t>El código queda más ordenado y fácil de entender.</w:t>
+      </w:r>
+    </w:p>
+    <w:p>
+      <w:pPr>
+        <w:pStyle w:val="Heading3"/>
+        <w:numPr>
+          <w:ilvl w:val="0"/>
+          <w:numId w:val="7"/>
+        </w:numPr>
+        <w:rPr>
+          <w:color w:val="auto"/>
+          <w:lang w:val="es-CO"/>
+        </w:rPr>
+      </w:pPr>
+      <w:r>
+        <w:rPr>
+          <w:color w:val="auto"/>
+          <w:lang w:val="es-CO"/>
+        </w:rPr>
+        <w:t>Si en el futuro se necesita agregar un nuevo tipo de paciente, no hay que modificar lo que ya funciona: solo se agrega una fábrica nueva.</w:t>
+      </w:r>
+    </w:p>
+    <w:p>
+      <w:pPr>
+        <w:pStyle w:val="Heading3"/>
+        <w:numPr>
+          <w:ilvl w:val="0"/>
+          <w:numId w:val="7"/>
+        </w:numPr>
+        <w:rPr>
+          <w:color w:val="auto"/>
+          <w:lang w:val="es-CO"/>
+        </w:rPr>
+      </w:pPr>
+      <w:r>
+        <w:rPr>
+          <w:color w:val="auto"/>
+          <w:lang w:val="es-CO"/>
+        </w:rPr>
+        <w:t>Cada tipo de paciente tiene sus propias reglas claras, sin mezclarse con las de los demás.</w:t>
+      </w:r>
+    </w:p>
+    <w:p>
+      <w:pPr>
+        <w:pStyle w:val="Heading3"/>
+        <w:numPr>
+          <w:ilvl w:val="0"/>
+          <w:numId w:val="7"/>
+        </w:numPr>
+        <w:rPr>
+          <w:color w:val="auto"/>
+          <w:lang w:val="es-CO"/>
+        </w:rPr>
+      </w:pPr>
+      <w:r>
+        <w:rPr>
+          <w:color w:val="auto"/>
+          <w:lang w:val="es-CO"/>
+        </w:rPr>
+        <w:t>Se reducen los errores, porque cada fábrica se encarga solo de su tipo de paciente y sabe exactamente qué necesita validar.</w:t>
+      </w:r>
+    </w:p>
+    <w:p>
+      <w:pPr>
+        <w:pStyle w:val="Heading3"/>
+        <w:rPr>
+          <w:color w:val="auto"/>
+          <w:lang w:val="es-CO"/>
+        </w:rPr>
+      </w:pPr>
+      <w:r>
+        <w:rPr>
+          <w:b/>
+          <w:bCs/>
+          <w:color w:val="auto"/>
+          <w:lang w:val="es-CO"/>
+        </w:rPr>
+        <w:lastRenderedPageBreak/>
+        <w:t>En resumen:</w:t>
+      </w:r>
+      <w:r>
+        <w:rPr>
+          <w:color w:val="auto"/>
+          <w:lang w:val="es-CO"/>
+        </w:rPr>
+        <w:br/>
+        <w:t>El Factory Method nos permite crear distintos tipos de pacientes de forma organizada, asegurando que cada uno tenga los datos correctos según su forma de atención, sin llenar el sistema de condiciones complicadas ("si es esto, haz esto; si es lo otro, haz lo otro").</w:t>
+      </w:r>
+    </w:p>
+    <w:p>
+      <w:pPr>
+        <w:pStyle w:val="Heading3"/>
+        <w:rPr>
+          <w:color w:val="auto"/>
+          <w:lang w:val="es-CO"/>
+        </w:rPr>
+      </w:pPr>
+    </w:p>
+    <w:p>
+      <w:pPr>
+        <w:pStyle w:val="Heading3"/>
+        <w:rPr>
+          <w:lang w:val="es-CO"/>
+        </w:rPr>
+      </w:pPr>
+    </w:p>
+    <w:p>
+      <w:pPr>
+        <w:spacing w:after="0" w:line="240" w:lineRule="auto"/>
+      </w:pPr>
+      <w:r>
+        <w:br w:type="page"/>
+      </w:r>
+    </w:p>
+    <w:p>
+      <w:pPr>
+        <w:jc w:val="center"/>
+        <w:rPr>
+          <w:b/>
+          <w:bCs/>
+        </w:rPr>
+      </w:pPr>
+      <w:r>
+        <w:rPr>
+          <w:b/>
+          <w:bCs/>
+        </w:rPr>
+        <w:lastRenderedPageBreak/>
+        <w:t>Semana 4</w:t>
+      </w:r>
+    </w:p>
+    <w:p>
+      <w:pPr>
         <w:rPr>
           <w:lang w:val="en-US"/>
         </w:rPr>
@@ -2370,7 +3383,21 @@
         <w:rPr>
           <w:lang w:val="en-US"/>
         </w:rPr>
-        <w:t>Hay dos tipos:</w:t>
+        <w:t xml:space="preserve">Hay dos </w:t>
+      </w:r>
+      <w:proofErr w:type="spellStart"/>
+      <w:r>
+        <w:rPr>
+          <w:lang w:val="en-US"/>
+        </w:rPr>
+        <w:t>tipos</w:t>
+      </w:r>
+      <w:proofErr w:type="spellEnd"/>
+      <w:r>
+        <w:rPr>
+          <w:lang w:val="en-US"/>
+        </w:rPr>
+        <w:t>:</w:t>
       </w:r>
     </w:p>
     <w:p>
@@ -2453,20 +3480,20 @@
     <w:p>
       <w:pPr>
         <w:rPr>
-          <w:lang w:val="en-US"/>
+          <w:lang w:val="es-CO"/>
         </w:rPr>
       </w:pPr>
       <w:r>
         <w:rPr>
           <w:b/>
           <w:bCs/>
-          <w:lang w:val="en-US"/>
+          <w:lang w:val="es-CO"/>
         </w:rPr>
         <w:t>El problema sin este patrón:</w:t>
       </w:r>
       <w:r>
         <w:rPr>
-          <w:lang w:val="en-US"/>
+          <w:lang w:val="es-CO"/>
         </w:rPr>
         <w:br/>
         <w:t xml:space="preserve">Si todo el proceso de "crear un paciente" estuviera mezclado en un solo lugar, el código tendría que preguntar constantemente: </w:t>
@@ -2475,13 +3502,31 @@
         <w:rPr>
           <w:i/>
           <w:iCs/>
-          <w:lang w:val="en-US"/>
-        </w:rPr>
-        <w:t>"¿este paciente es presencial o virtual? Si es virtual, hacer esto... si es presencial, hacer esto otro..."</w:t>
-      </w:r>
-      <w:r>
-        <w:rPr>
-          <w:lang w:val="en-US"/>
+          <w:lang w:val="es-CO"/>
+        </w:rPr>
+        <w:t xml:space="preserve">"¿este paciente es presencial o virtual? Si es virtual, hacer esto... </w:t>
+      </w:r>
+      <w:proofErr w:type="spellStart"/>
+      <w:r>
+        <w:rPr>
+          <w:i/>
+          <w:iCs/>
+          <w:lang w:val="es-CO"/>
+        </w:rPr>
+        <w:t>si</w:t>
+      </w:r>
+      <w:proofErr w:type="spellEnd"/>
+      <w:r>
+        <w:rPr>
+          <w:i/>
+          <w:iCs/>
+          <w:lang w:val="es-CO"/>
+        </w:rPr>
+        <w:t xml:space="preserve"> es presencial, hacer esto otro..."</w:t>
+      </w:r>
+      <w:r>
+        <w:rPr>
+          <w:lang w:val="es-CO"/>
         </w:rPr>
         <w:t xml:space="preserve"> Esto se vuelve complicado y difícil de mantener a medida que el sistema crece (por ejemplo, si el día de mañana agregamos un tercer tipo de paciente, como "paciente de urgencias").</w:t>
       </w:r>
@@ -2489,20 +3534,20 @@
     <w:p>
       <w:pPr>
         <w:rPr>
-          <w:lang w:val="en-US"/>
+          <w:lang w:val="es-CO"/>
         </w:rPr>
       </w:pPr>
       <w:r>
         <w:rPr>
           <w:b/>
           <w:bCs/>
-          <w:lang w:val="en-US"/>
+          <w:lang w:val="es-CO"/>
         </w:rPr>
         <w:t>La solución con Factory Method:</w:t>
       </w:r>
       <w:r>
         <w:rPr>
-          <w:lang w:val="en-US"/>
+          <w:lang w:val="es-CO"/>
         </w:rPr>
         <w:br/>
         <w:t xml:space="preserve">En lugar de mezclar todo, creamos "fábricas" separadas: una fábrica sabe cómo crear pacientes presenciales, y otra sabe cómo crear pacientes virtuales. Cuando el sistema necesita registrar un paciente, simplemente le dice a la fábrica correcta: </w:t>
@@ -2511,13 +3556,13 @@
         <w:rPr>
           <w:i/>
           <w:iCs/>
-          <w:lang w:val="en-US"/>
+          <w:lang w:val="es-CO"/>
         </w:rPr>
         <w:t>"crea uno de este tipo"</w:t>
       </w:r>
       <w:r>
         <w:rPr>
-          <w:lang w:val="en-US"/>
+          <w:lang w:val="es-CO"/>
         </w:rPr>
         <w:t>, y ella se encarga de aplicar las reglas necesarias (como exigir el correo si es virtual).</w:t>
       </w:r>
@@ -2528,13 +3573,41 @@
           <w:lang w:val="en-US"/>
         </w:rPr>
       </w:pPr>
+      <w:proofErr w:type="spellStart"/>
       <w:r>
         <w:rPr>
           <w:b/>
           <w:bCs/>
           <w:lang w:val="en-US"/>
         </w:rPr>
-        <w:t>Beneficios de usarlo:</w:t>
+        <w:t>Beneficios</w:t>
+      </w:r>
+      <w:proofErr w:type="spellEnd"/>
+      <w:r>
+        <w:rPr>
+          <w:b/>
+          <w:bCs/>
+          <w:lang w:val="en-US"/>
+        </w:rPr>
+        <w:t xml:space="preserve"> de </w:t>
+      </w:r>
+      <w:proofErr w:type="spellStart"/>
+      <w:r>
+        <w:rPr>
+          <w:b/>
+          <w:bCs/>
+          <w:lang w:val="en-US"/>
+        </w:rPr>
+        <w:t>usarlo</w:t>
+      </w:r>
+      <w:proofErr w:type="spellEnd"/>
+      <w:r>
+        <w:rPr>
+          <w:b/>
+          <w:bCs/>
+          <w:lang w:val="en-US"/>
+        </w:rPr>
+        <w:t>:</w:t>
       </w:r>
     </w:p>
     <w:p>
@@ -2544,12 +3617,12 @@
           <w:numId w:val="5"/>
         </w:numPr>
         <w:rPr>
-          <w:lang w:val="en-US"/>
-        </w:rPr>
-      </w:pPr>
-      <w:r>
-        <w:rPr>
-          <w:lang w:val="en-US"/>
+          <w:lang w:val="es-CO"/>
+        </w:rPr>
+      </w:pPr>
+      <w:r>
+        <w:rPr>
+          <w:lang w:val="es-CO"/>
         </w:rPr>
         <w:t>El código queda más ordenado y fácil de entender.</w:t>
       </w:r>
@@ -2561,12 +3634,12 @@
           <w:numId w:val="5"/>
         </w:numPr>
         <w:rPr>
-          <w:lang w:val="en-US"/>
-        </w:rPr>
-      </w:pPr>
-      <w:r>
-        <w:rPr>
-          <w:lang w:val="en-US"/>
+          <w:lang w:val="es-CO"/>
+        </w:rPr>
+      </w:pPr>
+      <w:r>
+        <w:rPr>
+          <w:lang w:val="es-CO"/>
         </w:rPr>
         <w:t>Si en el futuro se necesita agregar un nuevo tipo de paciente, no hay que modificar lo que ya funciona: solo se agrega una fábrica nueva.</w:t>
       </w:r>
@@ -2578,12 +3651,12 @@
           <w:numId w:val="5"/>
         </w:numPr>
         <w:rPr>
-          <w:lang w:val="en-US"/>
-        </w:rPr>
-      </w:pPr>
-      <w:r>
-        <w:rPr>
-          <w:lang w:val="en-US"/>
+          <w:lang w:val="es-CO"/>
+        </w:rPr>
+      </w:pPr>
+      <w:r>
+        <w:rPr>
+          <w:lang w:val="es-CO"/>
         </w:rPr>
         <w:t>Cada tipo de paciente tiene sus propias reglas claras, sin mezclarse con las de los demás.</w:t>
       </w:r>
@@ -2595,12 +3668,12 @@
           <w:numId w:val="5"/>
         </w:numPr>
         <w:rPr>
-          <w:lang w:val="en-US"/>
-        </w:rPr>
-      </w:pPr>
-      <w:r>
-        <w:rPr>
-          <w:lang w:val="en-US"/>
+          <w:lang w:val="es-CO"/>
+        </w:rPr>
+      </w:pPr>
+      <w:r>
+        <w:rPr>
+          <w:lang w:val="es-CO"/>
         </w:rPr>
         <w:t>Se reducen los errores, porque cada fábrica se encarga solo de su tipo de paciente y sabe exactamente qué necesita validar.</w:t>
       </w:r>
@@ -2608,20 +3681,20 @@
     <w:p>
       <w:pPr>
         <w:rPr>
-          <w:lang w:val="en-US"/>
+          <w:lang w:val="es-CO"/>
         </w:rPr>
       </w:pPr>
       <w:r>
         <w:rPr>
           <w:b/>
           <w:bCs/>
-          <w:lang w:val="en-US"/>
+          <w:lang w:val="es-CO"/>
         </w:rPr>
         <w:t>En resumen:</w:t>
       </w:r>
       <w:r>
         <w:rPr>
-          <w:lang w:val="en-US"/>
+          <w:lang w:val="es-CO"/>
         </w:rPr>
         <w:br/>
         <w:t>El Factory Method nos permite crear distintos tipos de pacientes de forma organizada, asegurando que cada uno tenga los datos correctos según su forma de atención, sin llenar el sistema de condiciones complicadas ("si es esto, haz esto; si es lo otro, haz lo otro").</w:t>
@@ -3334,6 +4407,30 @@
   </w:num>
   <w:num w:numId="5" w16cid:durableId="645745003">
     <w:abstractNumId w:val="1"/>
+  </w:num>
+  <w:num w:numId="6" w16cid:durableId="1284338248">
+    <w:abstractNumId w:val="0"/>
+    <w:lvlOverride w:ilvl="0"/>
+    <w:lvlOverride w:ilvl="1"/>
+    <w:lvlOverride w:ilvl="2"/>
+    <w:lvlOverride w:ilvl="3"/>
+    <w:lvlOverride w:ilvl="4"/>
+    <w:lvlOverride w:ilvl="5"/>
+    <w:lvlOverride w:ilvl="6"/>
+    <w:lvlOverride w:ilvl="7"/>
+    <w:lvlOverride w:ilvl="8"/>
+  </w:num>
+  <w:num w:numId="7" w16cid:durableId="687414473">
+    <w:abstractNumId w:val="1"/>
+    <w:lvlOverride w:ilvl="0"/>
+    <w:lvlOverride w:ilvl="1"/>
+    <w:lvlOverride w:ilvl="2"/>
+    <w:lvlOverride w:ilvl="3"/>
+    <w:lvlOverride w:ilvl="4"/>
+    <w:lvlOverride w:ilvl="5"/>
+    <w:lvlOverride w:ilvl="6"/>
+    <w:lvlOverride w:ilvl="7"/>
+    <w:lvlOverride w:ilvl="8"/>
   </w:num>
 </w:numbering>
 </file>
@@ -4001,6 +5098,25 @@
     <w:unhideWhenUsed/>
     <w:qFormat/>
   </w:style>
+  <w:style w:type="paragraph" w:styleId="TOCHeading">
+    <w:name w:val="TOC Heading"/>
+    <w:basedOn w:val="Heading1"/>
+    <w:next w:val="Normal"/>
+    <w:uiPriority w:val="39"/>
+    <w:unhideWhenUsed/>
+    <w:qFormat/>
+    <w:rsid w:val="002E6B3E"/>
+    <w:pPr>
+      <w:suppressAutoHyphens w:val="0"/>
+      <w:spacing w:before="240" w:after="0" w:line="259" w:lineRule="auto"/>
+      <w:outlineLvl w:val="9"/>
+    </w:pPr>
+    <w:rPr>
+      <w:sz w:val="32"/>
+      <w:szCs w:val="32"/>
+      <w:lang w:val="en-US"/>
+    </w:rPr>
+  </w:style>
 </w:styles>
 </file>
 
@@ -4176,4 +5292,16 @@
   <a:objectDefaults/>
   <a:extraClrSchemeLst/>
 </a:theme>
+</file>
+
+<file path=customXml/item1.xml><?xml version="1.0" encoding="utf-8"?>
+<b:Sources xmlns:b="http://schemas.openxmlformats.org/officeDocument/2006/bibliography" xmlns="http://schemas.openxmlformats.org/officeDocument/2006/bibliography" SelectedStyle="\APASixthEditionOfficeOnline.xsl" StyleName="APA" Version="6"/>
+</file>
+
+<file path=customXml/itemProps1.xml><?xml version="1.0" encoding="utf-8"?>
+<ds:datastoreItem xmlns:ds="http://schemas.openxmlformats.org/officeDocument/2006/customXml" ds:itemID="{FFCD15D9-5A05-46CC-BD79-728982A1BDF9}">
+  <ds:schemaRefs>
+    <ds:schemaRef ds:uri="http://schemas.openxmlformats.org/officeDocument/2006/bibliography"/>
+  </ds:schemaRefs>
+</ds:datastoreItem>
 </file>
</xml_diff>

<commit_message>
se actualiza la semana 4
</commit_message>
<xml_diff>
--- a/Proyecto Semestre Patrones de Software A-194(1).docx
+++ b/Proyecto Semestre Patrones de Software A-194(1).docx
@@ -328,6 +328,16 @@
     </w:p>
     <w:p>
       <w:pPr>
+        <w:spacing w:line="360" w:lineRule="auto"/>
+        <w:jc w:val="center"/>
+        <w:rPr>
+          <w:rFonts w:eastAsiaTheme="minorEastAsia"/>
+          <w:lang w:val="es-MX"/>
+        </w:rPr>
+      </w:pPr>
+    </w:p>
+    <w:p>
+      <w:pPr>
         <w:tabs>
           <w:tab w:val="left" w:pos="80"/>
         </w:tabs>
@@ -406,7 +416,7 @@
           <w:bCs/>
           <w:color w:val="000000" w:themeColor="text1"/>
         </w:rPr>
-        <w:t xml:space="preserve">           BUCARAMANGA</w:t>
+        <w:t>BUCARAMANGA</w:t>
       </w:r>
     </w:p>
     <w:p>
@@ -433,10 +443,17 @@
       <w:sdtContent>
         <w:p>
           <w:pPr>
-            <w:pStyle w:val="TOC3"/>
+            <w:pStyle w:val="TDC3"/>
             <w:tabs>
-              <w:tab w:val="right" w:leader="dot" w:pos="9015"/>
+              <w:tab w:val="right" w:leader="dot" w:pos="9016"/>
             </w:tabs>
+            <w:rPr>
+              <w:rFonts w:eastAsiaTheme="minorEastAsia"/>
+              <w:noProof/>
+              <w:kern w:val="2"/>
+              <w:lang w:val="es-CO" w:eastAsia="es-CO"/>
+              <w14:ligatures w14:val="standardContextual"/>
+            </w:rPr>
           </w:pPr>
           <w:r>
             <w:fldChar w:fldCharType="begin"/>
@@ -454,47 +471,58 @@
             </w:rPr>
             <w:fldChar w:fldCharType="separate"/>
           </w:r>
-          <w:hyperlink w:anchor="_Toc1274616787">
-            <w:r>
-              <w:rPr>
+          <w:hyperlink w:anchor="_Toc239585015" w:history="1">
+            <w:r>
+              <w:rPr>
+                <w:rStyle w:val="Hipervnculo"/>
+                <w:noProof/>
+              </w:rPr>
+              <w:t>Semana 1</w:t>
+            </w:r>
+            <w:r>
+              <w:rPr>
+                <w:noProof/>
                 <w:webHidden/>
               </w:rPr>
+              <w:tab/>
+            </w:r>
+            <w:r>
+              <w:rPr>
+                <w:noProof/>
+                <w:webHidden/>
+              </w:rPr>
               <w:fldChar w:fldCharType="begin"/>
             </w:r>
             <w:r>
               <w:rPr>
+                <w:noProof/>
                 <w:webHidden/>
               </w:rPr>
-              <w:instrText>PAGEREF _Toc1274616787 \h</w:instrText>
-            </w:r>
-            <w:r>
-              <w:rPr>
+              <w:instrText xml:space="preserve"> PAGEREF _Toc239585015 \h </w:instrText>
+            </w:r>
+            <w:r>
+              <w:rPr>
+                <w:noProof/>
                 <w:webHidden/>
               </w:rPr>
             </w:r>
             <w:r>
               <w:rPr>
+                <w:noProof/>
                 <w:webHidden/>
               </w:rPr>
               <w:fldChar w:fldCharType="separate"/>
             </w:r>
             <w:r>
               <w:rPr>
-                <w:rStyle w:val="Enlacedelndice"/>
+                <w:noProof/>
                 <w:webHidden/>
               </w:rPr>
-              <w:t>Semana 1</w:t>
-            </w:r>
-            <w:r>
-              <w:rPr>
-                <w:rStyle w:val="Enlacedelndice"/>
-                <w:webHidden/>
-              </w:rPr>
-              <w:tab/>
-              <w:t>2</w:t>
-            </w:r>
-            <w:r>
-              <w:rPr>
+              <w:t>3</w:t>
+            </w:r>
+            <w:r>
+              <w:rPr>
+                <w:noProof/>
                 <w:webHidden/>
               </w:rPr>
               <w:fldChar w:fldCharType="end"/>
@@ -503,52 +531,70 @@
         </w:p>
         <w:p>
           <w:pPr>
-            <w:pStyle w:val="TOC3"/>
+            <w:pStyle w:val="TDC5"/>
             <w:tabs>
-              <w:tab w:val="right" w:leader="dot" w:pos="9015"/>
+              <w:tab w:val="right" w:leader="dot" w:pos="9016"/>
             </w:tabs>
+            <w:rPr>
+              <w:rFonts w:eastAsiaTheme="minorEastAsia"/>
+              <w:noProof/>
+              <w:kern w:val="2"/>
+              <w:lang w:val="es-CO" w:eastAsia="es-CO"/>
+              <w14:ligatures w14:val="standardContextual"/>
+            </w:rPr>
           </w:pPr>
-          <w:hyperlink w:anchor="_Toc1968679706">
-            <w:r>
-              <w:rPr>
+          <w:hyperlink w:anchor="_Toc239585016" w:history="1">
+            <w:r>
+              <w:rPr>
+                <w:rStyle w:val="Hipervnculo"/>
+                <w:noProof/>
+              </w:rPr>
+              <w:t>Plataforma de Telemedicina</w:t>
+            </w:r>
+            <w:r>
+              <w:rPr>
+                <w:noProof/>
                 <w:webHidden/>
               </w:rPr>
+              <w:tab/>
+            </w:r>
+            <w:r>
+              <w:rPr>
+                <w:noProof/>
+                <w:webHidden/>
+              </w:rPr>
               <w:fldChar w:fldCharType="begin"/>
             </w:r>
             <w:r>
               <w:rPr>
+                <w:noProof/>
                 <w:webHidden/>
               </w:rPr>
-              <w:instrText>PAGEREF _Toc1968679706 \h</w:instrText>
-            </w:r>
-            <w:r>
-              <w:rPr>
+              <w:instrText xml:space="preserve"> PAGEREF _Toc239585016 \h </w:instrText>
+            </w:r>
+            <w:r>
+              <w:rPr>
+                <w:noProof/>
                 <w:webHidden/>
               </w:rPr>
             </w:r>
             <w:r>
               <w:rPr>
+                <w:noProof/>
                 <w:webHidden/>
               </w:rPr>
               <w:fldChar w:fldCharType="separate"/>
             </w:r>
             <w:r>
               <w:rPr>
-                <w:rStyle w:val="Enlacedelndice"/>
+                <w:noProof/>
                 <w:webHidden/>
               </w:rPr>
-              <w:t>Plataforma de Telemedicina</w:t>
-            </w:r>
-            <w:r>
-              <w:rPr>
-                <w:rStyle w:val="Enlacedelndice"/>
-                <w:webHidden/>
-              </w:rPr>
-              <w:tab/>
-              <w:t>2</w:t>
-            </w:r>
-            <w:r>
-              <w:rPr>
+              <w:t>3</w:t>
+            </w:r>
+            <w:r>
+              <w:rPr>
+                <w:noProof/>
                 <w:webHidden/>
               </w:rPr>
               <w:fldChar w:fldCharType="end"/>
@@ -557,52 +603,70 @@
         </w:p>
         <w:p>
           <w:pPr>
-            <w:pStyle w:val="TOC5"/>
+            <w:pStyle w:val="TDC5"/>
             <w:tabs>
-              <w:tab w:val="right" w:leader="dot" w:pos="9015"/>
+              <w:tab w:val="right" w:leader="dot" w:pos="9016"/>
             </w:tabs>
+            <w:rPr>
+              <w:rFonts w:eastAsiaTheme="minorEastAsia"/>
+              <w:noProof/>
+              <w:kern w:val="2"/>
+              <w:lang w:val="es-CO" w:eastAsia="es-CO"/>
+              <w14:ligatures w14:val="standardContextual"/>
+            </w:rPr>
           </w:pPr>
-          <w:hyperlink w:anchor="_Toc1408863809">
-            <w:r>
-              <w:rPr>
+          <w:hyperlink w:anchor="_Toc239585017" w:history="1">
+            <w:r>
+              <w:rPr>
+                <w:rStyle w:val="Hipervnculo"/>
+                <w:noProof/>
+              </w:rPr>
+              <w:t>Subsistemas:</w:t>
+            </w:r>
+            <w:r>
+              <w:rPr>
+                <w:noProof/>
                 <w:webHidden/>
               </w:rPr>
+              <w:tab/>
+            </w:r>
+            <w:r>
+              <w:rPr>
+                <w:noProof/>
+                <w:webHidden/>
+              </w:rPr>
               <w:fldChar w:fldCharType="begin"/>
             </w:r>
             <w:r>
               <w:rPr>
+                <w:noProof/>
                 <w:webHidden/>
               </w:rPr>
-              <w:instrText>PAGEREF _Toc1408863809 \h</w:instrText>
-            </w:r>
-            <w:r>
-              <w:rPr>
+              <w:instrText xml:space="preserve"> PAGEREF _Toc239585017 \h </w:instrText>
+            </w:r>
+            <w:r>
+              <w:rPr>
+                <w:noProof/>
                 <w:webHidden/>
               </w:rPr>
             </w:r>
             <w:r>
               <w:rPr>
+                <w:noProof/>
                 <w:webHidden/>
               </w:rPr>
               <w:fldChar w:fldCharType="separate"/>
             </w:r>
             <w:r>
               <w:rPr>
-                <w:rStyle w:val="Enlacedelndice"/>
+                <w:noProof/>
                 <w:webHidden/>
               </w:rPr>
-              <w:t>Subsistemas:</w:t>
-            </w:r>
-            <w:r>
-              <w:rPr>
-                <w:rStyle w:val="Enlacedelndice"/>
-                <w:webHidden/>
-              </w:rPr>
-              <w:tab/>
               <w:t>3</w:t>
             </w:r>
             <w:r>
               <w:rPr>
+                <w:noProof/>
                 <w:webHidden/>
               </w:rPr>
               <w:fldChar w:fldCharType="end"/>
@@ -611,52 +675,70 @@
         </w:p>
         <w:p>
           <w:pPr>
-            <w:pStyle w:val="TOC3"/>
+            <w:pStyle w:val="TDC3"/>
             <w:tabs>
-              <w:tab w:val="right" w:leader="dot" w:pos="9015"/>
+              <w:tab w:val="right" w:leader="dot" w:pos="9016"/>
             </w:tabs>
+            <w:rPr>
+              <w:rFonts w:eastAsiaTheme="minorEastAsia"/>
+              <w:noProof/>
+              <w:kern w:val="2"/>
+              <w:lang w:val="es-CO" w:eastAsia="es-CO"/>
+              <w14:ligatures w14:val="standardContextual"/>
+            </w:rPr>
           </w:pPr>
-          <w:hyperlink w:anchor="_Toc474931327">
-            <w:r>
-              <w:rPr>
+          <w:hyperlink w:anchor="_Toc239585018" w:history="1">
+            <w:r>
+              <w:rPr>
+                <w:rStyle w:val="Hipervnculo"/>
+                <w:noProof/>
+              </w:rPr>
+              <w:t>Semana 2</w:t>
+            </w:r>
+            <w:r>
+              <w:rPr>
+                <w:noProof/>
                 <w:webHidden/>
               </w:rPr>
+              <w:tab/>
+            </w:r>
+            <w:r>
+              <w:rPr>
+                <w:noProof/>
+                <w:webHidden/>
+              </w:rPr>
               <w:fldChar w:fldCharType="begin"/>
             </w:r>
             <w:r>
               <w:rPr>
+                <w:noProof/>
                 <w:webHidden/>
               </w:rPr>
-              <w:instrText>PAGEREF _Toc474931327 \h</w:instrText>
-            </w:r>
-            <w:r>
-              <w:rPr>
+              <w:instrText xml:space="preserve"> PAGEREF _Toc239585018 \h </w:instrText>
+            </w:r>
+            <w:r>
+              <w:rPr>
+                <w:noProof/>
                 <w:webHidden/>
               </w:rPr>
             </w:r>
             <w:r>
               <w:rPr>
+                <w:noProof/>
                 <w:webHidden/>
               </w:rPr>
               <w:fldChar w:fldCharType="separate"/>
             </w:r>
             <w:r>
               <w:rPr>
-                <w:rStyle w:val="Enlacedelndice"/>
+                <w:noProof/>
                 <w:webHidden/>
               </w:rPr>
-              <w:t>Semana 2</w:t>
-            </w:r>
-            <w:r>
-              <w:rPr>
-                <w:rStyle w:val="Enlacedelndice"/>
-                <w:webHidden/>
-              </w:rPr>
-              <w:tab/>
-              <w:t>4</w:t>
-            </w:r>
-            <w:r>
-              <w:rPr>
+              <w:t>5</w:t>
+            </w:r>
+            <w:r>
+              <w:rPr>
+                <w:noProof/>
                 <w:webHidden/>
               </w:rPr>
               <w:fldChar w:fldCharType="end"/>
@@ -665,52 +747,70 @@
         </w:p>
         <w:p>
           <w:pPr>
-            <w:pStyle w:val="TOC5"/>
+            <w:pStyle w:val="TDC5"/>
             <w:tabs>
-              <w:tab w:val="right" w:leader="dot" w:pos="9015"/>
+              <w:tab w:val="right" w:leader="dot" w:pos="9016"/>
             </w:tabs>
+            <w:rPr>
+              <w:rFonts w:eastAsiaTheme="minorEastAsia"/>
+              <w:noProof/>
+              <w:kern w:val="2"/>
+              <w:lang w:val="es-CO" w:eastAsia="es-CO"/>
+              <w14:ligatures w14:val="standardContextual"/>
+            </w:rPr>
           </w:pPr>
-          <w:hyperlink w:anchor="_Toc1912477033">
-            <w:r>
-              <w:rPr>
+          <w:hyperlink w:anchor="_Toc239585019" w:history="1">
+            <w:r>
+              <w:rPr>
+                <w:rStyle w:val="Hipervnculo"/>
+                <w:noProof/>
+              </w:rPr>
+              <w:t>Objetivo General:</w:t>
+            </w:r>
+            <w:r>
+              <w:rPr>
+                <w:noProof/>
                 <w:webHidden/>
               </w:rPr>
+              <w:tab/>
+            </w:r>
+            <w:r>
+              <w:rPr>
+                <w:noProof/>
+                <w:webHidden/>
+              </w:rPr>
               <w:fldChar w:fldCharType="begin"/>
             </w:r>
             <w:r>
               <w:rPr>
+                <w:noProof/>
                 <w:webHidden/>
               </w:rPr>
-              <w:instrText>PAGEREF _Toc1912477033 \h</w:instrText>
-            </w:r>
-            <w:r>
-              <w:rPr>
+              <w:instrText xml:space="preserve"> PAGEREF _Toc239585019 \h </w:instrText>
+            </w:r>
+            <w:r>
+              <w:rPr>
+                <w:noProof/>
                 <w:webHidden/>
               </w:rPr>
             </w:r>
             <w:r>
               <w:rPr>
+                <w:noProof/>
                 <w:webHidden/>
               </w:rPr>
               <w:fldChar w:fldCharType="separate"/>
             </w:r>
             <w:r>
               <w:rPr>
-                <w:rStyle w:val="Enlacedelndice"/>
+                <w:noProof/>
                 <w:webHidden/>
               </w:rPr>
-              <w:t>Objetivo General:</w:t>
-            </w:r>
-            <w:r>
-              <w:rPr>
-                <w:rStyle w:val="Enlacedelndice"/>
-                <w:webHidden/>
-              </w:rPr>
-              <w:tab/>
-              <w:t>4</w:t>
-            </w:r>
-            <w:r>
-              <w:rPr>
+              <w:t>5</w:t>
+            </w:r>
+            <w:r>
+              <w:rPr>
+                <w:noProof/>
                 <w:webHidden/>
               </w:rPr>
               <w:fldChar w:fldCharType="end"/>
@@ -719,52 +819,70 @@
         </w:p>
         <w:p>
           <w:pPr>
-            <w:pStyle w:val="TOC5"/>
+            <w:pStyle w:val="TDC5"/>
             <w:tabs>
-              <w:tab w:val="right" w:leader="dot" w:pos="9015"/>
+              <w:tab w:val="right" w:leader="dot" w:pos="9016"/>
             </w:tabs>
+            <w:rPr>
+              <w:rFonts w:eastAsiaTheme="minorEastAsia"/>
+              <w:noProof/>
+              <w:kern w:val="2"/>
+              <w:lang w:val="es-CO" w:eastAsia="es-CO"/>
+              <w14:ligatures w14:val="standardContextual"/>
+            </w:rPr>
           </w:pPr>
-          <w:hyperlink w:anchor="_Toc1716285126">
-            <w:r>
-              <w:rPr>
+          <w:hyperlink w:anchor="_Toc239585020" w:history="1">
+            <w:r>
+              <w:rPr>
+                <w:rStyle w:val="Hipervnculo"/>
+                <w:noProof/>
+              </w:rPr>
+              <w:t>Objetivos Específicos:</w:t>
+            </w:r>
+            <w:r>
+              <w:rPr>
+                <w:noProof/>
                 <w:webHidden/>
               </w:rPr>
+              <w:tab/>
+            </w:r>
+            <w:r>
+              <w:rPr>
+                <w:noProof/>
+                <w:webHidden/>
+              </w:rPr>
               <w:fldChar w:fldCharType="begin"/>
             </w:r>
             <w:r>
               <w:rPr>
+                <w:noProof/>
                 <w:webHidden/>
               </w:rPr>
-              <w:instrText>PAGEREF _Toc1716285126 \h</w:instrText>
-            </w:r>
-            <w:r>
-              <w:rPr>
+              <w:instrText xml:space="preserve"> PAGEREF _Toc239585020 \h </w:instrText>
+            </w:r>
+            <w:r>
+              <w:rPr>
+                <w:noProof/>
                 <w:webHidden/>
               </w:rPr>
             </w:r>
             <w:r>
               <w:rPr>
+                <w:noProof/>
                 <w:webHidden/>
               </w:rPr>
               <w:fldChar w:fldCharType="separate"/>
             </w:r>
             <w:r>
               <w:rPr>
-                <w:rStyle w:val="Enlacedelndice"/>
+                <w:noProof/>
                 <w:webHidden/>
               </w:rPr>
-              <w:t>Objetivos Específicos:</w:t>
-            </w:r>
-            <w:r>
-              <w:rPr>
-                <w:rStyle w:val="Enlacedelndice"/>
-                <w:webHidden/>
-              </w:rPr>
-              <w:tab/>
-              <w:t>4</w:t>
-            </w:r>
-            <w:r>
-              <w:rPr>
+              <w:t>5</w:t>
+            </w:r>
+            <w:r>
+              <w:rPr>
+                <w:noProof/>
                 <w:webHidden/>
               </w:rPr>
               <w:fldChar w:fldCharType="end"/>
@@ -773,118 +891,258 @@
         </w:p>
         <w:p>
           <w:pPr>
-            <w:pStyle w:val="TOC5"/>
+            <w:pStyle w:val="TDC3"/>
+            <w:tabs>
+              <w:tab w:val="right" w:leader="dot" w:pos="9016"/>
+            </w:tabs>
+            <w:rPr>
+              <w:rFonts w:eastAsiaTheme="minorEastAsia"/>
+              <w:noProof/>
+              <w:kern w:val="2"/>
+              <w:lang w:val="es-CO" w:eastAsia="es-CO"/>
+              <w14:ligatures w14:val="standardContextual"/>
+            </w:rPr>
+          </w:pPr>
+          <w:hyperlink w:anchor="_Toc239585021" w:history="1">
+            <w:r>
+              <w:rPr>
+                <w:rStyle w:val="Hipervnculo"/>
+                <w:noProof/>
+              </w:rPr>
+              <w:t>Semana 3</w:t>
+            </w:r>
+            <w:r>
+              <w:rPr>
+                <w:noProof/>
+                <w:webHidden/>
+              </w:rPr>
+              <w:tab/>
+            </w:r>
+            <w:r>
+              <w:rPr>
+                <w:noProof/>
+                <w:webHidden/>
+              </w:rPr>
+              <w:fldChar w:fldCharType="begin"/>
+            </w:r>
+            <w:r>
+              <w:rPr>
+                <w:noProof/>
+                <w:webHidden/>
+              </w:rPr>
+              <w:instrText xml:space="preserve"> PAGEREF _Toc239585021 \h </w:instrText>
+            </w:r>
+            <w:r>
+              <w:rPr>
+                <w:noProof/>
+                <w:webHidden/>
+              </w:rPr>
+            </w:r>
+            <w:r>
+              <w:rPr>
+                <w:noProof/>
+                <w:webHidden/>
+              </w:rPr>
+              <w:fldChar w:fldCharType="separate"/>
+            </w:r>
+            <w:r>
+              <w:rPr>
+                <w:noProof/>
+                <w:webHidden/>
+              </w:rPr>
+              <w:t>6</w:t>
+            </w:r>
+            <w:r>
+              <w:rPr>
+                <w:noProof/>
+                <w:webHidden/>
+              </w:rPr>
+              <w:fldChar w:fldCharType="end"/>
+            </w:r>
+          </w:hyperlink>
+        </w:p>
+        <w:p>
+          <w:pPr>
+            <w:pStyle w:val="TDC3"/>
+            <w:tabs>
+              <w:tab w:val="right" w:leader="dot" w:pos="9016"/>
+            </w:tabs>
+            <w:rPr>
+              <w:rFonts w:eastAsiaTheme="minorEastAsia"/>
+              <w:noProof/>
+              <w:kern w:val="2"/>
+              <w:lang w:val="es-CO" w:eastAsia="es-CO"/>
+              <w14:ligatures w14:val="standardContextual"/>
+            </w:rPr>
+          </w:pPr>
+          <w:hyperlink w:anchor="_Toc239585022" w:history="1">
+            <w:r>
+              <w:rPr>
+                <w:rStyle w:val="Hipervnculo"/>
+                <w:noProof/>
+                <w:lang w:val="es-CO"/>
+              </w:rPr>
+              <w:t>Video del funcionamiento con singleton:</w:t>
+            </w:r>
+            <w:r>
+              <w:rPr>
+                <w:rStyle w:val="Hipervnculo"/>
+                <w:noProof/>
+              </w:rPr>
+              <w:t xml:space="preserve"> </w:t>
+            </w:r>
+            <w:r>
+              <w:rPr>
+                <w:rStyle w:val="Hipervnculo"/>
+                <w:noProof/>
+                <w:lang w:val="es-CO"/>
+              </w:rPr>
+              <w:t>https://drive.google.com/file/d/1Vcs1NugwN_qMAXG4sOCP-Qemlg0jtC8I/view?usp=sharing</w:t>
+            </w:r>
+            <w:r>
+              <w:rPr>
+                <w:noProof/>
+                <w:webHidden/>
+              </w:rPr>
+              <w:tab/>
+            </w:r>
+            <w:r>
+              <w:rPr>
+                <w:noProof/>
+                <w:webHidden/>
+              </w:rPr>
+              <w:fldChar w:fldCharType="begin"/>
+            </w:r>
+            <w:r>
+              <w:rPr>
+                <w:noProof/>
+                <w:webHidden/>
+              </w:rPr>
+              <w:instrText xml:space="preserve"> PAGEREF _Toc239585022 \h </w:instrText>
+            </w:r>
+            <w:r>
+              <w:rPr>
+                <w:noProof/>
+                <w:webHidden/>
+              </w:rPr>
+            </w:r>
+            <w:r>
+              <w:rPr>
+                <w:noProof/>
+                <w:webHidden/>
+              </w:rPr>
+              <w:fldChar w:fldCharType="separate"/>
+            </w:r>
+            <w:r>
+              <w:rPr>
+                <w:noProof/>
+                <w:webHidden/>
+              </w:rPr>
+              <w:t>8</w:t>
+            </w:r>
+            <w:r>
+              <w:rPr>
+                <w:noProof/>
+                <w:webHidden/>
+              </w:rPr>
+              <w:fldChar w:fldCharType="end"/>
+            </w:r>
+          </w:hyperlink>
+        </w:p>
+        <w:p>
+          <w:pPr>
+            <w:pStyle w:val="TDC3"/>
+            <w:tabs>
+              <w:tab w:val="right" w:leader="dot" w:pos="9016"/>
+            </w:tabs>
+            <w:rPr>
+              <w:rFonts w:eastAsiaTheme="minorEastAsia"/>
+              <w:noProof/>
+              <w:kern w:val="2"/>
+              <w:lang w:val="es-CO" w:eastAsia="es-CO"/>
+              <w14:ligatures w14:val="standardContextual"/>
+            </w:rPr>
+          </w:pPr>
+          <w:hyperlink w:anchor="_Toc239585023" w:history="1">
+            <w:r>
+              <w:rPr>
+                <w:rStyle w:val="Hipervnculo"/>
+                <w:noProof/>
+              </w:rPr>
+              <w:t>Seman</w:t>
+            </w:r>
+            <w:r>
+              <w:rPr>
+                <w:rStyle w:val="Hipervnculo"/>
+                <w:noProof/>
+              </w:rPr>
+              <w:t>a</w:t>
+            </w:r>
+            <w:r>
+              <w:rPr>
+                <w:rStyle w:val="Hipervnculo"/>
+                <w:noProof/>
+              </w:rPr>
+              <w:t xml:space="preserve"> 4</w:t>
+            </w:r>
+            <w:r>
+              <w:rPr>
+                <w:noProof/>
+                <w:webHidden/>
+              </w:rPr>
+              <w:tab/>
+            </w:r>
+            <w:r>
+              <w:rPr>
+                <w:noProof/>
+                <w:webHidden/>
+              </w:rPr>
+              <w:fldChar w:fldCharType="begin"/>
+            </w:r>
+            <w:r>
+              <w:rPr>
+                <w:noProof/>
+                <w:webHidden/>
+              </w:rPr>
+              <w:instrText xml:space="preserve"> PAGEREF _Toc239585023 \h </w:instrText>
+            </w:r>
+            <w:r>
+              <w:rPr>
+                <w:noProof/>
+                <w:webHidden/>
+              </w:rPr>
+            </w:r>
+            <w:r>
+              <w:rPr>
+                <w:noProof/>
+                <w:webHidden/>
+              </w:rPr>
+              <w:fldChar w:fldCharType="separate"/>
+            </w:r>
+            <w:r>
+              <w:rPr>
+                <w:noProof/>
+                <w:webHidden/>
+              </w:rPr>
+              <w:t>9</w:t>
+            </w:r>
+            <w:r>
+              <w:rPr>
+                <w:noProof/>
+                <w:webHidden/>
+              </w:rPr>
+              <w:fldChar w:fldCharType="end"/>
+            </w:r>
+          </w:hyperlink>
+        </w:p>
+        <w:p>
+          <w:pPr>
+            <w:pStyle w:val="TDC3"/>
             <w:tabs>
               <w:tab w:val="right" w:leader="dot" w:pos="9015"/>
             </w:tabs>
             <w:ind w:left="0"/>
           </w:pPr>
-          <w:r>
-            <w:t xml:space="preserve">      </w:t>
-          </w:r>
-          <w:hyperlink w:anchor="_Toc1829509179">
-            <w:r>
-              <w:rPr>
-                <w:webHidden/>
-              </w:rPr>
-              <w:fldChar w:fldCharType="begin"/>
-            </w:r>
-            <w:r>
-              <w:rPr>
-                <w:webHidden/>
-              </w:rPr>
-              <w:instrText>PAGEREF _Toc1829509179 \h</w:instrText>
-            </w:r>
-            <w:r>
-              <w:rPr>
-                <w:webHidden/>
-              </w:rPr>
-            </w:r>
-            <w:r>
-              <w:rPr>
-                <w:webHidden/>
-              </w:rPr>
-              <w:fldChar w:fldCharType="separate"/>
-            </w:r>
-            <w:r>
-              <w:rPr>
-                <w:rStyle w:val="Enlacedelndice"/>
-                <w:webHidden/>
-              </w:rPr>
-              <w:t>Semana 3</w:t>
-            </w:r>
-            <w:r>
-              <w:rPr>
-                <w:rStyle w:val="Enlacedelndice"/>
-                <w:webHidden/>
-              </w:rPr>
-              <w:tab/>
-              <w:t>5</w:t>
-            </w:r>
-            <w:r>
-              <w:rPr>
-                <w:webHidden/>
-              </w:rPr>
-              <w:fldChar w:fldCharType="end"/>
-            </w:r>
-          </w:hyperlink>
-        </w:p>
-        <w:p>
-          <w:pPr>
-            <w:pStyle w:val="TOC3"/>
-            <w:tabs>
-              <w:tab w:val="right" w:leader="dot" w:pos="9015"/>
-            </w:tabs>
-            <w:rPr>
-              <w:rStyle w:val="Enlacedelndice"/>
-            </w:rPr>
-          </w:pPr>
-          <w:hyperlink w:anchor="_Toc305068199">
-            <w:r>
-              <w:rPr>
-                <w:webHidden/>
-              </w:rPr>
-              <w:fldChar w:fldCharType="begin"/>
-            </w:r>
-            <w:r>
-              <w:rPr>
-                <w:webHidden/>
-              </w:rPr>
-              <w:instrText>PAGEREF _Toc305068199 \h</w:instrText>
-            </w:r>
-            <w:r>
-              <w:rPr>
-                <w:webHidden/>
-              </w:rPr>
-            </w:r>
-            <w:r>
-              <w:rPr>
-                <w:webHidden/>
-              </w:rPr>
-              <w:fldChar w:fldCharType="separate"/>
-            </w:r>
-            <w:r>
-              <w:rPr>
-                <w:rStyle w:val="Enlacedelndice"/>
-                <w:webHidden/>
-              </w:rPr>
-              <w:t>Video del funcionamiento con singleton:</w:t>
-            </w:r>
-            <w:r>
-              <w:rPr>
-                <w:rStyle w:val="Enlacedelndice"/>
-                <w:webHidden/>
-              </w:rPr>
-              <w:tab/>
-              <w:t>8</w:t>
-            </w:r>
-            <w:r>
-              <w:rPr>
-                <w:webHidden/>
-              </w:rPr>
-              <w:fldChar w:fldCharType="end"/>
-            </w:r>
-          </w:hyperlink>
           <w:r>
             <w:rPr>
               <w:rStyle w:val="Enlacedelndice"/>
@@ -892,26 +1150,6 @@
             <w:fldChar w:fldCharType="end"/>
           </w:r>
         </w:p>
-        <w:p>
-          <w:r>
-            <w:t xml:space="preserve">   </w:t>
-          </w:r>
-          <w:r>
-            <w:t xml:space="preserve">  </w:t>
-          </w:r>
-          <w:r>
-            <w:t xml:space="preserve"> Semana 4……………………………………………………………</w:t>
-          </w:r>
-          <w:r>
-            <w:t>…………</w:t>
-          </w:r>
-          <w:r>
-            <w:t>………</w:t>
-          </w:r>
-          <w:r>
-            <w:t>11</w:t>
-          </w:r>
-        </w:p>
       </w:sdtContent>
     </w:sdt>
     <w:p/>
@@ -1113,8 +1351,6 @@
     <w:p>
       <w:pPr>
         <w:spacing w:line="360" w:lineRule="auto"/>
-        <w:ind w:left="708"/>
-        <w:jc w:val="center"/>
         <w:rPr>
           <w:rFonts w:eastAsiaTheme="minorEastAsia"/>
           <w:b/>
@@ -1126,72 +1362,51 @@
     <w:p>
       <w:pPr>
         <w:spacing w:line="360" w:lineRule="auto"/>
-        <w:ind w:left="708"/>
         <w:jc w:val="center"/>
         <w:rPr>
           <w:rFonts w:eastAsiaTheme="minorEastAsia"/>
-          <w:b/>
-          <w:bCs/>
+        </w:rPr>
+      </w:pPr>
+      <w:r>
+        <w:rPr>
+          <w:rFonts w:eastAsiaTheme="minorEastAsia"/>
+        </w:rPr>
+        <w:t>Patrones de Software entregable Semana 3</w:t>
+      </w:r>
+    </w:p>
+    <w:p>
+      <w:pPr>
+        <w:pStyle w:val="Ttulo3"/>
+        <w:jc w:val="center"/>
+        <w:rPr>
+          <w:rFonts w:eastAsiaTheme="minorEastAsia" w:cstheme="minorBidi"/>
+        </w:rPr>
+      </w:pPr>
+      <w:bookmarkStart w:id="0" w:name="_Toc239585015"/>
+      <w:r>
+        <w:rPr>
           <w:color w:val="000000" w:themeColor="text1"/>
         </w:rPr>
-      </w:pPr>
-    </w:p>
-    <w:p>
-      <w:pPr>
-        <w:spacing w:line="360" w:lineRule="auto"/>
-        <w:ind w:left="708"/>
+        <w:t>Semana</w:t>
+      </w:r>
+      <w:r>
+        <w:t xml:space="preserve"> 1</w:t>
+      </w:r>
+      <w:bookmarkEnd w:id="0"/>
+    </w:p>
+    <w:p>
+      <w:pPr>
+        <w:pStyle w:val="Ttulo5"/>
         <w:jc w:val="center"/>
         <w:rPr>
-          <w:rFonts w:eastAsiaTheme="minorEastAsia"/>
-          <w:b/>
-          <w:bCs/>
           <w:color w:val="000000" w:themeColor="text1"/>
         </w:rPr>
       </w:pPr>
-    </w:p>
-    <w:p>
-      <w:pPr>
-        <w:spacing w:line="360" w:lineRule="auto"/>
-        <w:jc w:val="center"/>
-        <w:rPr>
-          <w:rFonts w:eastAsiaTheme="minorEastAsia"/>
-        </w:rPr>
-      </w:pPr>
-      <w:r>
-        <w:rPr>
-          <w:rFonts w:eastAsiaTheme="minorEastAsia"/>
-        </w:rPr>
-        <w:t>Patrones de Software entregable Semana 3</w:t>
-      </w:r>
-    </w:p>
-    <w:p>
-      <w:pPr>
-        <w:pStyle w:val="ndice"/>
-        <w:jc w:val="center"/>
-        <w:rPr>
-          <w:rFonts w:eastAsiaTheme="minorEastAsia" w:cstheme="minorBidi"/>
-        </w:rPr>
-      </w:pPr>
-      <w:bookmarkStart w:id="0" w:name="_Toc1274616787"/>
-      <w:r>
-        <w:t>Semana 1</w:t>
-      </w:r>
-      <w:bookmarkEnd w:id="0"/>
-    </w:p>
-    <w:p>
-      <w:pPr>
-        <w:pStyle w:val="Heading3"/>
-        <w:jc w:val="center"/>
-        <w:rPr>
-          <w:rFonts w:eastAsiaTheme="minorEastAsia" w:cstheme="minorBidi"/>
+      <w:bookmarkStart w:id="1" w:name="_Toc239585016"/>
+      <w:r>
+        <w:rPr>
           <w:color w:val="000000" w:themeColor="text1"/>
         </w:rPr>
-      </w:pPr>
-      <w:bookmarkStart w:id="1" w:name="_Toc1968679706"/>
-      <w:r>
-        <w:rPr>
-          <w:color w:val="000000" w:themeColor="text1"/>
-        </w:rPr>
         <w:t>Plataforma de Telemedicina</w:t>
       </w:r>
       <w:bookmarkEnd w:id="1"/>
@@ -1201,7 +1416,7 @@
         <w:spacing w:line="360" w:lineRule="auto"/>
       </w:pPr>
       <w:r>
-        <w:t>Que es una plataforma de telemedicina?</w:t>
+        <w:t>¿Qué es una plataforma de telemedicina?</w:t>
       </w:r>
       <w:r>
         <w:br/>
@@ -1211,17 +1426,17 @@
     <w:p/>
     <w:p>
       <w:pPr>
-        <w:pStyle w:val="Heading5"/>
+        <w:pStyle w:val="Ttulo5"/>
+      </w:pPr>
+      <w:bookmarkStart w:id="2" w:name="_Toc239585017"/>
+      <w:r>
         <w:rPr>
           <w:color w:val="000000" w:themeColor="text1"/>
         </w:rPr>
-      </w:pPr>
-      <w:bookmarkStart w:id="2" w:name="_Toc1408863809"/>
-      <w:r>
-        <w:rPr>
-          <w:color w:val="000000" w:themeColor="text1"/>
-        </w:rPr>
-        <w:t>Subsistemas:</w:t>
+        <w:t>Subsistemas</w:t>
+      </w:r>
+      <w:r>
+        <w:t>:</w:t>
       </w:r>
       <w:bookmarkEnd w:id="2"/>
     </w:p>
@@ -1232,7 +1447,7 @@
     </w:p>
     <w:p>
       <w:pPr>
-        <w:pStyle w:val="ListParagraph"/>
+        <w:pStyle w:val="Prrafodelista"/>
         <w:numPr>
           <w:ilvl w:val="0"/>
           <w:numId w:val="2"/>
@@ -1262,12 +1477,20 @@
         <w:spacing w:line="360" w:lineRule="auto"/>
       </w:pPr>
       <w:r>
-        <w:t>1.2. Videollamadas y chat interactivo: El paciente podrá hacer una teleconsulta mediante una videoconferencia o chat para realizar diagnósticos y seguimiento,</w:t>
-      </w:r>
-    </w:p>
-    <w:p>
-      <w:pPr>
-        <w:pStyle w:val="ListParagraph"/>
+        <w:t xml:space="preserve">1.2. Videollamadas y chat interactivo: El paciente podrá hacer una </w:t>
+      </w:r>
+      <w:proofErr w:type="spellStart"/>
+      <w:r>
+        <w:t>teleconsulta</w:t>
+      </w:r>
+      <w:proofErr w:type="spellEnd"/>
+      <w:r>
+        <w:t xml:space="preserve"> mediante una videoconferencia o chat para realizar diagnósticos y seguimiento,</w:t>
+      </w:r>
+    </w:p>
+    <w:p>
+      <w:pPr>
+        <w:pStyle w:val="Prrafodelista"/>
         <w:numPr>
           <w:ilvl w:val="0"/>
           <w:numId w:val="2"/>
@@ -1305,6 +1528,7 @@
         </w:rPr>
       </w:pPr>
       <w:r>
+        <w:lastRenderedPageBreak/>
         <w:t xml:space="preserve">2.3. Formato estandarizado de recetas: </w:t>
       </w:r>
       <w:r>
@@ -1336,7 +1560,7 @@
     </w:p>
     <w:p>
       <w:pPr>
-        <w:pStyle w:val="ListParagraph"/>
+        <w:pStyle w:val="Prrafodelista"/>
         <w:numPr>
           <w:ilvl w:val="0"/>
           <w:numId w:val="2"/>
@@ -1347,7 +1571,6 @@
         </w:rPr>
       </w:pPr>
       <w:r>
-        <w:lastRenderedPageBreak/>
         <w:t>Módulo de conexión con entidades externas para cerrar el ciclo de atención.</w:t>
       </w:r>
     </w:p>
@@ -1381,7 +1604,7 @@
     </w:p>
     <w:p>
       <w:pPr>
-        <w:pStyle w:val="ListParagraph"/>
+        <w:pStyle w:val="Prrafodelista"/>
         <w:numPr>
           <w:ilvl w:val="0"/>
           <w:numId w:val="2"/>
@@ -1414,7 +1637,15 @@
         <w:spacing w:line="360" w:lineRule="auto"/>
       </w:pPr>
       <w:r>
-        <w:t>4.2. Triaje (clasificación de gravedad):</w:t>
+        <w:t xml:space="preserve">4.2. </w:t>
+      </w:r>
+      <w:proofErr w:type="spellStart"/>
+      <w:r>
+        <w:t>Triaje</w:t>
+      </w:r>
+      <w:proofErr w:type="spellEnd"/>
+      <w:r>
+        <w:t xml:space="preserve"> (clasificación de gravedad):</w:t>
       </w:r>
       <w:r>
         <w:rPr>
@@ -1452,30 +1683,33 @@
     <w:p/>
     <w:p/>
     <w:p/>
-    <w:p>
-      <w:pPr>
-        <w:pStyle w:val="ndice"/>
+    <w:p/>
+    <w:p>
+      <w:pPr>
+        <w:pStyle w:val="Ttulo3"/>
         <w:jc w:val="center"/>
       </w:pPr>
-      <w:bookmarkStart w:id="3" w:name="_Toc474931327"/>
-      <w:r>
-        <w:lastRenderedPageBreak/>
-        <w:t>Semana 2</w:t>
+      <w:bookmarkStart w:id="3" w:name="_Toc239585018"/>
+      <w:r>
+        <w:rPr>
+          <w:color w:val="000000" w:themeColor="text1"/>
+        </w:rPr>
+        <w:t>Semana</w:t>
+      </w:r>
+      <w:r>
+        <w:t xml:space="preserve"> 2</w:t>
       </w:r>
       <w:bookmarkEnd w:id="3"/>
     </w:p>
     <w:p/>
     <w:p>
       <w:pPr>
-        <w:pStyle w:val="Heading5"/>
-        <w:rPr>
-          <w:rFonts w:eastAsiaTheme="minorEastAsia" w:cstheme="minorBidi"/>
-          <w:b/>
-          <w:bCs/>
+        <w:pStyle w:val="Ttulo5"/>
+        <w:rPr>
           <w:color w:val="000000" w:themeColor="text1"/>
         </w:rPr>
       </w:pPr>
-      <w:bookmarkStart w:id="4" w:name="_Toc1912477033"/>
+      <w:bookmarkStart w:id="4" w:name="_Toc239585019"/>
       <w:r>
         <w:rPr>
           <w:color w:val="000000" w:themeColor="text1"/>
@@ -1497,17 +1731,12 @@
     </w:p>
     <w:p>
       <w:pPr>
-        <w:pStyle w:val="Heading5"/>
-        <w:rPr>
-          <w:rFonts w:eastAsiaTheme="minorEastAsia" w:cstheme="minorBidi"/>
-          <w:b/>
-          <w:bCs/>
+        <w:pStyle w:val="Ttulo5"/>
+        <w:rPr>
           <w:color w:val="000000" w:themeColor="text1"/>
-          <w:sz w:val="28"/>
-          <w:szCs w:val="28"/>
-        </w:rPr>
-      </w:pPr>
-      <w:bookmarkStart w:id="5" w:name="_Toc1716285126"/>
+        </w:rPr>
+      </w:pPr>
+      <w:bookmarkStart w:id="5" w:name="_Toc239585020"/>
       <w:r>
         <w:rPr>
           <w:color w:val="000000" w:themeColor="text1"/>
@@ -1518,7 +1747,7 @@
     </w:p>
     <w:p>
       <w:pPr>
-        <w:pStyle w:val="ListParagraph"/>
+        <w:pStyle w:val="Prrafodelista"/>
         <w:numPr>
           <w:ilvl w:val="0"/>
           <w:numId w:val="1"/>
@@ -1537,7 +1766,7 @@
     </w:p>
     <w:p>
       <w:pPr>
-        <w:pStyle w:val="ListParagraph"/>
+        <w:pStyle w:val="Prrafodelista"/>
         <w:numPr>
           <w:ilvl w:val="0"/>
           <w:numId w:val="1"/>
@@ -1556,7 +1785,7 @@
     </w:p>
     <w:p>
       <w:pPr>
-        <w:pStyle w:val="ListParagraph"/>
+        <w:pStyle w:val="Prrafodelista"/>
         <w:numPr>
           <w:ilvl w:val="0"/>
           <w:numId w:val="1"/>
@@ -1589,15 +1818,18 @@
     <w:p/>
     <w:p>
       <w:pPr>
-        <w:pStyle w:val="ndice"/>
+        <w:pStyle w:val="Ttulo3"/>
         <w:jc w:val="center"/>
         <w:rPr>
           <w:rFonts w:eastAsiaTheme="minorEastAsia" w:cstheme="minorBidi"/>
-        </w:rPr>
-      </w:pPr>
-      <w:bookmarkStart w:id="6" w:name="_Toc1829509179"/>
-      <w:r>
-        <w:lastRenderedPageBreak/>
+          <w:color w:val="000000" w:themeColor="text1"/>
+        </w:rPr>
+      </w:pPr>
+      <w:bookmarkStart w:id="6" w:name="_Toc239585021"/>
+      <w:r>
+        <w:rPr>
+          <w:color w:val="000000" w:themeColor="text1"/>
+        </w:rPr>
         <w:t>Semana 3</w:t>
       </w:r>
       <w:bookmarkEnd w:id="6"/>
@@ -1609,8 +1841,21 @@
           <w:rFonts w:eastAsiaTheme="minorEastAsia"/>
         </w:rPr>
       </w:pPr>
-      <w:r>
-        <w:t>Codigo python Django</w:t>
+      <w:proofErr w:type="spellStart"/>
+      <w:r>
+        <w:t>Codigo</w:t>
+      </w:r>
+      <w:proofErr w:type="spellEnd"/>
+      <w:r>
+        <w:t xml:space="preserve"> </w:t>
+      </w:r>
+      <w:proofErr w:type="spellStart"/>
+      <w:r>
+        <w:t>python</w:t>
+      </w:r>
+      <w:proofErr w:type="spellEnd"/>
+      <w:r>
+        <w:t xml:space="preserve"> Django</w:t>
       </w:r>
     </w:p>
     <w:p>
@@ -1639,7 +1884,21 @@
         <w:rPr>
           <w:lang w:val="en-US"/>
         </w:rPr>
-        <w:t>class GestorMedicinas:</w:t>
+        <w:t xml:space="preserve">class </w:t>
+      </w:r>
+      <w:proofErr w:type="spellStart"/>
+      <w:r>
+        <w:rPr>
+          <w:lang w:val="en-US"/>
+        </w:rPr>
+        <w:t>GestorMedicinas</w:t>
+      </w:r>
+      <w:proofErr w:type="spellEnd"/>
+      <w:r>
+        <w:rPr>
+          <w:lang w:val="en-US"/>
+        </w:rPr>
+        <w:t>:</w:t>
       </w:r>
     </w:p>
     <w:p>
@@ -1657,7 +1916,21 @@
         <w:rPr>
           <w:lang w:val="en-US"/>
         </w:rPr>
-        <w:t xml:space="preserve">    _instancia = None</w:t>
+        <w:t xml:space="preserve">    _</w:t>
+      </w:r>
+      <w:proofErr w:type="spellStart"/>
+      <w:r>
+        <w:rPr>
+          <w:lang w:val="en-US"/>
+        </w:rPr>
+        <w:t>instancia</w:t>
+      </w:r>
+      <w:proofErr w:type="spellEnd"/>
+      <w:r>
+        <w:rPr>
+          <w:lang w:val="en-US"/>
+        </w:rPr>
+        <w:t xml:space="preserve"> = None</w:t>
       </w:r>
     </w:p>
     <w:p>
@@ -1683,7 +1956,21 @@
         <w:rPr>
           <w:lang w:val="en-US"/>
         </w:rPr>
-        <w:t xml:space="preserve">    def __new__(cls):</w:t>
+        <w:t xml:space="preserve">    def __new__(</w:t>
+      </w:r>
+      <w:proofErr w:type="spellStart"/>
+      <w:r>
+        <w:rPr>
+          <w:lang w:val="en-US"/>
+        </w:rPr>
+        <w:t>cls</w:t>
+      </w:r>
+      <w:proofErr w:type="spellEnd"/>
+      <w:r>
+        <w:rPr>
+          <w:lang w:val="en-US"/>
+        </w:rPr>
+        <w:t>):</w:t>
       </w:r>
     </w:p>
     <w:p>
@@ -1701,7 +1988,37 @@
         <w:rPr>
           <w:lang w:val="en-US"/>
         </w:rPr>
-        <w:t xml:space="preserve">        if cls._instancia is None:</w:t>
+        <w:t xml:space="preserve">        if </w:t>
+      </w:r>
+      <w:proofErr w:type="spellStart"/>
+      <w:proofErr w:type="gramStart"/>
+      <w:r>
+        <w:rPr>
+          <w:lang w:val="en-US"/>
+        </w:rPr>
+        <w:t>cls</w:t>
+      </w:r>
+      <w:proofErr w:type="spellEnd"/>
+      <w:r>
+        <w:rPr>
+          <w:lang w:val="en-US"/>
+        </w:rPr>
+        <w:t>._</w:t>
+      </w:r>
+      <w:proofErr w:type="spellStart"/>
+      <w:proofErr w:type="gramEnd"/>
+      <w:r>
+        <w:rPr>
+          <w:lang w:val="en-US"/>
+        </w:rPr>
+        <w:t>instancia</w:t>
+      </w:r>
+      <w:proofErr w:type="spellEnd"/>
+      <w:r>
+        <w:rPr>
+          <w:lang w:val="en-US"/>
+        </w:rPr>
+        <w:t xml:space="preserve"> is None:</w:t>
       </w:r>
     </w:p>
     <w:p>
@@ -1719,7 +2036,65 @@
         <w:rPr>
           <w:lang w:val="en-US"/>
         </w:rPr>
-        <w:t xml:space="preserve">            cls._instancia = super().__new__(cls)</w:t>
+        <w:t xml:space="preserve">            </w:t>
+      </w:r>
+      <w:proofErr w:type="spellStart"/>
+      <w:proofErr w:type="gramStart"/>
+      <w:r>
+        <w:rPr>
+          <w:lang w:val="en-US"/>
+        </w:rPr>
+        <w:t>cls</w:t>
+      </w:r>
+      <w:proofErr w:type="spellEnd"/>
+      <w:r>
+        <w:rPr>
+          <w:lang w:val="en-US"/>
+        </w:rPr>
+        <w:t>._</w:t>
+      </w:r>
+      <w:proofErr w:type="spellStart"/>
+      <w:proofErr w:type="gramEnd"/>
+      <w:r>
+        <w:rPr>
+          <w:lang w:val="en-US"/>
+        </w:rPr>
+        <w:t>instancia</w:t>
+      </w:r>
+      <w:proofErr w:type="spellEnd"/>
+      <w:r>
+        <w:rPr>
+          <w:lang w:val="en-US"/>
+        </w:rPr>
+        <w:t xml:space="preserve"> = super(</w:t>
+      </w:r>
+      <w:proofErr w:type="gramStart"/>
+      <w:r>
+        <w:rPr>
+          <w:lang w:val="en-US"/>
+        </w:rPr>
+        <w:t>)._</w:t>
+      </w:r>
+      <w:proofErr w:type="gramEnd"/>
+      <w:r>
+        <w:rPr>
+          <w:lang w:val="en-US"/>
+        </w:rPr>
+        <w:t>_new__(</w:t>
+      </w:r>
+      <w:proofErr w:type="spellStart"/>
+      <w:r>
+        <w:rPr>
+          <w:lang w:val="en-US"/>
+        </w:rPr>
+        <w:t>cls</w:t>
+      </w:r>
+      <w:proofErr w:type="spellEnd"/>
+      <w:r>
+        <w:rPr>
+          <w:lang w:val="en-US"/>
+        </w:rPr>
+        <w:t>)</w:t>
       </w:r>
     </w:p>
     <w:p>
@@ -1737,7 +2112,37 @@
         <w:rPr>
           <w:lang w:val="en-US"/>
         </w:rPr>
-        <w:t xml:space="preserve">            cls._instancia.medicinas = []</w:t>
+        <w:t xml:space="preserve">            </w:t>
+      </w:r>
+      <w:proofErr w:type="spellStart"/>
+      <w:proofErr w:type="gramStart"/>
+      <w:r>
+        <w:rPr>
+          <w:lang w:val="en-US"/>
+        </w:rPr>
+        <w:t>cls</w:t>
+      </w:r>
+      <w:proofErr w:type="spellEnd"/>
+      <w:r>
+        <w:rPr>
+          <w:lang w:val="en-US"/>
+        </w:rPr>
+        <w:t>._</w:t>
+      </w:r>
+      <w:proofErr w:type="spellStart"/>
+      <w:r>
+        <w:rPr>
+          <w:lang w:val="en-US"/>
+        </w:rPr>
+        <w:t>instancia.medicinas</w:t>
+      </w:r>
+      <w:proofErr w:type="spellEnd"/>
+      <w:proofErr w:type="gramEnd"/>
+      <w:r>
+        <w:rPr>
+          <w:lang w:val="en-US"/>
+        </w:rPr>
+        <w:t xml:space="preserve"> = []</w:t>
       </w:r>
     </w:p>
     <w:p>
@@ -1763,8 +2168,32 @@
         <w:rPr>
           <w:lang w:val="en-US"/>
         </w:rPr>
-        <w:t xml:space="preserve">        return cls._instancia</w:t>
-      </w:r>
+        <w:t xml:space="preserve">        return </w:t>
+      </w:r>
+      <w:proofErr w:type="spellStart"/>
+      <w:proofErr w:type="gramStart"/>
+      <w:r>
+        <w:rPr>
+          <w:lang w:val="en-US"/>
+        </w:rPr>
+        <w:t>cls</w:t>
+      </w:r>
+      <w:proofErr w:type="spellEnd"/>
+      <w:r>
+        <w:rPr>
+          <w:lang w:val="en-US"/>
+        </w:rPr>
+        <w:t>._</w:t>
+      </w:r>
+      <w:proofErr w:type="spellStart"/>
+      <w:proofErr w:type="gramEnd"/>
+      <w:r>
+        <w:rPr>
+          <w:lang w:val="en-US"/>
+        </w:rPr>
+        <w:t>instancia</w:t>
+      </w:r>
+      <w:proofErr w:type="spellEnd"/>
     </w:p>
     <w:p>
       <w:pPr>
@@ -1789,7 +2218,49 @@
         <w:rPr>
           <w:lang w:val="en-US"/>
         </w:rPr>
-        <w:t xml:space="preserve">    def agregar_medicina(self, medicina):</w:t>
+        <w:t xml:space="preserve">    def </w:t>
+      </w:r>
+      <w:proofErr w:type="spellStart"/>
+      <w:r>
+        <w:rPr>
+          <w:lang w:val="en-US"/>
+        </w:rPr>
+        <w:t>agregar_</w:t>
+      </w:r>
+      <w:proofErr w:type="gramStart"/>
+      <w:r>
+        <w:rPr>
+          <w:lang w:val="en-US"/>
+        </w:rPr>
+        <w:t>medicina</w:t>
+      </w:r>
+      <w:proofErr w:type="spellEnd"/>
+      <w:r>
+        <w:rPr>
+          <w:lang w:val="en-US"/>
+        </w:rPr>
+        <w:t>(</w:t>
+      </w:r>
+      <w:proofErr w:type="gramEnd"/>
+      <w:r>
+        <w:rPr>
+          <w:lang w:val="en-US"/>
+        </w:rPr>
+        <w:t xml:space="preserve">self, </w:t>
+      </w:r>
+      <w:proofErr w:type="spellStart"/>
+      <w:r>
+        <w:rPr>
+          <w:lang w:val="en-US"/>
+        </w:rPr>
+        <w:t>medicina</w:t>
+      </w:r>
+      <w:proofErr w:type="spellEnd"/>
+      <w:r>
+        <w:rPr>
+          <w:lang w:val="en-US"/>
+        </w:rPr>
+        <w:t>):</w:t>
       </w:r>
     </w:p>
     <w:p>
@@ -1807,7 +2278,43 @@
         <w:rPr>
           <w:lang w:val="en-US"/>
         </w:rPr>
-        <w:t xml:space="preserve">        self.medicinas.append(medicina)</w:t>
+        <w:t xml:space="preserve">        </w:t>
+      </w:r>
+      <w:proofErr w:type="spellStart"/>
+      <w:proofErr w:type="gramStart"/>
+      <w:r>
+        <w:rPr>
+          <w:lang w:val="en-US"/>
+        </w:rPr>
+        <w:t>self.medicinas</w:t>
+      </w:r>
+      <w:proofErr w:type="gramEnd"/>
+      <w:r>
+        <w:rPr>
+          <w:lang w:val="en-US"/>
+        </w:rPr>
+        <w:t>.append</w:t>
+      </w:r>
+      <w:proofErr w:type="spellEnd"/>
+      <w:r>
+        <w:rPr>
+          <w:lang w:val="en-US"/>
+        </w:rPr>
+        <w:t>(</w:t>
+      </w:r>
+      <w:proofErr w:type="spellStart"/>
+      <w:r>
+        <w:rPr>
+          <w:lang w:val="en-US"/>
+        </w:rPr>
+        <w:t>medicina</w:t>
+      </w:r>
+      <w:proofErr w:type="spellEnd"/>
+      <w:r>
+        <w:rPr>
+          <w:lang w:val="en-US"/>
+        </w:rPr>
+        <w:t>)</w:t>
       </w:r>
     </w:p>
     <w:p>
@@ -1833,7 +2340,21 @@
         <w:rPr>
           <w:lang w:val="en-US"/>
         </w:rPr>
-        <w:t xml:space="preserve">    def obtener_medicinas(self):</w:t>
+        <w:t xml:space="preserve">    def </w:t>
+      </w:r>
+      <w:proofErr w:type="spellStart"/>
+      <w:r>
+        <w:rPr>
+          <w:lang w:val="en-US"/>
+        </w:rPr>
+        <w:t>obtener_medicinas</w:t>
+      </w:r>
+      <w:proofErr w:type="spellEnd"/>
+      <w:r>
+        <w:rPr>
+          <w:lang w:val="en-US"/>
+        </w:rPr>
+        <w:t>(self):</w:t>
       </w:r>
     </w:p>
     <w:p>
@@ -1851,8 +2372,18 @@
         <w:rPr>
           <w:lang w:val="en-US"/>
         </w:rPr>
-        <w:t xml:space="preserve">        return self.medicinas</w:t>
-      </w:r>
+        <w:t xml:space="preserve">        return </w:t>
+      </w:r>
+      <w:proofErr w:type="spellStart"/>
+      <w:proofErr w:type="gramStart"/>
+      <w:r>
+        <w:rPr>
+          <w:lang w:val="en-US"/>
+        </w:rPr>
+        <w:t>self.medicinas</w:t>
+      </w:r>
+      <w:proofErr w:type="spellEnd"/>
+      <w:proofErr w:type="gramEnd"/>
     </w:p>
     <w:p>
       <w:pPr>
@@ -1892,7 +2423,23 @@
         <w:rPr>
           <w:lang w:val="en-US"/>
         </w:rPr>
-        <w:t>from django.shortcuts import render, redirect</w:t>
+        <w:t xml:space="preserve">from </w:t>
+      </w:r>
+      <w:proofErr w:type="spellStart"/>
+      <w:proofErr w:type="gramStart"/>
+      <w:r>
+        <w:rPr>
+          <w:lang w:val="en-US"/>
+        </w:rPr>
+        <w:t>django.shortcuts</w:t>
+      </w:r>
+      <w:proofErr w:type="spellEnd"/>
+      <w:proofErr w:type="gramEnd"/>
+      <w:r>
+        <w:rPr>
+          <w:lang w:val="en-US"/>
+        </w:rPr>
+        <w:t xml:space="preserve"> import render, redirect</w:t>
       </w:r>
     </w:p>
     <w:p>
@@ -1906,12 +2453,42 @@
           <w:lang w:val="en-US"/>
         </w:rPr>
       </w:pPr>
-      <w:r>
-        <w:rPr>
-          <w:lang w:val="en-US"/>
-        </w:rPr>
-        <w:t>from .singleton import GestorMedicinas</w:t>
-      </w:r>
+      <w:proofErr w:type="gramStart"/>
+      <w:r>
+        <w:rPr>
+          <w:lang w:val="en-US"/>
+        </w:rPr>
+        <w:t>from .singleton</w:t>
+      </w:r>
+      <w:proofErr w:type="gramEnd"/>
+      <w:r>
+        <w:rPr>
+          <w:lang w:val="en-US"/>
+        </w:rPr>
+        <w:t xml:space="preserve"> </w:t>
+      </w:r>
+      <w:proofErr w:type="gramStart"/>
+      <w:r>
+        <w:rPr>
+          <w:lang w:val="en-US"/>
+        </w:rPr>
+        <w:t>import</w:t>
+      </w:r>
+      <w:proofErr w:type="gramEnd"/>
+      <w:r>
+        <w:rPr>
+          <w:lang w:val="en-US"/>
+        </w:rPr>
+        <w:t xml:space="preserve"> </w:t>
+      </w:r>
+      <w:proofErr w:type="spellStart"/>
+      <w:r>
+        <w:rPr>
+          <w:lang w:val="en-US"/>
+        </w:rPr>
+        <w:t>GestorMedicinas</w:t>
+      </w:r>
+      <w:proofErr w:type="spellEnd"/>
     </w:p>
     <w:p>
       <w:pPr>
@@ -1936,7 +2513,21 @@
         <w:rPr>
           <w:lang w:val="en-US"/>
         </w:rPr>
-        <w:t>def medicinas(request):</w:t>
+        <w:t xml:space="preserve">def </w:t>
+      </w:r>
+      <w:proofErr w:type="spellStart"/>
+      <w:r>
+        <w:rPr>
+          <w:lang w:val="en-US"/>
+        </w:rPr>
+        <w:t>medicinas</w:t>
+      </w:r>
+      <w:proofErr w:type="spellEnd"/>
+      <w:r>
+        <w:rPr>
+          <w:lang w:val="en-US"/>
+        </w:rPr>
+        <w:t>(request):</w:t>
       </w:r>
     </w:p>
     <w:p>
@@ -1954,7 +2545,29 @@
         <w:rPr>
           <w:lang w:val="en-US"/>
         </w:rPr>
-        <w:t xml:space="preserve">    gestor = GestorMedicinas()</w:t>
+        <w:t xml:space="preserve">    gestor = </w:t>
+      </w:r>
+      <w:proofErr w:type="spellStart"/>
+      <w:proofErr w:type="gramStart"/>
+      <w:r>
+        <w:rPr>
+          <w:lang w:val="en-US"/>
+        </w:rPr>
+        <w:t>GestorMedicinas</w:t>
+      </w:r>
+      <w:proofErr w:type="spellEnd"/>
+      <w:r>
+        <w:rPr>
+          <w:lang w:val="en-US"/>
+        </w:rPr>
+        <w:t>(</w:t>
+      </w:r>
+      <w:proofErr w:type="gramEnd"/>
+      <w:r>
+        <w:rPr>
+          <w:lang w:val="en-US"/>
+        </w:rPr>
+        <w:t>)</w:t>
       </w:r>
     </w:p>
     <w:p>
@@ -1980,7 +2593,23 @@
         <w:rPr>
           <w:lang w:val="en-US"/>
         </w:rPr>
-        <w:t xml:space="preserve">    if request.method == "POST":</w:t>
+        <w:t xml:space="preserve">    if </w:t>
+      </w:r>
+      <w:proofErr w:type="spellStart"/>
+      <w:proofErr w:type="gramStart"/>
+      <w:r>
+        <w:rPr>
+          <w:lang w:val="en-US"/>
+        </w:rPr>
+        <w:t>request.method</w:t>
+      </w:r>
+      <w:proofErr w:type="spellEnd"/>
+      <w:proofErr w:type="gramEnd"/>
+      <w:r>
+        <w:rPr>
+          <w:lang w:val="en-US"/>
+        </w:rPr>
+        <w:t xml:space="preserve"> == "POST":</w:t>
       </w:r>
     </w:p>
     <w:p>
@@ -2000,7 +2629,15 @@
         <w:t xml:space="preserve">        </w:t>
       </w:r>
       <w:r>
-        <w:t>nombre = request.POST.get("nombre")</w:t>
+        <w:t xml:space="preserve">nombre = </w:t>
+      </w:r>
+      <w:proofErr w:type="spellStart"/>
+      <w:r>
+        <w:t>request.POST.get</w:t>
+      </w:r>
+      <w:proofErr w:type="spellEnd"/>
+      <w:r>
+        <w:t>("nombre")</w:t>
       </w:r>
     </w:p>
     <w:p>
@@ -2014,7 +2651,31 @@
         </w:rPr>
       </w:pPr>
       <w:r>
-        <w:t xml:space="preserve">        principio_activo = request.POST.get("principio_activo")</w:t>
+        <w:t xml:space="preserve">        </w:t>
+      </w:r>
+      <w:proofErr w:type="spellStart"/>
+      <w:r>
+        <w:t>principio_activo</w:t>
+      </w:r>
+      <w:proofErr w:type="spellEnd"/>
+      <w:r>
+        <w:t xml:space="preserve"> = </w:t>
+      </w:r>
+      <w:proofErr w:type="spellStart"/>
+      <w:r>
+        <w:t>request.POST.get</w:t>
+      </w:r>
+      <w:proofErr w:type="spellEnd"/>
+      <w:r>
+        <w:t>("</w:t>
+      </w:r>
+      <w:proofErr w:type="spellStart"/>
+      <w:r>
+        <w:t>principio_activo</w:t>
+      </w:r>
+      <w:proofErr w:type="spellEnd"/>
+      <w:r>
+        <w:t>")</w:t>
       </w:r>
     </w:p>
     <w:p>
@@ -2028,7 +2689,31 @@
         </w:rPr>
       </w:pPr>
       <w:r>
-        <w:t xml:space="preserve">        concentracion = request.POST.get("concentracion")</w:t>
+        <w:t xml:space="preserve">        </w:t>
+      </w:r>
+      <w:proofErr w:type="spellStart"/>
+      <w:r>
+        <w:t>concentracion</w:t>
+      </w:r>
+      <w:proofErr w:type="spellEnd"/>
+      <w:r>
+        <w:t xml:space="preserve"> = </w:t>
+      </w:r>
+      <w:proofErr w:type="spellStart"/>
+      <w:r>
+        <w:t>request.POST.get</w:t>
+      </w:r>
+      <w:proofErr w:type="spellEnd"/>
+      <w:r>
+        <w:t>("</w:t>
+      </w:r>
+      <w:proofErr w:type="spellStart"/>
+      <w:r>
+        <w:t>concentracion</w:t>
+      </w:r>
+      <w:proofErr w:type="spellEnd"/>
+      <w:r>
+        <w:t>")</w:t>
       </w:r>
     </w:p>
     <w:p>
@@ -2047,7 +2732,15 @@
         </w:rPr>
       </w:pPr>
       <w:r>
-        <w:t xml:space="preserve">        nueva_medicina = {</w:t>
+        <w:t xml:space="preserve">        </w:t>
+      </w:r>
+      <w:proofErr w:type="spellStart"/>
+      <w:r>
+        <w:t>nueva_medicina</w:t>
+      </w:r>
+      <w:proofErr w:type="spellEnd"/>
+      <w:r>
+        <w:t xml:space="preserve"> = {</w:t>
       </w:r>
     </w:p>
     <w:p>
@@ -2075,7 +2768,23 @@
         </w:rPr>
       </w:pPr>
       <w:r>
-        <w:t xml:space="preserve">            "principio_activo": principio_activo,</w:t>
+        <w:t xml:space="preserve">            "</w:t>
+      </w:r>
+      <w:proofErr w:type="spellStart"/>
+      <w:r>
+        <w:t>principio_activo</w:t>
+      </w:r>
+      <w:proofErr w:type="spellEnd"/>
+      <w:r>
+        <w:t xml:space="preserve">": </w:t>
+      </w:r>
+      <w:proofErr w:type="spellStart"/>
+      <w:r>
+        <w:t>principio_activo</w:t>
+      </w:r>
+      <w:proofErr w:type="spellEnd"/>
+      <w:r>
+        <w:t>,</w:t>
       </w:r>
     </w:p>
     <w:p>
@@ -2089,7 +2798,23 @@
         </w:rPr>
       </w:pPr>
       <w:r>
-        <w:t xml:space="preserve">            "concentracion": concentracion,</w:t>
+        <w:t xml:space="preserve">            "</w:t>
+      </w:r>
+      <w:proofErr w:type="spellStart"/>
+      <w:r>
+        <w:t>concentracion</w:t>
+      </w:r>
+      <w:proofErr w:type="spellEnd"/>
+      <w:r>
+        <w:t xml:space="preserve">": </w:t>
+      </w:r>
+      <w:proofErr w:type="spellStart"/>
+      <w:r>
+        <w:t>concentracion</w:t>
+      </w:r>
+      <w:proofErr w:type="spellEnd"/>
+      <w:r>
+        <w:t>,</w:t>
       </w:r>
     </w:p>
     <w:p>
@@ -2122,7 +2847,28 @@
         </w:rPr>
       </w:pPr>
       <w:r>
-        <w:t xml:space="preserve">        gestor.agregar_medicina(nueva_medicina)</w:t>
+        <w:t xml:space="preserve">        </w:t>
+      </w:r>
+      <w:proofErr w:type="spellStart"/>
+      <w:proofErr w:type="gramStart"/>
+      <w:r>
+        <w:t>gestor.agregar</w:t>
+      </w:r>
+      <w:proofErr w:type="gramEnd"/>
+      <w:r>
+        <w:t>_medicina</w:t>
+      </w:r>
+      <w:proofErr w:type="spellEnd"/>
+      <w:r>
+        <w:t>(</w:t>
+      </w:r>
+      <w:proofErr w:type="spellStart"/>
+      <w:r>
+        <w:t>nueva_medicina</w:t>
+      </w:r>
+      <w:proofErr w:type="spellEnd"/>
+      <w:r>
+        <w:t>)</w:t>
       </w:r>
     </w:p>
     <w:p>
@@ -2136,7 +2882,23 @@
         </w:rPr>
       </w:pPr>
       <w:r>
-        <w:t xml:space="preserve">        return redirect("medicinas") </w:t>
+        <w:t xml:space="preserve">        </w:t>
+      </w:r>
+      <w:proofErr w:type="spellStart"/>
+      <w:r>
+        <w:t>return</w:t>
+      </w:r>
+      <w:proofErr w:type="spellEnd"/>
+      <w:r>
+        <w:t xml:space="preserve"> </w:t>
+      </w:r>
+      <w:proofErr w:type="spellStart"/>
+      <w:r>
+        <w:t>redirect</w:t>
+      </w:r>
+      <w:proofErr w:type="spellEnd"/>
+      <w:r>
+        <w:t xml:space="preserve">("medicinas") </w:t>
       </w:r>
     </w:p>
     <w:p>
@@ -2155,7 +2917,36 @@
         </w:rPr>
       </w:pPr>
       <w:r>
-        <w:t xml:space="preserve">    lista_medicinas = gestor.obtener_medicinas()</w:t>
+        <w:t xml:space="preserve">    </w:t>
+      </w:r>
+      <w:proofErr w:type="spellStart"/>
+      <w:r>
+        <w:t>lista_medicinas</w:t>
+      </w:r>
+      <w:proofErr w:type="spellEnd"/>
+      <w:r>
+        <w:t xml:space="preserve"> = </w:t>
+      </w:r>
+      <w:proofErr w:type="spellStart"/>
+      <w:proofErr w:type="gramStart"/>
+      <w:r>
+        <w:t>gestor.obtener</w:t>
+      </w:r>
+      <w:proofErr w:type="gramEnd"/>
+      <w:r>
+        <w:t>_</w:t>
+      </w:r>
+      <w:proofErr w:type="gramStart"/>
+      <w:r>
+        <w:t>medicinas</w:t>
+      </w:r>
+      <w:proofErr w:type="spellEnd"/>
+      <w:r>
+        <w:t>(</w:t>
+      </w:r>
+      <w:proofErr w:type="gramEnd"/>
+      <w:r>
+        <w:t>)</w:t>
       </w:r>
     </w:p>
     <w:p>
@@ -2169,23 +2960,56 @@
         </w:rPr>
       </w:pPr>
       <w:r>
-        <w:t xml:space="preserve">    return render(request, "medicinas.html", {"medicinas": lista_medicinas})</w:t>
-      </w:r>
-    </w:p>
-    <w:p>
-      <w:pPr>
-        <w:spacing w:line="360" w:lineRule="auto"/>
-      </w:pPr>
-    </w:p>
-    <w:p>
-      <w:pPr>
-        <w:spacing w:line="360" w:lineRule="auto"/>
-        <w:rPr>
-          <w:rFonts w:eastAsiaTheme="minorEastAsia"/>
-        </w:rPr>
-      </w:pPr>
-      <w:r>
-        <w:t>El problema que teníamos En una página web normal, cada vez que una persona llena un formulario o recarga la página, el sistema vuelve a empezar de cero y "olvida" lo que se hizo antes. Si no usamos una base de datos para guardar la información, necesitábamos una forma de conservar los datos registrados durante la sesión sin que se borren a cada momento.</w:t>
+        <w:t xml:space="preserve">    </w:t>
+      </w:r>
+      <w:proofErr w:type="spellStart"/>
+      <w:r>
+        <w:t>return</w:t>
+      </w:r>
+      <w:proofErr w:type="spellEnd"/>
+      <w:r>
+        <w:t xml:space="preserve"> </w:t>
+      </w:r>
+      <w:proofErr w:type="gramStart"/>
+      <w:r>
+        <w:t>render(</w:t>
+      </w:r>
+      <w:proofErr w:type="spellStart"/>
+      <w:proofErr w:type="gramEnd"/>
+      <w:r>
+        <w:t>request</w:t>
+      </w:r>
+      <w:proofErr w:type="spellEnd"/>
+      <w:r>
+        <w:t xml:space="preserve">, "medicinas.html", {"medicinas": </w:t>
+      </w:r>
+      <w:proofErr w:type="spellStart"/>
+      <w:r>
+        <w:t>lista_medicinas</w:t>
+      </w:r>
+      <w:proofErr w:type="spellEnd"/>
+      <w:r>
+        <w:t>})</w:t>
+      </w:r>
+    </w:p>
+    <w:p>
+      <w:pPr>
+        <w:spacing w:line="360" w:lineRule="auto"/>
+      </w:pPr>
+    </w:p>
+    <w:p>
+      <w:pPr>
+        <w:spacing w:line="360" w:lineRule="auto"/>
+        <w:rPr>
+          <w:rFonts w:eastAsiaTheme="minorEastAsia"/>
+        </w:rPr>
+      </w:pPr>
+      <w:r>
+        <w:t xml:space="preserve">El problema que teníamos En una página web normal, cada vez que una persona llena un formulario o recarga la página, el sistema vuelve a empezar de cero y "olvida" lo que se hizo antes. Si no usamos una base de datos para guardar la </w:t>
+      </w:r>
+      <w:r>
+        <w:lastRenderedPageBreak/>
+        <w:t>información, necesitábamos una forma de conservar los datos registrados durante la sesión sin que se borren a cada momento.</w:t>
       </w:r>
     </w:p>
     <w:p>
@@ -2215,7 +3039,6 @@
         </w:rPr>
       </w:pPr>
       <w:r>
-        <w:lastRenderedPageBreak/>
         <w:t>Cada vez que alguien entra a la oficina a registrar un medicamento o a consultar la lista, no se le entrega una libreta nueva en blanco; siempre se le pasa el mismo cuaderno de siempre.</w:t>
       </w:r>
     </w:p>
@@ -2278,28 +3101,57 @@
     </w:p>
     <w:p>
       <w:pPr>
-        <w:pStyle w:val="Heading3"/>
-      </w:pPr>
-      <w:bookmarkStart w:id="7" w:name="_Toc305068199"/>
-      <w:r>
-        <w:rPr>
+        <w:pStyle w:val="Ttulo3"/>
+        <w:rPr>
+          <w:sz w:val="24"/>
+          <w:szCs w:val="24"/>
+        </w:rPr>
+      </w:pPr>
+      <w:bookmarkStart w:id="7" w:name="_Toc239585022"/>
+      <w:r>
+        <w:rPr>
+          <w:rStyle w:val="Ttulo5Car"/>
           <w:color w:val="000000" w:themeColor="text1"/>
           <w:lang w:val="es-CO"/>
         </w:rPr>
-        <w:t>Video del funcionamiento con singleton:</w:t>
-      </w:r>
-      <w:bookmarkEnd w:id="7"/>
-      <w:r>
+        <w:t xml:space="preserve">Video del funcionamiento con </w:t>
+      </w:r>
+      <w:proofErr w:type="spellStart"/>
+      <w:r>
+        <w:rPr>
+          <w:rStyle w:val="Ttulo5Car"/>
+          <w:color w:val="000000" w:themeColor="text1"/>
+          <w:lang w:val="es-CO"/>
+        </w:rPr>
+        <w:t>singleton</w:t>
+      </w:r>
+      <w:proofErr w:type="spellEnd"/>
+      <w:r>
+        <w:rPr>
+          <w:rStyle w:val="Ttulo5Car"/>
+          <w:color w:val="000000" w:themeColor="text1"/>
+          <w:lang w:val="es-CO"/>
+        </w:rPr>
+        <w:t>:</w:t>
+      </w:r>
+      <w:r>
+        <w:rPr>
+          <w:sz w:val="24"/>
+          <w:szCs w:val="24"/>
+        </w:rPr>
         <w:br/>
       </w:r>
       <w:hyperlink r:id="rId6">
         <w:r>
           <w:rPr>
-            <w:rStyle w:val="Hyperlink"/>
+            <w:rStyle w:val="Hipervnculo"/>
+            <w:sz w:val="24"/>
+            <w:szCs w:val="24"/>
             <w:lang w:val="es-CO"/>
           </w:rPr>
           <w:t>https://drive.google.com/file/d/1Vcs1NugwN_qMAXG4sOCP-Qemlg0jtC8I/view?usp=sharing</w:t>
         </w:r>
+        <w:bookmarkEnd w:id="7"/>
       </w:hyperlink>
     </w:p>
     <w:p>
@@ -2318,359 +3170,1156 @@
     </w:p>
     <w:p>
       <w:pPr>
-        <w:pStyle w:val="Heading3"/>
+        <w:pStyle w:val="Ttulo3"/>
         <w:jc w:val="center"/>
         <w:rPr>
+          <w:color w:val="000000" w:themeColor="text1"/>
+        </w:rPr>
+      </w:pPr>
+      <w:bookmarkStart w:id="8" w:name="_Toc239585023"/>
+      <w:r>
+        <w:rPr>
+          <w:color w:val="000000" w:themeColor="text1"/>
+        </w:rPr>
+        <w:lastRenderedPageBreak/>
+        <w:t>Semana 4</w:t>
+      </w:r>
+      <w:bookmarkEnd w:id="8"/>
+    </w:p>
+    <w:p>
+      <w:pPr>
+        <w:spacing w:line="360" w:lineRule="auto"/>
+        <w:rPr>
+          <w:rFonts w:cstheme="minorHAnsi"/>
           <w:b/>
           <w:bCs/>
-          <w:color w:val="auto"/>
-        </w:rPr>
-      </w:pPr>
-      <w:r>
-        <w:rPr>
+          <w:lang w:val="es-CO"/>
+        </w:rPr>
+      </w:pPr>
+      <w:r>
+        <w:rPr>
+          <w:rFonts w:cstheme="minorHAnsi"/>
           <w:b/>
           <w:bCs/>
-          <w:color w:val="auto"/>
-        </w:rPr>
-        <w:lastRenderedPageBreak/>
-        <w:t>Semana 4</w:t>
-      </w:r>
-    </w:p>
-    <w:p>
-      <w:pPr>
-        <w:pStyle w:val="Heading3"/>
-        <w:rPr>
-          <w:color w:val="auto"/>
-          <w:lang w:val="es-CO"/>
-        </w:rPr>
-      </w:pPr>
-      <w:r>
-        <w:rPr>
-          <w:color w:val="auto"/>
-          <w:lang w:val="es-CO"/>
-        </w:rPr>
-        <w:t>En la plataforma de telemedicina no todos los pacientes son iguales. Hay dos tipos:</w:t>
-      </w:r>
-    </w:p>
-    <w:p>
-      <w:pPr>
-        <w:pStyle w:val="Heading3"/>
-        <w:numPr>
-          <w:ilvl w:val="0"/>
-          <w:numId w:val="6"/>
-        </w:numPr>
-        <w:rPr>
-          <w:color w:val="auto"/>
-          <w:lang w:val="es-CO"/>
-        </w:rPr>
-      </w:pPr>
-      <w:r>
-        <w:rPr>
+          <w:lang w:val="es-CO"/>
+        </w:rPr>
+        <w:t>Implementación del patrón Factory Method</w:t>
+      </w:r>
+    </w:p>
+    <w:p>
+      <w:pPr>
+        <w:spacing w:line="360" w:lineRule="auto"/>
+        <w:rPr>
+          <w:rFonts w:cstheme="minorHAnsi"/>
+          <w:lang w:val="es-CO"/>
+        </w:rPr>
+      </w:pPr>
+      <w:r>
+        <w:rPr>
+          <w:rFonts w:cstheme="minorHAnsi"/>
+          <w:lang w:val="es-CO"/>
+        </w:rPr>
+        <w:t>Con el</w:t>
+      </w:r>
+      <w:r>
+        <w:rPr>
+          <w:rFonts w:cstheme="minorHAnsi"/>
+          <w:lang w:val="es-CO"/>
+        </w:rPr>
+        <w:t xml:space="preserve"> patrón de diseño </w:t>
+      </w:r>
+      <w:r>
+        <w:rPr>
+          <w:rFonts w:cstheme="minorHAnsi"/>
           <w:b/>
           <w:bCs/>
-          <w:color w:val="auto"/>
-          <w:lang w:val="es-CO"/>
-        </w:rPr>
-        <w:t>Pacientes presenciales</w:t>
-      </w:r>
-      <w:r>
-        <w:rPr>
-          <w:color w:val="auto"/>
-          <w:lang w:val="es-CO"/>
-        </w:rPr>
-        <w:t>: van físicamente a la clínica.</w:t>
-      </w:r>
-    </w:p>
-    <w:p>
-      <w:pPr>
-        <w:pStyle w:val="Heading3"/>
-        <w:numPr>
-          <w:ilvl w:val="0"/>
-          <w:numId w:val="6"/>
-        </w:numPr>
-        <w:rPr>
-          <w:color w:val="auto"/>
-          <w:lang w:val="es-CO"/>
-        </w:rPr>
-      </w:pPr>
-      <w:r>
-        <w:rPr>
+          <w:lang w:val="es-CO"/>
+        </w:rPr>
+        <w:t>Factory Method</w:t>
+      </w:r>
+      <w:r>
+        <w:rPr>
+          <w:rFonts w:cstheme="minorHAnsi"/>
+          <w:lang w:val="es-CO"/>
+        </w:rPr>
+        <w:t xml:space="preserve"> en nuestra plataforma de telemedicina</w:t>
+      </w:r>
+      <w:r>
+        <w:rPr>
+          <w:rFonts w:cstheme="minorHAnsi"/>
+          <w:lang w:val="es-CO"/>
+        </w:rPr>
+        <w:t>,</w:t>
+      </w:r>
+      <w:r>
+        <w:rPr>
+          <w:rFonts w:cstheme="minorHAnsi"/>
+          <w:lang w:val="es-CO"/>
+        </w:rPr>
+        <w:t xml:space="preserve"> principal</w:t>
+      </w:r>
+      <w:r>
+        <w:rPr>
+          <w:rFonts w:cstheme="minorHAnsi"/>
+          <w:lang w:val="es-CO"/>
+        </w:rPr>
+        <w:t>mente buscamos</w:t>
+      </w:r>
+      <w:r>
+        <w:rPr>
+          <w:rFonts w:cstheme="minorHAnsi"/>
+          <w:lang w:val="es-CO"/>
+        </w:rPr>
+        <w:t xml:space="preserve"> que la plataforma pueda registrar diferentes tipos de pacientes dependiendo de la forma en que van a recibir su atención médica.</w:t>
+      </w:r>
+    </w:p>
+    <w:p>
+      <w:pPr>
+        <w:spacing w:line="360" w:lineRule="auto"/>
+        <w:rPr>
+          <w:rFonts w:cstheme="minorHAnsi"/>
+          <w:lang w:val="es-CO"/>
+        </w:rPr>
+      </w:pPr>
+      <w:r>
+        <w:rPr>
+          <w:rFonts w:cstheme="minorHAnsi"/>
+          <w:lang w:val="es-CO"/>
+        </w:rPr>
+        <w:t>En nuestra plataforma tenemos principalmente dos tipos de pacientes:</w:t>
+      </w:r>
+    </w:p>
+    <w:p>
+      <w:pPr>
+        <w:spacing w:line="360" w:lineRule="auto"/>
+        <w:rPr>
+          <w:rFonts w:cstheme="minorHAnsi"/>
+          <w:lang w:val="es-CO"/>
+        </w:rPr>
+      </w:pPr>
+      <w:r>
+        <w:rPr>
+          <w:rFonts w:cstheme="minorHAnsi"/>
           <w:b/>
           <w:bCs/>
-          <w:color w:val="auto"/>
-          <w:lang w:val="es-CO"/>
-        </w:rPr>
-        <w:t>Pacientes virtuales</w:t>
-      </w:r>
-      <w:r>
-        <w:rPr>
-          <w:color w:val="auto"/>
-          <w:lang w:val="es-CO"/>
-        </w:rPr>
-        <w:t>: se atienden por videollamada.</w:t>
-      </w:r>
-    </w:p>
-    <w:p>
-      <w:pPr>
-        <w:pStyle w:val="Heading3"/>
-        <w:rPr>
-          <w:color w:val="auto"/>
-          <w:lang w:val="es-CO"/>
-        </w:rPr>
-      </w:pPr>
-      <w:r>
-        <w:rPr>
-          <w:color w:val="auto"/>
-          <w:lang w:val="es-CO"/>
-        </w:rPr>
-        <w:t xml:space="preserve">Cada uno necesita datos distintos. Por ejemplo, un paciente virtual </w:t>
-      </w:r>
-      <w:r>
-        <w:rPr>
+          <w:lang w:val="es-CO"/>
+        </w:rPr>
+        <w:t>Paciente presencial:</w:t>
+      </w:r>
+      <w:r>
+        <w:rPr>
+          <w:rFonts w:cstheme="minorHAnsi"/>
+          <w:lang w:val="es-CO"/>
+        </w:rPr>
+        <w:t xml:space="preserve"> es el paciente que debe asistir físicamente a la clínica para recibir su atención.</w:t>
+      </w:r>
+    </w:p>
+    <w:p>
+      <w:pPr>
+        <w:spacing w:line="360" w:lineRule="auto"/>
+        <w:rPr>
+          <w:rFonts w:cstheme="minorHAnsi"/>
+          <w:lang w:val="es-CO"/>
+        </w:rPr>
+      </w:pPr>
+      <w:r>
+        <w:rPr>
+          <w:rFonts w:cstheme="minorHAnsi"/>
           <w:b/>
           <w:bCs/>
-          <w:color w:val="auto"/>
-          <w:lang w:val="es-CO"/>
-        </w:rPr>
-        <w:t>obligatoriamente</w:t>
-      </w:r>
-      <w:r>
-        <w:rPr>
-          <w:color w:val="auto"/>
-          <w:lang w:val="es-CO"/>
-        </w:rPr>
-        <w:t xml:space="preserve"> necesita un correo electrónico (porque ahí le llega el enlace de la videollamada), mientras que uno presencial no lo necesita.</w:t>
-      </w:r>
-    </w:p>
-    <w:p>
-      <w:pPr>
-        <w:pStyle w:val="Heading3"/>
-        <w:rPr>
-          <w:color w:val="auto"/>
-          <w:lang w:val="es-CO"/>
-        </w:rPr>
-      </w:pPr>
-      <w:r>
-        <w:rPr>
+          <w:lang w:val="es-CO"/>
+        </w:rPr>
+        <w:t>Paciente virtual:</w:t>
+      </w:r>
+      <w:r>
+        <w:rPr>
+          <w:rFonts w:cstheme="minorHAnsi"/>
+          <w:lang w:val="es-CO"/>
+        </w:rPr>
+        <w:t xml:space="preserve"> es el paciente que recibe la atención por medio de una videollamada.</w:t>
+      </w:r>
+    </w:p>
+    <w:p>
+      <w:pPr>
+        <w:spacing w:line="360" w:lineRule="auto"/>
+        <w:rPr>
+          <w:rFonts w:cstheme="minorHAnsi"/>
+          <w:lang w:val="es-CO"/>
+        </w:rPr>
+      </w:pPr>
+      <w:r>
+        <w:rPr>
+          <w:rFonts w:cstheme="minorHAnsi"/>
+          <w:lang w:val="es-CO"/>
+        </w:rPr>
+        <w:t>Aunque los dos son pacientes de la plataforma, no necesitan exactamente la misma información. Por ejemplo, el paciente virtual necesita tener un correo electrónico, ya que por este medio se le puede enviar el enlace para realizar la videollamada. En cambio, para un paciente presencial este dato no es obligatorio para poder recibir su atención.</w:t>
+      </w:r>
+    </w:p>
+    <w:p>
+      <w:pPr>
+        <w:spacing w:line="360" w:lineRule="auto"/>
+        <w:rPr>
+          <w:rFonts w:cstheme="minorHAnsi"/>
           <w:b/>
           <w:bCs/>
-          <w:color w:val="auto"/>
-          <w:lang w:val="es-CO"/>
-        </w:rPr>
-        <w:t>El problema sin este patrón:</w:t>
-      </w:r>
-      <w:r>
-        <w:rPr>
-          <w:color w:val="auto"/>
-          <w:lang w:val="es-CO"/>
-        </w:rPr>
-        <w:br/>
-        <w:t xml:space="preserve">Si todo el proceso de "crear un paciente" estuviera mezclado en un solo lugar, el código tendría que preguntar constantemente: </w:t>
-      </w:r>
-      <w:r>
-        <w:rPr>
-          <w:i/>
-          <w:iCs/>
-          <w:color w:val="auto"/>
-          <w:lang w:val="es-CO"/>
-        </w:rPr>
-        <w:t>"¿este paciente es presencial o virtual? Si es virtual, hacer esto... si es presencial, hacer esto otro..."</w:t>
-      </w:r>
-      <w:r>
-        <w:rPr>
-          <w:color w:val="auto"/>
-          <w:lang w:val="es-CO"/>
-        </w:rPr>
-        <w:t xml:space="preserve"> Esto se vuelve complicado y difícil de mantener a medida que el sistema crece (por ejemplo, si el día de mañana agregamos un tercer tipo de paciente, como "paciente de urgencias").</w:t>
-      </w:r>
-    </w:p>
-    <w:p>
-      <w:pPr>
-        <w:pStyle w:val="Heading3"/>
-        <w:rPr>
-          <w:color w:val="auto"/>
-          <w:lang w:val="es-CO"/>
-        </w:rPr>
-      </w:pPr>
-      <w:r>
-        <w:rPr>
+          <w:lang w:val="es-CO"/>
+        </w:rPr>
+      </w:pPr>
+      <w:r>
+        <w:rPr>
+          <w:rFonts w:cstheme="minorHAnsi"/>
           <w:b/>
           <w:bCs/>
-          <w:color w:val="auto"/>
-          <w:lang w:val="es-CO"/>
-        </w:rPr>
-        <w:t>La solución con Factory Method:</w:t>
-      </w:r>
-      <w:r>
-        <w:rPr>
-          <w:color w:val="auto"/>
-          <w:lang w:val="es-CO"/>
-        </w:rPr>
-        <w:br/>
-        <w:t xml:space="preserve">En lugar de mezclar todo, creamos "fábricas" separadas: una fábrica sabe cómo crear pacientes presenciales, y otra sabe cómo crear pacientes virtuales. Cuando el sistema necesita registrar un paciente, simplemente le dice a la fábrica correcta: </w:t>
-      </w:r>
-      <w:r>
-        <w:rPr>
-          <w:i/>
-          <w:iCs/>
-          <w:color w:val="auto"/>
-          <w:lang w:val="es-CO"/>
-        </w:rPr>
-        <w:t>"crea uno de este tipo"</w:t>
-      </w:r>
-      <w:r>
-        <w:rPr>
-          <w:color w:val="auto"/>
-          <w:lang w:val="es-CO"/>
-        </w:rPr>
-        <w:t>, y ella se encarga de aplicar las reglas necesarias (como exigir el correo si es virtual).</w:t>
-      </w:r>
-    </w:p>
-    <w:p>
-      <w:pPr>
-        <w:pStyle w:val="Heading3"/>
-        <w:rPr>
-          <w:color w:val="auto"/>
-          <w:lang w:val="en-US"/>
-        </w:rPr>
-      </w:pPr>
-      <w:r>
-        <w:rPr>
+          <w:lang w:val="es-CO"/>
+        </w:rPr>
+        <w:t>¿Cuál era el problema?</w:t>
+      </w:r>
+    </w:p>
+    <w:p>
+      <w:pPr>
+        <w:spacing w:line="360" w:lineRule="auto"/>
+        <w:rPr>
+          <w:rFonts w:cstheme="minorHAnsi"/>
+          <w:lang w:val="es-CO"/>
+        </w:rPr>
+      </w:pPr>
+      <w:r>
+        <w:rPr>
+          <w:rFonts w:cstheme="minorHAnsi"/>
+          <w:lang w:val="es-CO"/>
+        </w:rPr>
+        <w:t>Si todos los tipos de pacientes se crearan de la misma manera, el sistema tendría que estar preguntando constantemente qué tipo de paciente se quiere registrar y qué información necesita cada uno.</w:t>
+      </w:r>
+    </w:p>
+    <w:p>
+      <w:pPr>
+        <w:spacing w:line="360" w:lineRule="auto"/>
+        <w:rPr>
+          <w:rFonts w:cstheme="minorHAnsi"/>
+          <w:lang w:val="es-CO"/>
+        </w:rPr>
+      </w:pPr>
+      <w:r>
+        <w:rPr>
+          <w:rFonts w:cstheme="minorHAnsi"/>
+          <w:lang w:val="es-CO"/>
+        </w:rPr>
+        <w:t>Por ejemplo, tendría que hacer preguntas como:</w:t>
+      </w:r>
+    </w:p>
+    <w:p>
+      <w:pPr>
+        <w:spacing w:line="360" w:lineRule="auto"/>
+        <w:rPr>
+          <w:rFonts w:cstheme="minorHAnsi"/>
+          <w:lang w:val="es-CO"/>
+        </w:rPr>
+      </w:pPr>
+      <w:r>
+        <w:rPr>
+          <w:rFonts w:cstheme="minorHAnsi"/>
           <w:b/>
           <w:bCs/>
-          <w:color w:val="auto"/>
-          <w:lang w:val="en-US"/>
-        </w:rPr>
-        <w:t>Beneficios de usarlo:</w:t>
-      </w:r>
-    </w:p>
-    <w:p>
-      <w:pPr>
-        <w:pStyle w:val="Heading3"/>
-        <w:numPr>
-          <w:ilvl w:val="0"/>
-          <w:numId w:val="7"/>
-        </w:numPr>
-        <w:rPr>
-          <w:color w:val="auto"/>
-          <w:lang w:val="es-CO"/>
-        </w:rPr>
-      </w:pPr>
-      <w:r>
-        <w:rPr>
-          <w:color w:val="auto"/>
-          <w:lang w:val="es-CO"/>
-        </w:rPr>
-        <w:t>El código queda más ordenado y fácil de entender.</w:t>
-      </w:r>
-    </w:p>
-    <w:p>
-      <w:pPr>
-        <w:pStyle w:val="Heading3"/>
-        <w:numPr>
-          <w:ilvl w:val="0"/>
-          <w:numId w:val="7"/>
-        </w:numPr>
-        <w:rPr>
-          <w:color w:val="auto"/>
-          <w:lang w:val="es-CO"/>
-        </w:rPr>
-      </w:pPr>
-      <w:r>
-        <w:rPr>
-          <w:color w:val="auto"/>
-          <w:lang w:val="es-CO"/>
-        </w:rPr>
-        <w:t>Si en el futuro se necesita agregar un nuevo tipo de paciente, no hay que modificar lo que ya funciona: solo se agrega una fábrica nueva.</w:t>
-      </w:r>
-    </w:p>
-    <w:p>
-      <w:pPr>
-        <w:pStyle w:val="Heading3"/>
-        <w:numPr>
-          <w:ilvl w:val="0"/>
-          <w:numId w:val="7"/>
-        </w:numPr>
-        <w:rPr>
-          <w:color w:val="auto"/>
-          <w:lang w:val="es-CO"/>
-        </w:rPr>
-      </w:pPr>
-      <w:r>
-        <w:rPr>
-          <w:color w:val="auto"/>
-          <w:lang w:val="es-CO"/>
-        </w:rPr>
-        <w:t>Cada tipo de paciente tiene sus propias reglas claras, sin mezclarse con las de los demás.</w:t>
-      </w:r>
-    </w:p>
-    <w:p>
-      <w:pPr>
-        <w:pStyle w:val="Heading3"/>
-        <w:numPr>
-          <w:ilvl w:val="0"/>
-          <w:numId w:val="7"/>
-        </w:numPr>
-        <w:rPr>
-          <w:color w:val="auto"/>
-          <w:lang w:val="es-CO"/>
-        </w:rPr>
-      </w:pPr>
-      <w:r>
-        <w:rPr>
-          <w:color w:val="auto"/>
-          <w:lang w:val="es-CO"/>
-        </w:rPr>
-        <w:t>Se reducen los errores, porque cada fábrica se encarga solo de su tipo de paciente y sabe exactamente qué necesita validar.</w:t>
-      </w:r>
-    </w:p>
-    <w:p>
-      <w:pPr>
-        <w:pStyle w:val="Heading3"/>
-        <w:rPr>
-          <w:color w:val="auto"/>
-          <w:lang w:val="es-CO"/>
-        </w:rPr>
-      </w:pPr>
-      <w:r>
-        <w:rPr>
+          <w:lang w:val="es-CO"/>
+        </w:rPr>
+        <w:t>¿El paciente es presencial?</w:t>
+      </w:r>
+    </w:p>
+    <w:p>
+      <w:pPr>
+        <w:spacing w:line="360" w:lineRule="auto"/>
+        <w:rPr>
+          <w:rFonts w:cstheme="minorHAnsi"/>
+          <w:lang w:val="es-CO"/>
+        </w:rPr>
+      </w:pPr>
+      <w:r>
+        <w:rPr>
+          <w:rFonts w:cstheme="minorHAnsi"/>
+          <w:lang w:val="es-CO"/>
+        </w:rPr>
+        <w:t>Si la respuesta es sí, se registran los datos correspondientes.</w:t>
+      </w:r>
+    </w:p>
+    <w:p>
+      <w:pPr>
+        <w:spacing w:line="360" w:lineRule="auto"/>
+        <w:rPr>
+          <w:rFonts w:cstheme="minorHAnsi"/>
+          <w:lang w:val="es-CO"/>
+        </w:rPr>
+      </w:pPr>
+      <w:r>
+        <w:rPr>
+          <w:rFonts w:cstheme="minorHAnsi"/>
           <w:b/>
           <w:bCs/>
-          <w:color w:val="auto"/>
+          <w:lang w:val="es-CO"/>
+        </w:rPr>
+        <w:t>¿El paciente es virtual?</w:t>
+      </w:r>
+    </w:p>
+    <w:p>
+      <w:pPr>
+        <w:spacing w:line="360" w:lineRule="auto"/>
+        <w:rPr>
+          <w:rFonts w:cstheme="minorHAnsi"/>
+          <w:lang w:val="es-CO"/>
+        </w:rPr>
+      </w:pPr>
+      <w:r>
+        <w:rPr>
+          <w:rFonts w:cstheme="minorHAnsi"/>
+          <w:lang w:val="es-CO"/>
+        </w:rPr>
+        <w:t>Si la respuesta es sí, además de los datos básicos se debe solicitar el correo electrónico para poder realizar la videollamada.</w:t>
+      </w:r>
+    </w:p>
+    <w:p>
+      <w:pPr>
+        <w:spacing w:line="360" w:lineRule="auto"/>
+        <w:rPr>
+          <w:rFonts w:cstheme="minorHAnsi"/>
+          <w:lang w:val="es-CO"/>
+        </w:rPr>
+      </w:pPr>
+      <w:r>
+        <w:rPr>
+          <w:rFonts w:cstheme="minorHAnsi"/>
+          <w:lang w:val="es-CO"/>
+        </w:rPr>
+        <w:t>A medida que la plataforma crezca, este proceso podría volverse más complicado, especialmente si en el futuro queremos agregar otros tipos de atención, como pacientes de urgencias.</w:t>
+      </w:r>
+    </w:p>
+    <w:p>
+      <w:pPr>
+        <w:spacing w:line="360" w:lineRule="auto"/>
+        <w:rPr>
+          <w:rFonts w:cstheme="minorHAnsi"/>
+          <w:b/>
+          <w:bCs/>
+          <w:lang w:val="es-CO"/>
+        </w:rPr>
+      </w:pPr>
+      <w:r>
+        <w:rPr>
+          <w:rFonts w:cstheme="minorHAnsi"/>
+          <w:b/>
+          <w:bCs/>
           <w:lang w:val="es-CO"/>
         </w:rPr>
         <w:lastRenderedPageBreak/>
-        <w:t>En resumen:</w:t>
-      </w:r>
-      <w:r>
-        <w:rPr>
-          <w:color w:val="auto"/>
-          <w:lang w:val="es-CO"/>
-        </w:rPr>
-        <w:br/>
-        <w:t>El Factory Method nos permite crear distintos tipos de pacientes de forma organizada, asegurando que cada uno tenga los datos correctos según su forma de atención, sin llenar el sistema de condiciones complicadas ("si es esto, haz esto; si es lo otro, haz lo otro").</w:t>
-      </w:r>
-    </w:p>
-    <w:p>
-      <w:pPr>
-        <w:pStyle w:val="Heading3"/>
-        <w:rPr>
-          <w:color w:val="auto"/>
-          <w:lang w:val="es-CO"/>
-        </w:rPr>
-      </w:pPr>
-    </w:p>
-    <w:p>
-      <w:pPr>
-        <w:pStyle w:val="Heading3"/>
-        <w:rPr>
-          <w:lang w:val="es-CO"/>
-        </w:rPr>
-      </w:pPr>
-    </w:p>
-    <w:p>
-      <w:pPr>
-        <w:spacing w:after="0" w:line="240" w:lineRule="auto"/>
+        <w:t>¿Cómo solucionamos este problema?</w:t>
+      </w:r>
+    </w:p>
+    <w:p>
+      <w:pPr>
+        <w:spacing w:line="360" w:lineRule="auto"/>
+        <w:rPr>
+          <w:rFonts w:cstheme="minorHAnsi"/>
+          <w:lang w:val="es-CO"/>
+        </w:rPr>
+      </w:pPr>
+      <w:r>
+        <w:rPr>
+          <w:rFonts w:cstheme="minorHAnsi"/>
+          <w:lang w:val="es-CO"/>
+        </w:rPr>
+        <w:t>Para solucionar esto utilizamos el patrón Factory Method.</w:t>
+      </w:r>
+    </w:p>
+    <w:p>
+      <w:pPr>
+        <w:spacing w:line="360" w:lineRule="auto"/>
+        <w:rPr>
+          <w:rFonts w:cstheme="minorHAnsi"/>
+          <w:lang w:val="es-CO"/>
+        </w:rPr>
+      </w:pPr>
+      <w:r>
+        <w:rPr>
+          <w:rFonts w:cstheme="minorHAnsi"/>
+          <w:lang w:val="es-CO"/>
+        </w:rPr>
+        <w:t>De una manera sencilla, podemos imaginar que nuestra plataforma tiene diferentes "fábricas". Cada fábrica sabe cómo crear un tipo específico de paciente y cuáles son los datos que necesita.</w:t>
+      </w:r>
+    </w:p>
+    <w:p>
+      <w:pPr>
+        <w:spacing w:line="360" w:lineRule="auto"/>
+        <w:rPr>
+          <w:rFonts w:cstheme="minorHAnsi"/>
+          <w:lang w:val="es-CO"/>
+        </w:rPr>
+      </w:pPr>
+      <w:r>
+        <w:rPr>
+          <w:rFonts w:cstheme="minorHAnsi"/>
+          <w:lang w:val="es-CO"/>
+        </w:rPr>
+        <w:t>Por ejemplo:</w:t>
+      </w:r>
+    </w:p>
+    <w:p>
+      <w:pPr>
+        <w:spacing w:line="360" w:lineRule="auto"/>
+        <w:rPr>
+          <w:rFonts w:cstheme="minorHAnsi"/>
+          <w:lang w:val="es-CO"/>
+        </w:rPr>
+      </w:pPr>
+      <w:r>
+        <w:rPr>
+          <w:rFonts w:cstheme="minorHAnsi"/>
+          <w:b/>
+          <w:bCs/>
+          <w:lang w:val="es-CO"/>
+        </w:rPr>
+        <w:t>Fábrica de pacientes presenciales → crea pacientes presenciales</w:t>
+      </w:r>
+    </w:p>
+    <w:p>
+      <w:pPr>
+        <w:spacing w:line="360" w:lineRule="auto"/>
+        <w:rPr>
+          <w:rFonts w:cstheme="minorHAnsi"/>
+          <w:lang w:val="es-CO"/>
+        </w:rPr>
+      </w:pPr>
+      <w:r>
+        <w:rPr>
+          <w:rFonts w:cstheme="minorHAnsi"/>
+          <w:b/>
+          <w:bCs/>
+          <w:lang w:val="es-CO"/>
+        </w:rPr>
+        <w:t>Fábrica de pacientes virtuales → crea pacientes virtuales</w:t>
+      </w:r>
+    </w:p>
+    <w:p>
+      <w:pPr>
+        <w:spacing w:line="360" w:lineRule="auto"/>
+        <w:rPr>
+          <w:rFonts w:cstheme="minorHAnsi"/>
+          <w:lang w:val="es-CO"/>
+        </w:rPr>
+      </w:pPr>
+      <w:r>
+        <w:rPr>
+          <w:rFonts w:cstheme="minorHAnsi"/>
+          <w:lang w:val="es-CO"/>
+        </w:rPr>
+        <w:t>De esta manera, cuando una persona se registra en la plataforma, el sistema utiliza la fábrica correspondiente y esta se encarga de crear el paciente de acuerdo con su tipo de atención.</w:t>
+      </w:r>
+    </w:p>
+    <w:p>
+      <w:pPr>
+        <w:spacing w:line="360" w:lineRule="auto"/>
+        <w:rPr>
+          <w:rFonts w:cstheme="minorHAnsi"/>
+          <w:b/>
+          <w:bCs/>
+          <w:lang w:val="es-CO"/>
+        </w:rPr>
+      </w:pPr>
+      <w:r>
+        <w:rPr>
+          <w:rFonts w:cstheme="minorHAnsi"/>
+          <w:b/>
+          <w:bCs/>
+          <w:lang w:val="es-CO"/>
+        </w:rPr>
+        <w:t>Ejemplo</w:t>
+      </w:r>
+      <w:r>
+        <w:rPr>
+          <w:rFonts w:cstheme="minorHAnsi"/>
+          <w:b/>
+          <w:bCs/>
+          <w:lang w:val="es-CO"/>
+        </w:rPr>
+        <w:t>:</w:t>
+      </w:r>
+    </w:p>
+    <w:p>
+      <w:pPr>
+        <w:spacing w:line="360" w:lineRule="auto"/>
+        <w:rPr>
+          <w:rFonts w:cstheme="minorHAnsi"/>
+          <w:lang w:val="es-CO"/>
+        </w:rPr>
+      </w:pPr>
+      <w:r>
+        <w:rPr>
+          <w:rFonts w:cstheme="minorHAnsi"/>
+          <w:lang w:val="es-CO"/>
+        </w:rPr>
+        <w:t>Supongamos que una persona quiere utilizar nuestra plataforma.</w:t>
+      </w:r>
+    </w:p>
+    <w:p>
+      <w:pPr>
+        <w:spacing w:line="360" w:lineRule="auto"/>
+        <w:rPr>
+          <w:rFonts w:cstheme="minorHAnsi"/>
+          <w:lang w:val="es-CO"/>
+        </w:rPr>
+      </w:pPr>
+      <w:r>
+        <w:rPr>
+          <w:rFonts w:cstheme="minorHAnsi"/>
+          <w:lang w:val="es-CO"/>
+        </w:rPr>
+        <w:t>Primero selecciona la forma en la que desea recibir su atención:</w:t>
+      </w:r>
+    </w:p>
+    <w:p>
+      <w:pPr>
+        <w:spacing w:line="360" w:lineRule="auto"/>
+        <w:rPr>
+          <w:rFonts w:cstheme="minorHAnsi"/>
+          <w:lang w:val="es-CO"/>
+        </w:rPr>
+      </w:pPr>
+      <w:r>
+        <w:rPr>
+          <w:rFonts w:cstheme="minorHAnsi"/>
+          <w:b/>
+          <w:bCs/>
+          <w:lang w:val="es-CO"/>
+        </w:rPr>
+        <w:t>1. Atención presencial</w:t>
+      </w:r>
+    </w:p>
+    <w:p>
+      <w:pPr>
+        <w:spacing w:line="360" w:lineRule="auto"/>
+        <w:rPr>
+          <w:rFonts w:cstheme="minorHAnsi"/>
+          <w:lang w:val="es-CO"/>
+        </w:rPr>
+      </w:pPr>
+      <w:r>
+        <w:rPr>
+          <w:rFonts w:cstheme="minorHAnsi"/>
+          <w:lang w:val="es-CO"/>
+        </w:rPr>
+        <w:t>La plataforma registra sus datos básicos y crea su registro como paciente presencial.</w:t>
+      </w:r>
+    </w:p>
+    <w:p>
+      <w:pPr>
+        <w:spacing w:line="360" w:lineRule="auto"/>
+        <w:rPr>
+          <w:rFonts w:cstheme="minorHAnsi"/>
+          <w:lang w:val="es-CO"/>
+        </w:rPr>
+      </w:pPr>
+      <w:r>
+        <w:rPr>
+          <w:rFonts w:cstheme="minorHAnsi"/>
+          <w:b/>
+          <w:bCs/>
+          <w:lang w:val="es-CO"/>
+        </w:rPr>
+        <w:t>2. Atención virtual</w:t>
+      </w:r>
+    </w:p>
+    <w:p>
+      <w:pPr>
+        <w:spacing w:line="360" w:lineRule="auto"/>
+        <w:rPr>
+          <w:rFonts w:cstheme="minorHAnsi"/>
+          <w:lang w:val="es-CO"/>
+        </w:rPr>
+      </w:pPr>
+      <w:r>
+        <w:rPr>
+          <w:rFonts w:cstheme="minorHAnsi"/>
+          <w:lang w:val="es-CO"/>
+        </w:rPr>
+        <w:t>La plataforma registra sus datos y solicita también su correo electrónico, porque lo necesita para enviar el enlace de la videollamada.</w:t>
+      </w:r>
+    </w:p>
+    <w:p>
+      <w:pPr>
+        <w:spacing w:line="360" w:lineRule="auto"/>
+        <w:rPr>
+          <w:rFonts w:cstheme="minorHAnsi"/>
+          <w:lang w:val="es-CO"/>
+        </w:rPr>
+      </w:pPr>
+      <w:r>
+        <w:rPr>
+          <w:rFonts w:cstheme="minorHAnsi"/>
+          <w:lang w:val="es-CO"/>
+        </w:rPr>
+        <w:t>Así, la persona no tiene que preocuparse por saber qué información debe proporcionar. La plataforma se encarga de solicitar los datos necesarios dependiendo del tipo de atención que haya seleccionado.</w:t>
+      </w:r>
+    </w:p>
+    <w:p>
+      <w:pPr>
+        <w:spacing w:line="360" w:lineRule="auto"/>
+        <w:rPr>
+          <w:rFonts w:cstheme="minorHAnsi"/>
+          <w:b/>
+          <w:bCs/>
+          <w:lang w:val="es-CO"/>
+        </w:rPr>
+      </w:pPr>
+      <w:r>
+        <w:rPr>
+          <w:rFonts w:cstheme="minorHAnsi"/>
+          <w:b/>
+          <w:bCs/>
+          <w:lang w:val="es-CO"/>
+        </w:rPr>
+        <w:t xml:space="preserve">¿Qué beneficio </w:t>
+      </w:r>
+      <w:r>
+        <w:rPr>
+          <w:rFonts w:cstheme="minorHAnsi"/>
+          <w:b/>
+          <w:bCs/>
+          <w:lang w:val="es-CO"/>
+        </w:rPr>
+        <w:t xml:space="preserve">se </w:t>
+      </w:r>
+      <w:r>
+        <w:rPr>
+          <w:rFonts w:cstheme="minorHAnsi"/>
+          <w:b/>
+          <w:bCs/>
+          <w:lang w:val="es-CO"/>
+        </w:rPr>
+        <w:t>obtiene?</w:t>
+      </w:r>
+    </w:p>
+    <w:p>
+      <w:pPr>
+        <w:spacing w:line="360" w:lineRule="auto"/>
+        <w:rPr>
+          <w:rFonts w:cstheme="minorHAnsi"/>
+          <w:lang w:val="es-CO"/>
+        </w:rPr>
+      </w:pPr>
+      <w:r>
+        <w:rPr>
+          <w:rFonts w:cstheme="minorHAnsi"/>
+          <w:lang w:val="es-CO"/>
+        </w:rPr>
+        <w:t>La implementación de Factory Method permite que la plataforma sea más organizada y fácil de ampliar.</w:t>
+      </w:r>
+    </w:p>
+    <w:p>
+      <w:pPr>
+        <w:spacing w:line="360" w:lineRule="auto"/>
+        <w:rPr>
+          <w:rFonts w:cstheme="minorHAnsi"/>
+          <w:lang w:val="es-CO"/>
+        </w:rPr>
+      </w:pPr>
+      <w:r>
+        <w:rPr>
+          <w:rFonts w:cstheme="minorHAnsi"/>
+          <w:lang w:val="es-CO"/>
+        </w:rPr>
+        <w:lastRenderedPageBreak/>
+        <w:t>Por ejemplo, si en el futuro el servicio quiere agregar un nuevo tipo de paciente, no es necesario cambiar todo el funcionamiento que ya existe. Se puede crear una nueva fábrica encargada de ese tipo de paciente.</w:t>
+      </w:r>
+    </w:p>
+    <w:p>
+      <w:pPr>
+        <w:spacing w:line="360" w:lineRule="auto"/>
+        <w:rPr>
+          <w:rFonts w:cstheme="minorHAnsi"/>
+          <w:lang w:val="es-CO"/>
+        </w:rPr>
+      </w:pPr>
+      <w:r>
+        <w:rPr>
+          <w:rFonts w:cstheme="minorHAnsi"/>
+          <w:lang w:val="es-CO"/>
+        </w:rPr>
+        <w:t>Esto permite que nuestra plataforma pueda crecer de acuerdo con las necesidades del servicio de salud.</w:t>
+      </w:r>
+    </w:p>
+    <w:p>
+      <w:pPr>
+        <w:spacing w:line="360" w:lineRule="auto"/>
+        <w:rPr>
+          <w:rFonts w:cstheme="minorHAnsi"/>
+          <w:lang w:val="es-CO"/>
+        </w:rPr>
+      </w:pPr>
+      <w:r>
+        <w:rPr>
+          <w:rFonts w:cstheme="minorHAnsi"/>
+          <w:lang w:val="es-CO"/>
+        </w:rPr>
+        <w:t>Entre los principales beneficios encontramos:</w:t>
+      </w:r>
+    </w:p>
+    <w:p>
+      <w:pPr>
+        <w:spacing w:line="360" w:lineRule="auto"/>
+        <w:rPr>
+          <w:rFonts w:cstheme="minorHAnsi"/>
+          <w:lang w:val="es-CO"/>
+        </w:rPr>
+      </w:pPr>
+      <w:r>
+        <w:rPr>
+          <w:rFonts w:cstheme="minorHAnsi"/>
+          <w:b/>
+          <w:bCs/>
+          <w:lang w:val="es-CO"/>
+        </w:rPr>
+        <w:t>Mayor organización:</w:t>
+      </w:r>
+      <w:r>
+        <w:rPr>
+          <w:rFonts w:cstheme="minorHAnsi"/>
+          <w:lang w:val="es-CO"/>
+        </w:rPr>
+        <w:t xml:space="preserve"> cada tipo de paciente tiene su propia forma de creación.</w:t>
+      </w:r>
+    </w:p>
+    <w:p>
+      <w:pPr>
+        <w:spacing w:line="360" w:lineRule="auto"/>
+        <w:rPr>
+          <w:rFonts w:cstheme="minorHAnsi"/>
+          <w:lang w:val="es-CO"/>
+        </w:rPr>
+      </w:pPr>
+      <w:r>
+        <w:rPr>
+          <w:rFonts w:cstheme="minorHAnsi"/>
+          <w:b/>
+          <w:bCs/>
+          <w:lang w:val="es-CO"/>
+        </w:rPr>
+        <w:t>Menos errores:</w:t>
+      </w:r>
+      <w:r>
+        <w:rPr>
+          <w:rFonts w:cstheme="minorHAnsi"/>
+          <w:lang w:val="es-CO"/>
+        </w:rPr>
+        <w:t xml:space="preserve"> cada tipo de paciente solicita la información que realmente necesita.</w:t>
+      </w:r>
+    </w:p>
+    <w:p>
+      <w:pPr>
+        <w:spacing w:line="360" w:lineRule="auto"/>
+        <w:rPr>
+          <w:rFonts w:cstheme="minorHAnsi"/>
+          <w:lang w:val="es-CO"/>
+        </w:rPr>
+      </w:pPr>
+      <w:r>
+        <w:rPr>
+          <w:rFonts w:cstheme="minorHAnsi"/>
+          <w:b/>
+          <w:bCs/>
+          <w:lang w:val="es-CO"/>
+        </w:rPr>
+        <w:t>Facilidad para ampliar la plataforma:</w:t>
+      </w:r>
+      <w:r>
+        <w:rPr>
+          <w:rFonts w:cstheme="minorHAnsi"/>
+          <w:lang w:val="es-CO"/>
+        </w:rPr>
+        <w:t xml:space="preserve"> se pueden agregar nuevos tipos de pacientes sin modificar todo el sistema.</w:t>
+      </w:r>
+    </w:p>
+    <w:p>
+      <w:pPr>
+        <w:spacing w:line="360" w:lineRule="auto"/>
+        <w:rPr>
+          <w:rFonts w:cstheme="minorHAnsi"/>
+          <w:lang w:val="es-CO"/>
+        </w:rPr>
+      </w:pPr>
+      <w:r>
+        <w:rPr>
+          <w:rFonts w:cstheme="minorHAnsi"/>
+          <w:b/>
+          <w:bCs/>
+          <w:lang w:val="es-CO"/>
+        </w:rPr>
+        <w:t>Mejor experiencia para el usuario:</w:t>
+      </w:r>
+      <w:r>
+        <w:rPr>
+          <w:rFonts w:cstheme="minorHAnsi"/>
+          <w:lang w:val="es-CO"/>
+        </w:rPr>
+        <w:t xml:space="preserve"> el sistema solicita la información dependiendo del servicio que el paciente haya seleccionado.</w:t>
+      </w:r>
+    </w:p>
+    <w:p>
+      <w:pPr>
+        <w:spacing w:line="360" w:lineRule="auto"/>
+        <w:rPr>
+          <w:rFonts w:cstheme="minorHAnsi"/>
+          <w:lang w:val="es-CO"/>
+        </w:rPr>
+      </w:pPr>
+      <w:r>
+        <w:rPr>
+          <w:rFonts w:cstheme="minorHAnsi"/>
+          <w:b/>
+          <w:bCs/>
+          <w:lang w:val="es-CO"/>
+        </w:rPr>
+        <w:t>Facilidad de mantenimiento:</w:t>
+      </w:r>
+      <w:r>
+        <w:rPr>
+          <w:rFonts w:cstheme="minorHAnsi"/>
+          <w:lang w:val="es-CO"/>
+        </w:rPr>
+        <w:t xml:space="preserve"> cada tipo de paciente tiene sus propias reglas y estas no se mezclan con las de los demás.</w:t>
+      </w:r>
+    </w:p>
+    <w:p>
+      <w:pPr>
+        <w:spacing w:line="360" w:lineRule="auto"/>
+        <w:rPr>
+          <w:rFonts w:cstheme="minorHAnsi"/>
+          <w:b/>
+          <w:bCs/>
+          <w:lang w:val="es-CO"/>
+        </w:rPr>
+      </w:pPr>
+      <w:r>
+        <w:rPr>
+          <w:rFonts w:cstheme="minorHAnsi"/>
+          <w:b/>
+          <w:bCs/>
+          <w:lang w:val="es-CO"/>
+        </w:rPr>
+        <w:t>¿Cómo se relaciona esto con nuestra plataforma de telemedicina?</w:t>
+      </w:r>
+    </w:p>
+    <w:p>
+      <w:pPr>
+        <w:spacing w:line="360" w:lineRule="auto"/>
+        <w:rPr>
+          <w:rFonts w:cstheme="minorHAnsi"/>
+          <w:lang w:val="es-CO"/>
+        </w:rPr>
+      </w:pPr>
+      <w:r>
+        <w:rPr>
+          <w:rFonts w:cstheme="minorHAnsi"/>
+          <w:lang w:val="es-CO"/>
+        </w:rPr>
+        <w:t>El patrón Factory Method no es algo que el usuario tenga que conocer para utilizar la plataforma. Es una forma en la que nosotros organizamos internamente el sistema para que funcione correctamente.</w:t>
+      </w:r>
+    </w:p>
+    <w:p>
+      <w:pPr>
+        <w:spacing w:line="360" w:lineRule="auto"/>
+        <w:rPr>
+          <w:rFonts w:cstheme="minorHAnsi"/>
+          <w:lang w:val="es-CO"/>
+        </w:rPr>
+      </w:pPr>
+      <w:r>
+        <w:rPr>
+          <w:rFonts w:cstheme="minorHAnsi"/>
+          <w:lang w:val="es-CO"/>
+        </w:rPr>
+        <w:t>Para el usuario final, el proceso es sencillo:</w:t>
+      </w:r>
+    </w:p>
+    <w:p>
+      <w:pPr>
+        <w:spacing w:line="360" w:lineRule="auto"/>
+        <w:rPr>
+          <w:rFonts w:cstheme="minorHAnsi"/>
+          <w:lang w:val="es-CO"/>
+        </w:rPr>
+      </w:pPr>
+      <w:r>
+        <w:rPr>
+          <w:rFonts w:cstheme="minorHAnsi"/>
+          <w:b/>
+          <w:bCs/>
+          <w:lang w:val="es-CO"/>
+        </w:rPr>
+        <w:t>Selecciona el tipo de atención → la plataforma identifica el tipo de paciente → solicita los datos necesarios → registra al paciente.</w:t>
+      </w:r>
+    </w:p>
+    <w:p>
+      <w:pPr>
+        <w:spacing w:line="360" w:lineRule="auto"/>
+        <w:rPr>
+          <w:rFonts w:cstheme="minorHAnsi"/>
+          <w:lang w:val="es-CO"/>
+        </w:rPr>
+      </w:pPr>
+      <w:r>
+        <w:rPr>
+          <w:rFonts w:cstheme="minorHAnsi"/>
+          <w:lang w:val="es-CO"/>
+        </w:rPr>
+        <w:t>De esta manera, el cliente que adquiera nuestra plataforma puede ofrecer diferentes formas de atención sin tener que preocuparse por el funcionamiento interno del sistema.</w:t>
+      </w:r>
+    </w:p>
+    <w:p>
+      <w:pPr>
+        <w:spacing w:line="360" w:lineRule="auto"/>
+        <w:rPr>
+          <w:rFonts w:cstheme="minorHAnsi"/>
+          <w:b/>
+          <w:bCs/>
+          <w:lang w:val="es-CO"/>
+        </w:rPr>
+      </w:pPr>
+      <w:r>
+        <w:rPr>
+          <w:rFonts w:cstheme="minorHAnsi"/>
+          <w:b/>
+          <w:bCs/>
+          <w:lang w:val="es-CO"/>
+        </w:rPr>
+        <w:t>Ejemplo de crecimiento de la plataforma</w:t>
+      </w:r>
+    </w:p>
+    <w:p>
+      <w:pPr>
+        <w:spacing w:line="360" w:lineRule="auto"/>
+        <w:rPr>
+          <w:rFonts w:cstheme="minorHAnsi"/>
+          <w:lang w:val="es-CO"/>
+        </w:rPr>
+      </w:pPr>
+      <w:r>
+        <w:rPr>
+          <w:rFonts w:cstheme="minorHAnsi"/>
+          <w:lang w:val="es-CO"/>
+        </w:rPr>
+        <w:t>Una de las ventajas de utilizar este patrón es que nuestra plataforma puede seguir creciendo.</w:t>
+      </w:r>
+    </w:p>
+    <w:p>
+      <w:pPr>
+        <w:spacing w:line="360" w:lineRule="auto"/>
+        <w:rPr>
+          <w:rFonts w:cstheme="minorHAnsi"/>
+          <w:lang w:val="es-CO"/>
+        </w:rPr>
+      </w:pPr>
+      <w:r>
+        <w:rPr>
+          <w:rFonts w:cstheme="minorHAnsi"/>
+          <w:lang w:val="es-CO"/>
+        </w:rPr>
+        <w:lastRenderedPageBreak/>
+        <w:t>Actualmente contamos con:</w:t>
+      </w:r>
+    </w:p>
+    <w:p>
+      <w:pPr>
+        <w:spacing w:line="360" w:lineRule="auto"/>
+        <w:rPr>
+          <w:rFonts w:cstheme="minorHAnsi"/>
+          <w:lang w:val="es-CO"/>
+        </w:rPr>
+      </w:pPr>
+      <w:r>
+        <w:rPr>
+          <w:rFonts w:cstheme="minorHAnsi"/>
+          <w:b/>
+          <w:bCs/>
+          <w:lang w:val="es-CO"/>
+        </w:rPr>
+        <w:t>Paciente presencial</w:t>
+      </w:r>
+    </w:p>
+    <w:p>
+      <w:pPr>
+        <w:spacing w:line="360" w:lineRule="auto"/>
+        <w:rPr>
+          <w:rFonts w:cstheme="minorHAnsi"/>
+          <w:lang w:val="es-CO"/>
+        </w:rPr>
+      </w:pPr>
+      <w:r>
+        <w:rPr>
+          <w:rFonts w:cstheme="minorHAnsi"/>
+          <w:b/>
+          <w:bCs/>
+          <w:lang w:val="es-CO"/>
+        </w:rPr>
+        <w:t>Paciente virtual</w:t>
+      </w:r>
+    </w:p>
+    <w:p>
+      <w:pPr>
+        <w:spacing w:line="360" w:lineRule="auto"/>
+        <w:rPr>
+          <w:rFonts w:cstheme="minorHAnsi"/>
+          <w:lang w:val="es-CO"/>
+        </w:rPr>
+      </w:pPr>
+      <w:r>
+        <w:rPr>
+          <w:rFonts w:cstheme="minorHAnsi"/>
+          <w:lang w:val="es-CO"/>
+        </w:rPr>
+        <w:t xml:space="preserve">Pero si posteriormente el servicio necesita agregar, por ejemplo, un </w:t>
+      </w:r>
+      <w:r>
+        <w:rPr>
+          <w:rFonts w:cstheme="minorHAnsi"/>
+          <w:b/>
+          <w:bCs/>
+          <w:lang w:val="es-CO"/>
+        </w:rPr>
+        <w:t>paciente de urgencias</w:t>
+      </w:r>
+      <w:r>
+        <w:rPr>
+          <w:rFonts w:cstheme="minorHAnsi"/>
+          <w:lang w:val="es-CO"/>
+        </w:rPr>
+        <w:t>, se puede crear una nueva fábrica para este tipo de atención con sus propias reglas y datos.</w:t>
+      </w:r>
+    </w:p>
+    <w:p>
+      <w:pPr>
+        <w:spacing w:line="360" w:lineRule="auto"/>
+        <w:rPr>
+          <w:rFonts w:cstheme="minorHAnsi"/>
+          <w:lang w:val="es-CO"/>
+        </w:rPr>
+      </w:pPr>
+      <w:r>
+        <w:rPr>
+          <w:rFonts w:cstheme="minorHAnsi"/>
+          <w:lang w:val="es-CO"/>
+        </w:rPr>
+        <w:t>Así no tenemos que cambiar todo lo que ya funciona, sino que podemos agregar esta nueva opción de manera independiente.</w:t>
+      </w:r>
+    </w:p>
+    <w:p>
+      <w:pPr>
+        <w:spacing w:line="360" w:lineRule="auto"/>
+        <w:rPr>
+          <w:rFonts w:cstheme="minorHAnsi"/>
+          <w:b/>
+          <w:bCs/>
+          <w:lang w:val="es-CO"/>
+        </w:rPr>
+      </w:pPr>
+      <w:r>
+        <w:rPr>
+          <w:rFonts w:cstheme="minorHAnsi"/>
+          <w:b/>
+          <w:bCs/>
+          <w:lang w:val="es-CO"/>
+        </w:rPr>
+        <w:t>En resumen</w:t>
+      </w:r>
+    </w:p>
+    <w:p>
+      <w:pPr>
+        <w:spacing w:line="360" w:lineRule="auto"/>
+        <w:rPr>
+          <w:rFonts w:cstheme="minorHAnsi"/>
+          <w:lang w:val="es-CO"/>
+        </w:rPr>
+      </w:pPr>
+      <w:r>
+        <w:rPr>
+          <w:rFonts w:cstheme="minorHAnsi"/>
+          <w:lang w:val="es-CO"/>
+        </w:rPr>
+        <w:t xml:space="preserve">El </w:t>
+      </w:r>
+      <w:r>
+        <w:rPr>
+          <w:rFonts w:cstheme="minorHAnsi"/>
+          <w:b/>
+          <w:bCs/>
+          <w:lang w:val="es-CO"/>
+        </w:rPr>
+        <w:t>Factory Method</w:t>
+      </w:r>
+      <w:r>
+        <w:rPr>
+          <w:rFonts w:cstheme="minorHAnsi"/>
+          <w:lang w:val="es-CO"/>
+        </w:rPr>
+        <w:t xml:space="preserve"> nos permite crear los diferentes tipos de pacientes de una manera organizada. Cada tipo de paciente tiene sus propias características y necesidades, y la plataforma se encarga de utilizar la forma adecuada para registrarlo.</w:t>
+      </w:r>
+    </w:p>
+    <w:p>
+      <w:pPr>
+        <w:spacing w:line="360" w:lineRule="auto"/>
+        <w:rPr>
+          <w:rFonts w:cstheme="minorHAnsi"/>
+          <w:lang w:val="es-CO"/>
+        </w:rPr>
+      </w:pPr>
+      <w:r>
+        <w:rPr>
+          <w:rFonts w:cstheme="minorHAnsi"/>
+          <w:lang w:val="es-CO"/>
+        </w:rPr>
+        <w:t>Fa</w:t>
+      </w:r>
+      <w:r>
+        <w:rPr>
+          <w:rFonts w:cstheme="minorHAnsi"/>
+          <w:lang w:val="es-CO"/>
+        </w:rPr>
+        <w:t>cilita</w:t>
+      </w:r>
+      <w:r>
+        <w:rPr>
+          <w:rFonts w:cstheme="minorHAnsi"/>
+          <w:lang w:val="es-CO"/>
+        </w:rPr>
+        <w:t>ndo</w:t>
+      </w:r>
+      <w:r>
+        <w:rPr>
+          <w:rFonts w:cstheme="minorHAnsi"/>
+          <w:lang w:val="es-CO"/>
+        </w:rPr>
+        <w:t xml:space="preserve"> el mantenimiento y crecimiento del sistema. Para el cliente, significa tener una plataforma más organizada, flexible y preparada para agregar nuevos servicios en el futuro.</w:t>
+      </w:r>
+    </w:p>
+    <w:p>
+      <w:pPr>
+        <w:spacing w:line="360" w:lineRule="auto"/>
+        <w:rPr>
+          <w:rFonts w:cstheme="minorHAnsi"/>
+          <w:lang w:val="es-CO"/>
+        </w:rPr>
+      </w:pPr>
+      <w:r>
+        <w:rPr>
+          <w:rFonts w:cstheme="minorHAnsi"/>
+          <w:lang w:val="es-CO"/>
+        </w:rPr>
+        <w:t>Lo más importante es que el usuario final no necesita conocer cómo está programada la plataforma. Simplemente selecciona el tipo de atención que necesita y el sistema se encarga de realizar el proceso correspondiente.</w:t>
+      </w:r>
+    </w:p>
+    <w:p>
+      <w:pPr>
+        <w:spacing w:line="360" w:lineRule="auto"/>
+        <w:rPr>
+          <w:rFonts w:cstheme="minorHAnsi"/>
+          <w:lang w:val="es-CO"/>
+        </w:rPr>
       </w:pPr>
     </w:p>
     <w:sectPr>
@@ -2687,9 +4336,9 @@
 <file path=word/numbering.xml><?xml version="1.0" encoding="utf-8"?>
 <w:numbering xmlns:wpc="http://schemas.microsoft.com/office/word/2010/wordprocessingCanvas" xmlns:cx="http://schemas.microsoft.com/office/drawing/2014/chartex" xmlns:cx1="http://schemas.microsoft.com/office/drawing/2015/9/8/chartex" xmlns:cx2="http://schemas.microsoft.com/office/drawing/2015/10/21/chartex" xmlns:cx3="http://schemas.microsoft.com/office/drawing/2016/5/9/chartex" xmlns:cx4="http://schemas.microsoft.com/office/drawing/2016/5/10/chartex" xmlns:cx5="http://schemas.microsoft.com/office/drawing/2016/5/11/chartex" xmlns:cx6="http://schemas.microsoft.com/office/drawing/2016/5/12/chartex" xmlns:cx7="http://schemas.microsoft.com/office/drawing/2016/5/13/chartex" xmlns:cx8="http://schemas.microsoft.com/office/drawing/2016/5/14/chartex" xmlns:mc="http://schemas.openxmlformats.org/markup-compatibility/2006" xmlns:aink="http://schemas.microsoft.com/office/drawing/2016/ink" xmlns:am3d="http://schemas.microsoft.com/office/drawing/2017/model3d" xmlns:o="urn:schemas-microsoft-com:office:office" xmlns:oel="http://schemas.microsoft.com/office/2019/extlst" xmlns:r="http://schemas.openxmlformats.org/officeDocument/2006/relationships" xmlns:m="http://schemas.openxmlformats.org/officeDocument/2006/math" xmlns:v="urn:schemas-microsoft-com:vml" xmlns:wp14="http://schemas.microsoft.com/office/word/2010/wordprocessingDrawing" xmlns:wp="http://schemas.openxmlformats.org/drawingml/2006/wordprocessingDrawing" xmlns:w10="urn:schemas-microsoft-com:office:word" xmlns:w="http://schemas.openxmlformats.org/wordprocessingml/2006/main" xmlns:w14="http://schemas.microsoft.com/office/word/2010/wordml" xmlns:w15="http://schemas.microsoft.com/office/word/2012/wordml" xmlns:w16cex="http://schemas.microsoft.com/office/word/2018/wordml/cex" xmlns:w16cid="http://schemas.microsoft.com/office/word/2016/wordml/cid" xmlns:w16="http://schemas.microsoft.com/office/word/2018/wordml" xmlns:w16du="http://schemas.microsoft.com/office/word/2023/wordml/word16du" xmlns:w16sdtdh="http://schemas.microsoft.com/office/word/2020/wordml/sdtdatahash" xmlns:w16sdtfl="http://schemas.microsoft.com/office/word/2024/wordml/sdtformatlock" xmlns:w16se="http://schemas.microsoft.com/office/word/2015/wordml/symex" xmlns:wpg="http://schemas.microsoft.com/office/word/2010/wordprocessingGroup" xmlns:wpi="http://schemas.microsoft.com/office/word/2010/wordprocessingInk" xmlns:wne="http://schemas.microsoft.com/office/word/2006/wordml" xmlns:wps="http://schemas.microsoft.com/office/word/2010/wordprocessingShape" mc:Ignorable="w14 w15 w16se w16cid w16 w16cex w16sdtdh w16sdtfl w16du wp14">
   <w:abstractNum w:abstractNumId="0" w15:restartNumberingAfterBreak="0">
-    <w:nsid w:val="177C3157"/>
+    <w:nsid w:val="0AB6294D"/>
     <w:multiLevelType w:val="multilevel"/>
-    <w:tmpl w:val="0AEE9D9A"/>
+    <w:tmpl w:val="307A05FA"/>
     <w:lvl w:ilvl="0">
       <w:start w:val="1"/>
       <w:numFmt w:val="bullet"/>
@@ -2836,9 +4485,9 @@
     </w:lvl>
   </w:abstractNum>
   <w:abstractNum w:abstractNumId="1" w15:restartNumberingAfterBreak="0">
-    <w:nsid w:val="1A4D2E31"/>
+    <w:nsid w:val="15D947B5"/>
     <w:multiLevelType w:val="multilevel"/>
-    <w:tmpl w:val="884AF89E"/>
+    <w:tmpl w:val="518E18C2"/>
     <w:lvl w:ilvl="0">
       <w:start w:val="1"/>
       <w:numFmt w:val="bullet"/>
@@ -2985,6 +4634,304 @@
     </w:lvl>
   </w:abstractNum>
   <w:abstractNum w:abstractNumId="2" w15:restartNumberingAfterBreak="0">
+    <w:nsid w:val="177C3157"/>
+    <w:multiLevelType w:val="multilevel"/>
+    <w:tmpl w:val="0AEE9D9A"/>
+    <w:lvl w:ilvl="0">
+      <w:start w:val="1"/>
+      <w:numFmt w:val="bullet"/>
+      <w:lvlText w:val=""/>
+      <w:lvlJc w:val="left"/>
+      <w:pPr>
+        <w:tabs>
+          <w:tab w:val="num" w:pos="720"/>
+        </w:tabs>
+        <w:ind w:left="720" w:hanging="360"/>
+      </w:pPr>
+      <w:rPr>
+        <w:rFonts w:ascii="Symbol" w:hAnsi="Symbol" w:hint="default"/>
+        <w:sz w:val="20"/>
+      </w:rPr>
+    </w:lvl>
+    <w:lvl w:ilvl="1" w:tentative="1">
+      <w:start w:val="1"/>
+      <w:numFmt w:val="bullet"/>
+      <w:lvlText w:val="o"/>
+      <w:lvlJc w:val="left"/>
+      <w:pPr>
+        <w:tabs>
+          <w:tab w:val="num" w:pos="1440"/>
+        </w:tabs>
+        <w:ind w:left="1440" w:hanging="360"/>
+      </w:pPr>
+      <w:rPr>
+        <w:rFonts w:ascii="Courier New" w:hAnsi="Courier New" w:hint="default"/>
+        <w:sz w:val="20"/>
+      </w:rPr>
+    </w:lvl>
+    <w:lvl w:ilvl="2" w:tentative="1">
+      <w:start w:val="1"/>
+      <w:numFmt w:val="bullet"/>
+      <w:lvlText w:val=""/>
+      <w:lvlJc w:val="left"/>
+      <w:pPr>
+        <w:tabs>
+          <w:tab w:val="num" w:pos="2160"/>
+        </w:tabs>
+        <w:ind w:left="2160" w:hanging="360"/>
+      </w:pPr>
+      <w:rPr>
+        <w:rFonts w:ascii="Wingdings" w:hAnsi="Wingdings" w:hint="default"/>
+        <w:sz w:val="20"/>
+      </w:rPr>
+    </w:lvl>
+    <w:lvl w:ilvl="3" w:tentative="1">
+      <w:start w:val="1"/>
+      <w:numFmt w:val="bullet"/>
+      <w:lvlText w:val=""/>
+      <w:lvlJc w:val="left"/>
+      <w:pPr>
+        <w:tabs>
+          <w:tab w:val="num" w:pos="2880"/>
+        </w:tabs>
+        <w:ind w:left="2880" w:hanging="360"/>
+      </w:pPr>
+      <w:rPr>
+        <w:rFonts w:ascii="Wingdings" w:hAnsi="Wingdings" w:hint="default"/>
+        <w:sz w:val="20"/>
+      </w:rPr>
+    </w:lvl>
+    <w:lvl w:ilvl="4" w:tentative="1">
+      <w:start w:val="1"/>
+      <w:numFmt w:val="bullet"/>
+      <w:lvlText w:val=""/>
+      <w:lvlJc w:val="left"/>
+      <w:pPr>
+        <w:tabs>
+          <w:tab w:val="num" w:pos="3600"/>
+        </w:tabs>
+        <w:ind w:left="3600" w:hanging="360"/>
+      </w:pPr>
+      <w:rPr>
+        <w:rFonts w:ascii="Wingdings" w:hAnsi="Wingdings" w:hint="default"/>
+        <w:sz w:val="20"/>
+      </w:rPr>
+    </w:lvl>
+    <w:lvl w:ilvl="5" w:tentative="1">
+      <w:start w:val="1"/>
+      <w:numFmt w:val="bullet"/>
+      <w:lvlText w:val=""/>
+      <w:lvlJc w:val="left"/>
+      <w:pPr>
+        <w:tabs>
+          <w:tab w:val="num" w:pos="4320"/>
+        </w:tabs>
+        <w:ind w:left="4320" w:hanging="360"/>
+      </w:pPr>
+      <w:rPr>
+        <w:rFonts w:ascii="Wingdings" w:hAnsi="Wingdings" w:hint="default"/>
+        <w:sz w:val="20"/>
+      </w:rPr>
+    </w:lvl>
+    <w:lvl w:ilvl="6" w:tentative="1">
+      <w:start w:val="1"/>
+      <w:numFmt w:val="bullet"/>
+      <w:lvlText w:val=""/>
+      <w:lvlJc w:val="left"/>
+      <w:pPr>
+        <w:tabs>
+          <w:tab w:val="num" w:pos="5040"/>
+        </w:tabs>
+        <w:ind w:left="5040" w:hanging="360"/>
+      </w:pPr>
+      <w:rPr>
+        <w:rFonts w:ascii="Wingdings" w:hAnsi="Wingdings" w:hint="default"/>
+        <w:sz w:val="20"/>
+      </w:rPr>
+    </w:lvl>
+    <w:lvl w:ilvl="7" w:tentative="1">
+      <w:start w:val="1"/>
+      <w:numFmt w:val="bullet"/>
+      <w:lvlText w:val=""/>
+      <w:lvlJc w:val="left"/>
+      <w:pPr>
+        <w:tabs>
+          <w:tab w:val="num" w:pos="5760"/>
+        </w:tabs>
+        <w:ind w:left="5760" w:hanging="360"/>
+      </w:pPr>
+      <w:rPr>
+        <w:rFonts w:ascii="Wingdings" w:hAnsi="Wingdings" w:hint="default"/>
+        <w:sz w:val="20"/>
+      </w:rPr>
+    </w:lvl>
+    <w:lvl w:ilvl="8" w:tentative="1">
+      <w:start w:val="1"/>
+      <w:numFmt w:val="bullet"/>
+      <w:lvlText w:val=""/>
+      <w:lvlJc w:val="left"/>
+      <w:pPr>
+        <w:tabs>
+          <w:tab w:val="num" w:pos="6480"/>
+        </w:tabs>
+        <w:ind w:left="6480" w:hanging="360"/>
+      </w:pPr>
+      <w:rPr>
+        <w:rFonts w:ascii="Wingdings" w:hAnsi="Wingdings" w:hint="default"/>
+        <w:sz w:val="20"/>
+      </w:rPr>
+    </w:lvl>
+  </w:abstractNum>
+  <w:abstractNum w:abstractNumId="3" w15:restartNumberingAfterBreak="0">
+    <w:nsid w:val="1A4D2E31"/>
+    <w:multiLevelType w:val="multilevel"/>
+    <w:tmpl w:val="884AF89E"/>
+    <w:lvl w:ilvl="0">
+      <w:start w:val="1"/>
+      <w:numFmt w:val="bullet"/>
+      <w:lvlText w:val=""/>
+      <w:lvlJc w:val="left"/>
+      <w:pPr>
+        <w:tabs>
+          <w:tab w:val="num" w:pos="720"/>
+        </w:tabs>
+        <w:ind w:left="720" w:hanging="360"/>
+      </w:pPr>
+      <w:rPr>
+        <w:rFonts w:ascii="Symbol" w:hAnsi="Symbol" w:hint="default"/>
+        <w:sz w:val="20"/>
+      </w:rPr>
+    </w:lvl>
+    <w:lvl w:ilvl="1" w:tentative="1">
+      <w:start w:val="1"/>
+      <w:numFmt w:val="bullet"/>
+      <w:lvlText w:val="o"/>
+      <w:lvlJc w:val="left"/>
+      <w:pPr>
+        <w:tabs>
+          <w:tab w:val="num" w:pos="1440"/>
+        </w:tabs>
+        <w:ind w:left="1440" w:hanging="360"/>
+      </w:pPr>
+      <w:rPr>
+        <w:rFonts w:ascii="Courier New" w:hAnsi="Courier New" w:hint="default"/>
+        <w:sz w:val="20"/>
+      </w:rPr>
+    </w:lvl>
+    <w:lvl w:ilvl="2" w:tentative="1">
+      <w:start w:val="1"/>
+      <w:numFmt w:val="bullet"/>
+      <w:lvlText w:val=""/>
+      <w:lvlJc w:val="left"/>
+      <w:pPr>
+        <w:tabs>
+          <w:tab w:val="num" w:pos="2160"/>
+        </w:tabs>
+        <w:ind w:left="2160" w:hanging="360"/>
+      </w:pPr>
+      <w:rPr>
+        <w:rFonts w:ascii="Wingdings" w:hAnsi="Wingdings" w:hint="default"/>
+        <w:sz w:val="20"/>
+      </w:rPr>
+    </w:lvl>
+    <w:lvl w:ilvl="3" w:tentative="1">
+      <w:start w:val="1"/>
+      <w:numFmt w:val="bullet"/>
+      <w:lvlText w:val=""/>
+      <w:lvlJc w:val="left"/>
+      <w:pPr>
+        <w:tabs>
+          <w:tab w:val="num" w:pos="2880"/>
+        </w:tabs>
+        <w:ind w:left="2880" w:hanging="360"/>
+      </w:pPr>
+      <w:rPr>
+        <w:rFonts w:ascii="Wingdings" w:hAnsi="Wingdings" w:hint="default"/>
+        <w:sz w:val="20"/>
+      </w:rPr>
+    </w:lvl>
+    <w:lvl w:ilvl="4" w:tentative="1">
+      <w:start w:val="1"/>
+      <w:numFmt w:val="bullet"/>
+      <w:lvlText w:val=""/>
+      <w:lvlJc w:val="left"/>
+      <w:pPr>
+        <w:tabs>
+          <w:tab w:val="num" w:pos="3600"/>
+        </w:tabs>
+        <w:ind w:left="3600" w:hanging="360"/>
+      </w:pPr>
+      <w:rPr>
+        <w:rFonts w:ascii="Wingdings" w:hAnsi="Wingdings" w:hint="default"/>
+        <w:sz w:val="20"/>
+      </w:rPr>
+    </w:lvl>
+    <w:lvl w:ilvl="5" w:tentative="1">
+      <w:start w:val="1"/>
+      <w:numFmt w:val="bullet"/>
+      <w:lvlText w:val=""/>
+      <w:lvlJc w:val="left"/>
+      <w:pPr>
+        <w:tabs>
+          <w:tab w:val="num" w:pos="4320"/>
+        </w:tabs>
+        <w:ind w:left="4320" w:hanging="360"/>
+      </w:pPr>
+      <w:rPr>
+        <w:rFonts w:ascii="Wingdings" w:hAnsi="Wingdings" w:hint="default"/>
+        <w:sz w:val="20"/>
+      </w:rPr>
+    </w:lvl>
+    <w:lvl w:ilvl="6" w:tentative="1">
+      <w:start w:val="1"/>
+      <w:numFmt w:val="bullet"/>
+      <w:lvlText w:val=""/>
+      <w:lvlJc w:val="left"/>
+      <w:pPr>
+        <w:tabs>
+          <w:tab w:val="num" w:pos="5040"/>
+        </w:tabs>
+        <w:ind w:left="5040" w:hanging="360"/>
+      </w:pPr>
+      <w:rPr>
+        <w:rFonts w:ascii="Wingdings" w:hAnsi="Wingdings" w:hint="default"/>
+        <w:sz w:val="20"/>
+      </w:rPr>
+    </w:lvl>
+    <w:lvl w:ilvl="7" w:tentative="1">
+      <w:start w:val="1"/>
+      <w:numFmt w:val="bullet"/>
+      <w:lvlText w:val=""/>
+      <w:lvlJc w:val="left"/>
+      <w:pPr>
+        <w:tabs>
+          <w:tab w:val="num" w:pos="5760"/>
+        </w:tabs>
+        <w:ind w:left="5760" w:hanging="360"/>
+      </w:pPr>
+      <w:rPr>
+        <w:rFonts w:ascii="Wingdings" w:hAnsi="Wingdings" w:hint="default"/>
+        <w:sz w:val="20"/>
+      </w:rPr>
+    </w:lvl>
+    <w:lvl w:ilvl="8" w:tentative="1">
+      <w:start w:val="1"/>
+      <w:numFmt w:val="bullet"/>
+      <w:lvlText w:val=""/>
+      <w:lvlJc w:val="left"/>
+      <w:pPr>
+        <w:tabs>
+          <w:tab w:val="num" w:pos="6480"/>
+        </w:tabs>
+        <w:ind w:left="6480" w:hanging="360"/>
+      </w:pPr>
+      <w:rPr>
+        <w:rFonts w:ascii="Wingdings" w:hAnsi="Wingdings" w:hint="default"/>
+        <w:sz w:val="20"/>
+      </w:rPr>
+    </w:lvl>
+  </w:abstractNum>
+  <w:abstractNum w:abstractNumId="4" w15:restartNumberingAfterBreak="0">
     <w:nsid w:val="48F6462E"/>
     <w:multiLevelType w:val="multilevel"/>
     <w:tmpl w:val="06203FAA"/>
@@ -3097,7 +5044,7 @@
       </w:pPr>
     </w:lvl>
   </w:abstractNum>
-  <w:abstractNum w:abstractNumId="3" w15:restartNumberingAfterBreak="0">
+  <w:abstractNum w:abstractNumId="5" w15:restartNumberingAfterBreak="0">
     <w:nsid w:val="4B233A4B"/>
     <w:multiLevelType w:val="multilevel"/>
     <w:tmpl w:val="079A0C28"/>
@@ -3237,7 +5184,7 @@
       </w:rPr>
     </w:lvl>
   </w:abstractNum>
-  <w:abstractNum w:abstractNumId="4" w15:restartNumberingAfterBreak="0">
+  <w:abstractNum w:abstractNumId="6" w15:restartNumberingAfterBreak="0">
     <w:nsid w:val="62965DD8"/>
     <w:multiLevelType w:val="multilevel"/>
     <w:tmpl w:val="F6409C02"/>
@@ -3360,24 +5307,30 @@
     </w:lvl>
   </w:abstractNum>
   <w:num w:numId="1" w16cid:durableId="1447962939">
+    <w:abstractNumId w:val="5"/>
+  </w:num>
+  <w:num w:numId="2" w16cid:durableId="157422322">
+    <w:abstractNumId w:val="4"/>
+  </w:num>
+  <w:num w:numId="3" w16cid:durableId="575821438">
+    <w:abstractNumId w:val="6"/>
+  </w:num>
+  <w:num w:numId="4" w16cid:durableId="1167935576">
+    <w:abstractNumId w:val="2"/>
+  </w:num>
+  <w:num w:numId="5" w16cid:durableId="645745003">
     <w:abstractNumId w:val="3"/>
   </w:num>
-  <w:num w:numId="2" w16cid:durableId="157422322">
+  <w:num w:numId="6" w16cid:durableId="1284338248">
     <w:abstractNumId w:val="2"/>
   </w:num>
-  <w:num w:numId="3" w16cid:durableId="575821438">
-    <w:abstractNumId w:val="4"/>
+  <w:num w:numId="7" w16cid:durableId="687414473">
+    <w:abstractNumId w:val="3"/>
   </w:num>
-  <w:num w:numId="4" w16cid:durableId="1167935576">
+  <w:num w:numId="8" w16cid:durableId="1256405286">
     <w:abstractNumId w:val="0"/>
   </w:num>
-  <w:num w:numId="5" w16cid:durableId="645745003">
-    <w:abstractNumId w:val="1"/>
-  </w:num>
-  <w:num w:numId="6" w16cid:durableId="1284338248">
-    <w:abstractNumId w:val="0"/>
-  </w:num>
-  <w:num w:numId="7" w16cid:durableId="687414473">
+  <w:num w:numId="9" w16cid:durableId="481313884">
     <w:abstractNumId w:val="1"/>
   </w:num>
 </w:numbering>
@@ -3785,7 +5738,7 @@
       <w:spacing w:after="160" w:line="278" w:lineRule="auto"/>
     </w:pPr>
   </w:style>
-  <w:style w:type="paragraph" w:styleId="Heading1">
+  <w:style w:type="paragraph" w:styleId="Ttulo1">
     <w:name w:val="heading 1"/>
     <w:basedOn w:val="Normal"/>
     <w:next w:val="Normal"/>
@@ -3805,7 +5758,7 @@
       <w:szCs w:val="40"/>
     </w:rPr>
   </w:style>
-  <w:style w:type="paragraph" w:styleId="Heading2">
+  <w:style w:type="paragraph" w:styleId="Ttulo2">
     <w:name w:val="heading 2"/>
     <w:basedOn w:val="Normal"/>
     <w:next w:val="Normal"/>
@@ -3826,7 +5779,7 @@
       <w:szCs w:val="32"/>
     </w:rPr>
   </w:style>
-  <w:style w:type="paragraph" w:styleId="Heading3">
+  <w:style w:type="paragraph" w:styleId="Ttulo3">
     <w:name w:val="heading 3"/>
     <w:basedOn w:val="Normal"/>
     <w:next w:val="Normal"/>
@@ -3847,11 +5800,11 @@
       <w:szCs w:val="28"/>
     </w:rPr>
   </w:style>
-  <w:style w:type="paragraph" w:styleId="Heading5">
+  <w:style w:type="paragraph" w:styleId="Ttulo5">
     <w:name w:val="heading 5"/>
     <w:basedOn w:val="Normal"/>
     <w:next w:val="Normal"/>
-    <w:link w:val="Heading5Char"/>
+    <w:link w:val="Ttulo5Car"/>
     <w:uiPriority w:val="9"/>
     <w:unhideWhenUsed/>
     <w:qFormat/>
@@ -3867,13 +5820,12 @@
       <w:color w:val="0F4761" w:themeColor="accent1" w:themeShade="BF"/>
     </w:rPr>
   </w:style>
-  <w:style w:type="character" w:default="1" w:styleId="DefaultParagraphFont">
+  <w:style w:type="character" w:default="1" w:styleId="Fuentedeprrafopredeter">
     <w:name w:val="Default Paragraph Font"/>
     <w:uiPriority w:val="1"/>
-    <w:semiHidden/>
     <w:unhideWhenUsed/>
   </w:style>
-  <w:style w:type="table" w:default="1" w:styleId="TableNormal">
+  <w:style w:type="table" w:default="1" w:styleId="Tablanormal">
     <w:name w:val="Normal Table"/>
     <w:uiPriority w:val="99"/>
     <w:semiHidden/>
@@ -3888,7 +5840,7 @@
       </w:tblCellMar>
     </w:tblPr>
   </w:style>
-  <w:style w:type="numbering" w:default="1" w:styleId="NoList">
+  <w:style w:type="numbering" w:default="1" w:styleId="Sinlista">
     <w:name w:val="No List"/>
     <w:uiPriority w:val="99"/>
     <w:semiHidden/>
@@ -3896,7 +5848,7 @@
   </w:style>
   <w:style w:type="character" w:customStyle="1" w:styleId="Heading4Char">
     <w:name w:val="Heading 4 Char"/>
-    <w:basedOn w:val="DefaultParagraphFont"/>
+    <w:basedOn w:val="Fuentedeprrafopredeter"/>
     <w:uiPriority w:val="9"/>
     <w:qFormat/>
     <w:rsid w:val="0FCE5E06"/>
@@ -3907,10 +5859,10 @@
       <w:color w:val="0F4761" w:themeColor="accent1" w:themeShade="BF"/>
     </w:rPr>
   </w:style>
-  <w:style w:type="character" w:customStyle="1" w:styleId="Heading5Char">
-    <w:name w:val="Heading 5 Char"/>
-    <w:basedOn w:val="DefaultParagraphFont"/>
-    <w:link w:val="Heading5"/>
+  <w:style w:type="character" w:customStyle="1" w:styleId="Ttulo5Car">
+    <w:name w:val="Título 5 Car"/>
+    <w:basedOn w:val="Fuentedeprrafopredeter"/>
+    <w:link w:val="Ttulo5"/>
     <w:uiPriority w:val="9"/>
     <w:qFormat/>
     <w:rsid w:val="0FCE5E06"/>
@@ -3919,9 +5871,9 @@
       <w:color w:val="0F4761" w:themeColor="accent1" w:themeShade="BF"/>
     </w:rPr>
   </w:style>
-  <w:style w:type="character" w:styleId="Hyperlink">
+  <w:style w:type="character" w:styleId="Hipervnculo">
     <w:name w:val="Hyperlink"/>
-    <w:basedOn w:val="DefaultParagraphFont"/>
+    <w:basedOn w:val="Fuentedeprrafopredeter"/>
     <w:uiPriority w:val="99"/>
     <w:unhideWhenUsed/>
     <w:rsid w:val="53EA69C0"/>
@@ -3934,10 +5886,10 @@
     <w:name w:val="Enlace del índice"/>
     <w:qFormat/>
   </w:style>
-  <w:style w:type="paragraph" w:customStyle="1" w:styleId="Ttulo">
-    <w:name w:val="Título"/>
+  <w:style w:type="paragraph" w:customStyle="1" w:styleId="Ttulo10">
+    <w:name w:val="Título1"/>
     <w:basedOn w:val="Normal"/>
-    <w:next w:val="BodyText"/>
+    <w:next w:val="Textoindependiente"/>
     <w:qFormat/>
     <w:pPr>
       <w:keepNext/>
@@ -3949,21 +5901,21 @@
       <w:szCs w:val="28"/>
     </w:rPr>
   </w:style>
-  <w:style w:type="paragraph" w:styleId="BodyText">
+  <w:style w:type="paragraph" w:styleId="Textoindependiente">
     <w:name w:val="Body Text"/>
     <w:basedOn w:val="Normal"/>
     <w:pPr>
       <w:spacing w:after="140" w:line="276" w:lineRule="auto"/>
     </w:pPr>
   </w:style>
-  <w:style w:type="paragraph" w:styleId="List">
+  <w:style w:type="paragraph" w:styleId="Lista">
     <w:name w:val="List"/>
-    <w:basedOn w:val="BodyText"/>
+    <w:basedOn w:val="Textoindependiente"/>
     <w:rPr>
       <w:rFonts w:cs="Lucida Sans"/>
     </w:rPr>
   </w:style>
-  <w:style w:type="paragraph" w:styleId="Caption">
+  <w:style w:type="paragraph" w:styleId="Descripcin">
     <w:name w:val="caption"/>
     <w:basedOn w:val="Normal"/>
     <w:qFormat/>
@@ -3988,7 +5940,7 @@
       <w:rFonts w:cs="Lucida Sans"/>
     </w:rPr>
   </w:style>
-  <w:style w:type="paragraph" w:styleId="ListParagraph">
+  <w:style w:type="paragraph" w:styleId="Prrafodelista">
     <w:name w:val="List Paragraph"/>
     <w:basedOn w:val="Normal"/>
     <w:uiPriority w:val="34"/>
@@ -3999,7 +5951,7 @@
       <w:contextualSpacing/>
     </w:pPr>
   </w:style>
-  <w:style w:type="paragraph" w:styleId="Title">
+  <w:style w:type="paragraph" w:styleId="Ttulo">
     <w:name w:val="Title"/>
     <w:basedOn w:val="Normal"/>
     <w:next w:val="Normal"/>
@@ -4016,7 +5968,7 @@
       <w:szCs w:val="56"/>
     </w:rPr>
   </w:style>
-  <w:style w:type="paragraph" w:styleId="TOC3">
+  <w:style w:type="paragraph" w:styleId="TDC3">
     <w:name w:val="toc 3"/>
     <w:basedOn w:val="Normal"/>
     <w:next w:val="Normal"/>
@@ -4028,7 +5980,7 @@
       <w:ind w:left="440"/>
     </w:pPr>
   </w:style>
-  <w:style w:type="paragraph" w:styleId="TOC5">
+  <w:style w:type="paragraph" w:styleId="TDC5">
     <w:name w:val="toc 5"/>
     <w:basedOn w:val="Normal"/>
     <w:next w:val="Normal"/>
@@ -4047,9 +5999,9 @@
     <w:unhideWhenUsed/>
     <w:qFormat/>
   </w:style>
-  <w:style w:type="paragraph" w:styleId="TOCHeading">
+  <w:style w:type="paragraph" w:styleId="TtuloTDC">
     <w:name w:val="TOC Heading"/>
-    <w:basedOn w:val="Heading1"/>
+    <w:basedOn w:val="Ttulo1"/>
     <w:next w:val="Normal"/>
     <w:uiPriority w:val="39"/>
     <w:unhideWhenUsed/>

</xml_diff>